<commit_message>
feat: Zwei-Personen Namen in Angebot-PDF und E-Mail
Bei "2 Personen mit Pflegegrad" werden nun beide Namen verwendet:

- Angebot-PDF (BU/Angebot-10.docx): Anschrift-Block ueber {KundenAnschrift}
  und Anrede ueber {GreetingLine}; Einzelperson bleibt unveraendert.
- Zusammenfassung: editierbare Felder fuer Anschrift + Begruessung,
  automatisch befuellt, ueberschreibbar; fliessen in payload.Kundendaten.
- E-Mail-Begruessung (EmailManager) nennt beide Personen.

Co-Authored-By: Claude Opus 4.8 <noreply@anthropic.com>
</commit_message>
<xml_diff>
--- a/src/templates/Angebot-10.docx
+++ b/src/templates/Angebot-10.docx
@@ -3,7 +3,7 @@
 <w:document xmlns:o="urn:schemas-microsoft-com:office:office" xmlns:r="http://schemas.openxmlformats.org/officeDocument/2006/relationships" xmlns:v="urn:schemas-microsoft-com:vml" xmlns:w="http://schemas.openxmlformats.org/wordprocessingml/2006/main" xmlns:w10="urn:schemas-microsoft-com:office:word" xmlns:wp="http://schemas.openxmlformats.org/drawingml/2006/wordprocessingDrawing" xmlns:pic="http://schemas.openxmlformats.org/drawingml/2006/picture" xmlns:wps="http://schemas.microsoft.com/office/word/2010/wordprocessingShape" xmlns:wpg="http://schemas.microsoft.com/office/word/2010/wordprocessingGroup" xmlns:mc="http://schemas.openxmlformats.org/markup-compatibility/2006" xmlns:wp14="http://schemas.microsoft.com/office/word/2010/wordprocessingDrawing" xmlns:w14="http://schemas.microsoft.com/office/word/2010/wordml" xmlns:w15="http://schemas.microsoft.com/office/word/2012/wordml" mc:Ignorable="w14 wp14 w15">
   <w:background w:color="FFFFFF"/>
   <w:body>
-    <w:p xmlns:wp14="http://schemas.microsoft.com/office/word/2010/wordml" wp14:textId="77777777">
+    <w:p>
       <w:pPr>
         <w:pStyle w:val="Normal"/>
         <w:spacing w:before="171" w:after="0"/>
@@ -20,27 +20,27 @@
       </w:r>
       <w:r>
         <w:rPr>
+          <w:rFonts w:eastAsia="Open Sans" w:cs="Open Sans" w:ascii="Open Sans" w:hAnsi="Open Sans"/>
+          <w:color w:val="070707"/>
+          <w:sz w:val="17"/>
+          <w:szCs w:val="17"/>
+        </w:rPr>
+        <w:t>EmC2 Attila Landgrafe, Waldstraße 5, 95032 Hof</w:t>
+      </w:r>
+    </w:p>
+    <w:p>
+      <w:pPr>
+        <w:pStyle w:val="normal1"/>
+        <w:rPr>
           <w:rFonts w:ascii="Open Sans" w:hAnsi="Open Sans" w:eastAsia="Open Sans" w:cs="Open Sans"/>
           <w:color w:val="070707"/>
           <w:sz w:val="17"/>
           <w:szCs w:val="17"/>
         </w:rPr>
-        <w:t>EmC2 Attila Landgrafe, Waldstraße 5, 95032 Hof</w:t>
-      </w:r>
-    </w:p>
-    <w:p xmlns:wp14="http://schemas.microsoft.com/office/word/2010/wordml" wp14:textId="77777777">
-      <w:pPr>
-        <w:pStyle w:val="normal1"/>
-        <w:rPr>
-          <w:rFonts w:ascii="Open Sans" w:hAnsi="Open Sans" w:eastAsia="Open Sans" w:cs="Open Sans"/>
-          <w:color w:val="070707"/>
-          <w:sz w:val="17"/>
-          <w:szCs w:val="17"/>
-        </w:rPr>
       </w:pPr>
       <w:r>
         <w:rPr>
-          <w:rFonts w:ascii="Open Sans" w:hAnsi="Open Sans" w:eastAsia="Open Sans" w:cs="Open Sans"/>
+          <w:rFonts w:eastAsia="Open Sans" w:cs="Open Sans" w:ascii="Open Sans" w:hAnsi="Open Sans"/>
           <w:color w:val="070707"/>
           <w:sz w:val="17"/>
           <w:szCs w:val="17"/>
@@ -60,100 +60,73 @@
           <w:bottom w:w="0" w:type="dxa"/>
           <w:right w:w="10" w:type="dxa"/>
         </w:tblCellMar>
-        <w:tblLook w:val="04a0" w:firstRow="1" w:lastRow="0" w:firstColumn="1" w:lastColumn="0" w:noHBand="0" w:noVBand="1"/>
+        <w:tblLook w:val="04a0" w:noVBand="1" w:noHBand="0" w:lastColumn="0" w:firstColumn="1" w:lastRow="0" w:firstRow="1"/>
       </w:tblPr>
       <w:tblGrid>
-        <w:gridCol w:w="4807"/>
+        <w:gridCol w:w="4806"/>
         <w:gridCol w:w="2268"/>
-        <w:gridCol w:w="2960"/>
+        <w:gridCol w:w="2961"/>
       </w:tblGrid>
-      <w:tr xmlns:wp14="http://schemas.microsoft.com/office/word/2010/wordml" wp14:textId="77777777">
+      <w:tr>
         <w:trPr>
           <w:trHeight w:val="1380" w:hRule="atLeast"/>
         </w:trPr>
         <w:tc>
           <w:tcPr>
-            <w:tcW w:w="4807" w:type="dxa"/>
+            <w:tcW w:w="4806" w:type="dxa"/>
             <w:tcBorders>
-              <w:top w:val="single" w:color="FFFFFF" w:sz="8" w:space="0"/>
-              <w:left w:val="single" w:color="FFFFFF" w:sz="8" w:space="0"/>
-              <w:bottom w:val="single" w:color="FFFFFF" w:sz="8" w:space="0"/>
-              <w:right w:val="single" w:color="FFFFFF" w:sz="8" w:space="0"/>
+              <w:top w:val="single" w:sz="8" w:space="0" w:color="FFFFFF"/>
+              <w:left w:val="single" w:sz="8" w:space="0" w:color="FFFFFF"/>
+              <w:bottom w:val="single" w:sz="8" w:space="0" w:color="FFFFFF"/>
+              <w:right w:val="single" w:sz="8" w:space="0" w:color="FFFFFF"/>
             </w:tcBorders>
           </w:tcPr>
-          <w:p wp14:textId="77777777">
+          <w:p>
             <w:pPr>
               <w:pStyle w:val="Normal"/>
               <w:suppressAutoHyphens w:val="true"/>
-              <w:spacing w:before="0" w:after="0" w:line="278" w:lineRule="auto"/>
+              <w:spacing w:lineRule="auto" w:line="278" w:before="0" w:after="0"/>
               <w:ind w:right="314"/>
               <w:jc w:val="left"/>
               <w:rPr>
+                <w:rFonts w:ascii="Open Sans" w:hAnsi="Open Sans"/>
+              </w:rPr>
+            </w:pPr>
+            <w:r>
+              <w:rPr>
+                <w:rFonts w:ascii="Open Sans" w:hAnsi="Open Sans"/>
+              </w:rPr>
+              <w:t>{KundenAnschrift}</w:t>
+            </w:r>
+          </w:p>
+          <w:p>
+            <w:pPr>
+              <w:pStyle w:val="Normal"/>
+              <w:suppressAutoHyphens w:val="true"/>
+              <w:spacing w:lineRule="auto" w:line="278" w:before="0" w:after="0"/>
+              <w:ind w:right="314"/>
+              <w:jc w:val="left"/>
+              <w:rPr>
                 <w:rFonts w:ascii="Open Sans" w:hAnsi="Open Sans" w:eastAsia="Open Sans" w:cs="Open Sans"/>
-              </w:rPr>
-            </w:pPr>
-            <w:r>
-              <w:rPr>
-                <w:rFonts w:ascii="Open Sans" w:hAnsi="Open Sans" w:eastAsia="Open Sans" w:cs="Open Sans"/>
+                <w:color w:val="1F1F1F"/>
+              </w:rPr>
+            </w:pPr>
+            <w:r>
+              <w:rPr>
+                <w:rFonts w:eastAsia="Open Sans" w:cs="Open Sans" w:ascii="Open Sans" w:hAnsi="Open Sans"/>
                 <w:kern w:val="0"/>
                 <w:sz w:val="22"/>
                 <w:szCs w:val="22"/>
                 <w:lang w:val="pl-PL" w:eastAsia="pl-PL" w:bidi="ar-SA"/>
               </w:rPr>
-              <w:t>{Anrede}</w:t>
-            </w:r>
-          </w:p>
-          <w:p wp14:textId="77777777">
-            <w:pPr>
-              <w:pStyle w:val="Normal"/>
-              <w:suppressAutoHyphens w:val="true"/>
-              <w:spacing w:before="0" w:after="0" w:line="278" w:lineRule="auto"/>
-              <w:ind w:right="314"/>
-              <w:jc w:val="left"/>
-              <w:rPr>
-                <w:rFonts w:ascii="Open Sans" w:hAnsi="Open Sans" w:eastAsia="Open Sans" w:cs="Open Sans"/>
-                <w:color w:val="1F1F1F"/>
-              </w:rPr>
-            </w:pPr>
-            <w:r>
-              <w:rPr>
-                <w:rFonts w:ascii="Open Sans" w:hAnsi="Open Sans" w:eastAsia="Open Sans" w:cs="Open Sans"/>
-                <w:kern w:val="0"/>
-                <w:sz w:val="22"/>
-                <w:szCs w:val="22"/>
-                <w:lang w:val="pl-PL" w:eastAsia="pl-PL" w:bidi="ar-SA"/>
-              </w:rPr>
-              <w:t>{Vorname} {Nachname}</w:t>
-            </w:r>
-          </w:p>
-          <w:p wp14:textId="77777777">
-            <w:pPr>
-              <w:pStyle w:val="Normal"/>
-              <w:suppressAutoHyphens w:val="true"/>
-              <w:spacing w:before="0" w:after="0" w:line="278" w:lineRule="auto"/>
-              <w:ind w:right="314"/>
-              <w:jc w:val="left"/>
-              <w:rPr>
-                <w:rFonts w:ascii="Open Sans" w:hAnsi="Open Sans" w:eastAsia="Open Sans" w:cs="Open Sans"/>
-                <w:color w:val="1F1F1F"/>
-              </w:rPr>
-            </w:pPr>
-            <w:r>
-              <w:rPr>
-                <w:rFonts w:ascii="Open Sans" w:hAnsi="Open Sans" w:eastAsia="Open Sans" w:cs="Open Sans"/>
-                <w:kern w:val="0"/>
-                <w:sz w:val="22"/>
-                <w:szCs w:val="22"/>
-                <w:lang w:val="pl-PL" w:eastAsia="pl-PL" w:bidi="ar-SA"/>
-              </w:rPr>
               <w:t>{Adresse}</w:t>
             </w:r>
           </w:p>
-          <w:p wp14:textId="77777777">
+          <w:p>
             <w:pPr>
               <w:pStyle w:val="normal1"/>
               <w:suppressAutoHyphens w:val="true"/>
-              <w:spacing w:before="0" w:after="0" w:line="278" w:lineRule="auto"/>
+              <w:spacing w:lineRule="auto" w:line="278" w:before="0" w:after="0"/>
               <w:ind w:right="314"/>
               <w:jc w:val="left"/>
               <w:rPr>
@@ -165,7 +138,7 @@
             </w:pPr>
             <w:r>
               <w:rPr>
-                <w:rFonts w:ascii="Open Sans" w:hAnsi="Open Sans" w:eastAsia="Open Sans" w:cs="Open Sans"/>
+                <w:rFonts w:eastAsia="Open Sans" w:cs="Open Sans" w:ascii="Open Sans" w:hAnsi="Open Sans"/>
                 <w:kern w:val="0"/>
                 <w:sz w:val="22"/>
                 <w:szCs w:val="22"/>
@@ -179,17 +152,17 @@
           <w:tcPr>
             <w:tcW w:w="2268" w:type="dxa"/>
             <w:tcBorders>
-              <w:top w:val="single" w:color="FFFFFF" w:sz="8" w:space="0"/>
-              <w:left w:val="single" w:color="FFFFFF" w:sz="8" w:space="0"/>
-              <w:bottom w:val="single" w:color="FFFFFF" w:sz="8" w:space="0"/>
-              <w:right w:val="single" w:color="FFFFFF" w:sz="8" w:space="0"/>
+              <w:top w:val="single" w:sz="8" w:space="0" w:color="FFFFFF"/>
+              <w:left w:val="single" w:sz="8" w:space="0" w:color="FFFFFF"/>
+              <w:bottom w:val="single" w:sz="8" w:space="0" w:color="FFFFFF"/>
+              <w:right w:val="single" w:sz="8" w:space="0" w:color="FFFFFF"/>
             </w:tcBorders>
           </w:tcPr>
-          <w:p wp14:textId="77777777">
+          <w:p>
             <w:pPr>
               <w:pStyle w:val="Normal"/>
               <w:suppressAutoHyphens w:val="true"/>
-              <w:spacing w:before="0" w:after="0" w:line="276" w:lineRule="auto"/>
+              <w:spacing w:lineRule="auto" w:line="276" w:before="0" w:after="0"/>
               <w:ind w:right="127"/>
               <w:jc w:val="left"/>
               <w:rPr>
@@ -201,7 +174,7 @@
             </w:pPr>
             <w:r>
               <w:rPr>
-                <w:rFonts w:ascii="Open Sans" w:hAnsi="Open Sans" w:eastAsia="Open Sans" w:cs="Open Sans"/>
+                <w:rFonts w:eastAsia="Open Sans" w:cs="Open Sans" w:ascii="Open Sans" w:hAnsi="Open Sans"/>
                 <w:color w:val="1F1F1F"/>
                 <w:kern w:val="0"/>
                 <w:sz w:val="21"/>
@@ -212,7 +185,7 @@
             </w:r>
             <w:r>
               <w:rPr>
-                <w:rFonts w:ascii="Open Sans" w:hAnsi="Open Sans" w:eastAsia="Open Sans" w:cs="Open Sans"/>
+                <w:rFonts w:eastAsia="Open Sans" w:cs="Open Sans" w:ascii="Open Sans" w:hAnsi="Open Sans"/>
                 <w:kern w:val="0"/>
                 <w:sz w:val="21"/>
                 <w:szCs w:val="21"/>
@@ -222,7 +195,7 @@
             </w:r>
             <w:r>
               <w:rPr>
-                <w:rFonts w:ascii="Open Sans" w:hAnsi="Open Sans" w:eastAsia="Open Sans" w:cs="Open Sans"/>
+                <w:rFonts w:eastAsia="Open Sans" w:cs="Open Sans" w:ascii="Open Sans" w:hAnsi="Open Sans"/>
                 <w:color w:val="1F1F1F"/>
                 <w:kern w:val="0"/>
                 <w:sz w:val="21"/>
@@ -232,11 +205,11 @@
               <w:t>Datum</w:t>
             </w:r>
           </w:p>
-          <w:p wp14:textId="77777777">
+          <w:p>
             <w:pPr>
               <w:pStyle w:val="Normal"/>
               <w:suppressAutoHyphens w:val="true"/>
-              <w:spacing w:before="0" w:after="0" w:line="276" w:lineRule="auto"/>
+              <w:spacing w:lineRule="auto" w:line="276" w:before="0" w:after="0"/>
               <w:ind w:right="127"/>
               <w:jc w:val="left"/>
               <w:rPr>
@@ -249,7 +222,7 @@
             </w:pPr>
             <w:r>
               <w:rPr>
-                <w:rFonts w:ascii="Open Sans" w:hAnsi="Open Sans" w:eastAsia="Open Sans" w:cs="Open Sans"/>
+                <w:rFonts w:eastAsia="Open Sans" w:cs="Open Sans" w:ascii="Open Sans" w:hAnsi="Open Sans"/>
                 <w:color w:val="1F1F1F"/>
                 <w:kern w:val="0"/>
                 <w:sz w:val="21"/>
@@ -259,11 +232,11 @@
               <w:t>Ansprechpartner</w:t>
             </w:r>
           </w:p>
-          <w:p wp14:textId="77777777">
+          <w:p>
             <w:pPr>
               <w:pStyle w:val="normal1"/>
               <w:suppressAutoHyphens w:val="true"/>
-              <w:spacing w:before="0" w:after="0" w:line="276" w:lineRule="auto"/>
+              <w:spacing w:lineRule="auto" w:line="276" w:before="0" w:after="0"/>
               <w:ind w:right="127"/>
               <w:jc w:val="left"/>
               <w:rPr>
@@ -276,7 +249,7 @@
             </w:pPr>
             <w:r>
               <w:rPr>
-                <w:rFonts w:ascii="Open Sans" w:hAnsi="Open Sans" w:eastAsia="Open Sans" w:cs="Open Sans"/>
+                <w:rFonts w:eastAsia="Open Sans" w:cs="Open Sans" w:ascii="Open Sans" w:hAnsi="Open Sans"/>
                 <w:color w:val="1F1F1F"/>
                 <w:kern w:val="0"/>
                 <w:sz w:val="21"/>
@@ -284,89 +257,69 @@
                 <w:lang w:val="de-DE" w:eastAsia="pl-PL" w:bidi="ar-SA"/>
               </w:rPr>
               <w:t>Telefon</w:t>
-            </w:r>
-            <w:r>
+              <w:br/>
+              <w:t>E-Mail</w:t>
+            </w:r>
+          </w:p>
+        </w:tc>
+        <w:tc>
+          <w:tcPr>
+            <w:tcW w:w="2961" w:type="dxa"/>
+            <w:tcBorders>
+              <w:top w:val="single" w:sz="8" w:space="0" w:color="FFFFFF"/>
+              <w:left w:val="single" w:sz="8" w:space="0" w:color="FFFFFF"/>
+              <w:bottom w:val="single" w:sz="8" w:space="0" w:color="FFFFFF"/>
+              <w:right w:val="single" w:sz="8" w:space="0" w:color="FFFFFF"/>
+            </w:tcBorders>
+          </w:tcPr>
+          <w:p>
+            <w:pPr>
+              <w:pStyle w:val="Normal"/>
+              <w:suppressAutoHyphens w:val="true"/>
+              <w:spacing w:lineRule="auto" w:line="276" w:before="0" w:after="0"/>
+              <w:jc w:val="right"/>
               <w:rPr>
                 <w:rFonts w:ascii="Open Sans" w:hAnsi="Open Sans" w:eastAsia="Open Sans" w:cs="Open Sans"/>
+                <w:lang w:val="de-DE"/>
+              </w:rPr>
+            </w:pPr>
+            <w:r>
+              <w:rPr>
+                <w:rFonts w:eastAsia="Open Sans" w:cs="Open Sans" w:ascii="Open Sans" w:hAnsi="Open Sans"/>
+                <w:kern w:val="0"/>
+                <w:sz w:val="22"/>
+                <w:szCs w:val="22"/>
+                <w:lang w:val="de-DE" w:eastAsia="pl-PL" w:bidi="ar-SA"/>
+              </w:rPr>
+              <w:t>{</w:t>
+            </w:r>
+            <w:r>
+              <w:rPr>
+                <w:rFonts w:eastAsia="Open Sans" w:cs="Open Sans" w:ascii="Open Sans" w:hAnsi="Open Sans"/>
                 <w:color w:val="1F1F1F"/>
                 <w:kern w:val="0"/>
                 <w:sz w:val="21"/>
                 <w:szCs w:val="21"/>
                 <w:lang w:val="de-DE" w:eastAsia="pl-PL" w:bidi="ar-SA"/>
               </w:rPr>
-              <w:br/>
-            </w:r>
-            <w:r>
-              <w:rPr>
-                <w:rFonts w:ascii="Open Sans" w:hAnsi="Open Sans" w:eastAsia="Open Sans" w:cs="Open Sans"/>
-                <w:color w:val="1F1F1F"/>
-                <w:kern w:val="0"/>
-                <w:sz w:val="21"/>
-                <w:szCs w:val="21"/>
-                <w:lang w:val="de-DE" w:eastAsia="pl-PL" w:bidi="ar-SA"/>
-              </w:rPr>
-              <w:t>E-Mail</w:t>
-            </w:r>
-          </w:p>
-        </w:tc>
-        <w:tc>
-          <w:tcPr>
-            <w:tcW w:w="2960" w:type="dxa"/>
-            <w:tcBorders>
-              <w:top w:val="single" w:color="FFFFFF" w:sz="8" w:space="0"/>
-              <w:left w:val="single" w:color="FFFFFF" w:sz="8" w:space="0"/>
-              <w:bottom w:val="single" w:color="FFFFFF" w:sz="8" w:space="0"/>
-              <w:right w:val="single" w:color="FFFFFF" w:sz="8" w:space="0"/>
-            </w:tcBorders>
-          </w:tcPr>
-          <w:p wp14:textId="77777777">
-            <w:pPr>
-              <w:pStyle w:val="Normal"/>
-              <w:suppressAutoHyphens w:val="true"/>
-              <w:spacing w:before="0" w:after="0" w:line="276" w:lineRule="auto"/>
-              <w:jc w:val="right"/>
-              <w:rPr>
-                <w:rFonts w:ascii="Open Sans" w:hAnsi="Open Sans" w:eastAsia="Open Sans" w:cs="Open Sans"/>
-                <w:lang w:val="de-DE"/>
-              </w:rPr>
-            </w:pPr>
-            <w:r>
-              <w:rPr>
-                <w:rFonts w:ascii="Open Sans" w:hAnsi="Open Sans" w:eastAsia="Open Sans" w:cs="Open Sans"/>
+              <w:t>Angebotsnummer</w:t>
+            </w:r>
+            <w:r>
+              <w:rPr>
+                <w:rFonts w:eastAsia="Open Sans" w:cs="Open Sans" w:ascii="Open Sans" w:hAnsi="Open Sans"/>
                 <w:kern w:val="0"/>
                 <w:sz w:val="22"/>
                 <w:szCs w:val="22"/>
                 <w:lang w:val="de-DE" w:eastAsia="pl-PL" w:bidi="ar-SA"/>
               </w:rPr>
-              <w:t>{</w:t>
-            </w:r>
-            <w:r>
-              <w:rPr>
-                <w:rFonts w:ascii="Open Sans" w:hAnsi="Open Sans" w:eastAsia="Open Sans" w:cs="Open Sans"/>
-                <w:color w:val="1F1F1F"/>
-                <w:kern w:val="0"/>
-                <w:sz w:val="21"/>
-                <w:szCs w:val="21"/>
-                <w:lang w:val="de-DE" w:eastAsia="pl-PL" w:bidi="ar-SA"/>
-              </w:rPr>
-              <w:t>Angebotsnummer</w:t>
-            </w:r>
-            <w:r>
-              <w:rPr>
-                <w:rFonts w:ascii="Open Sans" w:hAnsi="Open Sans" w:eastAsia="Open Sans" w:cs="Open Sans"/>
-                <w:kern w:val="0"/>
-                <w:sz w:val="22"/>
-                <w:szCs w:val="22"/>
-                <w:lang w:val="de-DE" w:eastAsia="pl-PL" w:bidi="ar-SA"/>
-              </w:rPr>
               <w:t>}</w:t>
             </w:r>
           </w:p>
-          <w:p wp14:textId="77777777">
+          <w:p>
             <w:pPr>
               <w:pStyle w:val="Normal"/>
               <w:suppressAutoHyphens w:val="true"/>
-              <w:spacing w:before="0" w:after="0" w:line="276" w:lineRule="auto"/>
+              <w:spacing w:lineRule="auto" w:line="276" w:before="0" w:after="0"/>
               <w:jc w:val="right"/>
               <w:rPr>
                 <w:rFonts w:ascii="Open Sans" w:hAnsi="Open Sans" w:eastAsia="Open Sans" w:cs="Open Sans"/>
@@ -378,7 +331,7 @@
             </w:pPr>
             <w:r>
               <w:rPr>
-                <w:rFonts w:ascii="Open Sans" w:hAnsi="Open Sans" w:eastAsia="Open Sans" w:cs="Open Sans"/>
+                <w:rFonts w:eastAsia="Open Sans" w:cs="Open Sans" w:ascii="Open Sans" w:hAnsi="Open Sans"/>
                 <w:kern w:val="0"/>
                 <w:sz w:val="22"/>
                 <w:szCs w:val="22"/>
@@ -388,7 +341,7 @@
             </w:r>
             <w:r>
               <w:rPr>
-                <w:rFonts w:ascii="Open Sans" w:hAnsi="Open Sans" w:eastAsia="Open Sans" w:cs="Open Sans"/>
+                <w:rFonts w:eastAsia="Open Sans" w:cs="Open Sans" w:ascii="Open Sans" w:hAnsi="Open Sans"/>
                 <w:color w:val="1F1F1F"/>
                 <w:kern w:val="0"/>
                 <w:sz w:val="21"/>
@@ -399,7 +352,7 @@
             </w:r>
             <w:r>
               <w:rPr>
-                <w:rFonts w:ascii="Open Sans" w:hAnsi="Open Sans" w:eastAsia="Open Sans" w:cs="Open Sans"/>
+                <w:rFonts w:eastAsia="Open Sans" w:cs="Open Sans" w:ascii="Open Sans" w:hAnsi="Open Sans"/>
                 <w:kern w:val="0"/>
                 <w:sz w:val="22"/>
                 <w:szCs w:val="22"/>
@@ -419,7 +372,7 @@
             </w:r>
             <w:r>
               <w:rPr>
-                <w:rFonts w:ascii="Open Sans" w:hAnsi="Open Sans" w:eastAsia="Open Sans" w:cs="Open Sans"/>
+                <w:rFonts w:eastAsia="Open Sans" w:cs="Open Sans" w:ascii="Open Sans" w:hAnsi="Open Sans"/>
                 <w:kern w:val="0"/>
                 <w:sz w:val="22"/>
                 <w:szCs w:val="22"/>
@@ -429,7 +382,7 @@
             </w:r>
             <w:r>
               <w:rPr>
-                <w:rFonts w:ascii="Open Sans" w:hAnsi="Open Sans" w:eastAsia="Open Sans" w:cs="Open Sans"/>
+                <w:rFonts w:eastAsia="Open Sans" w:cs="Open Sans" w:ascii="Open Sans" w:hAnsi="Open Sans"/>
                 <w:color w:val="1F1F1F"/>
                 <w:kern w:val="0"/>
                 <w:sz w:val="21"/>
@@ -440,7 +393,7 @@
             </w:r>
             <w:r>
               <w:rPr>
-                <w:rFonts w:ascii="Open Sans" w:hAnsi="Open Sans" w:eastAsia="Open Sans" w:cs="Open Sans"/>
+                <w:rFonts w:eastAsia="Open Sans" w:cs="Open Sans" w:ascii="Open Sans" w:hAnsi="Open Sans"/>
                 <w:kern w:val="0"/>
                 <w:sz w:val="22"/>
                 <w:szCs w:val="22"/>
@@ -460,7 +413,7 @@
             </w:r>
             <w:r>
               <w:rPr>
-                <w:rFonts w:ascii="Open Sans" w:hAnsi="Open Sans" w:eastAsia="Open Sans" w:cs="Open Sans"/>
+                <w:rFonts w:eastAsia="Open Sans" w:cs="Open Sans" w:ascii="Open Sans" w:hAnsi="Open Sans"/>
                 <w:color w:val="1F1F1F"/>
                 <w:kern w:val="0"/>
                 <w:sz w:val="21"/>
@@ -470,11 +423,11 @@
               <w:t xml:space="preserve">          09281 5915900</w:t>
             </w:r>
           </w:p>
-          <w:p wp14:textId="77777777">
+          <w:p>
             <w:pPr>
               <w:pStyle w:val="normal1"/>
               <w:suppressAutoHyphens w:val="true"/>
-              <w:spacing w:before="0" w:after="0" w:line="276" w:lineRule="auto"/>
+              <w:spacing w:lineRule="auto" w:line="276" w:before="0" w:after="0"/>
               <w:jc w:val="right"/>
               <w:rPr>
                 <w:rFonts w:ascii="Open Sans" w:hAnsi="Open Sans" w:eastAsia="Open Sans" w:cs="Open Sans"/>
@@ -486,7 +439,7 @@
             </w:pPr>
             <w:r>
               <w:rPr>
-                <w:rFonts w:ascii="Open Sans" w:hAnsi="Open Sans" w:eastAsia="Open Sans" w:cs="Open Sans"/>
+                <w:rFonts w:eastAsia="Open Sans" w:cs="Open Sans" w:ascii="Open Sans" w:hAnsi="Open Sans"/>
                 <w:color w:val="1F1F1F"/>
                 <w:kern w:val="0"/>
                 <w:sz w:val="21"/>
@@ -498,21 +451,21 @@
           </w:p>
         </w:tc>
       </w:tr>
-      <w:tr xmlns:wp14="http://schemas.microsoft.com/office/word/2010/wordml" wp14:textId="77777777">
+      <w:tr>
         <w:trPr>
           <w:trHeight w:val="370" w:hRule="atLeast"/>
         </w:trPr>
         <w:tc>
           <w:tcPr>
-            <w:tcW w:w="4807" w:type="dxa"/>
+            <w:tcW w:w="4806" w:type="dxa"/>
             <w:tcBorders>
-              <w:top w:val="single" w:color="FFFFFF" w:sz="8" w:space="0"/>
-              <w:left w:val="single" w:color="FFFFFF" w:sz="8" w:space="0"/>
-              <w:bottom w:val="single" w:color="FFFFFF" w:sz="8" w:space="0"/>
-              <w:right w:val="single" w:color="FFFFFF" w:sz="8" w:space="0"/>
+              <w:top w:val="single" w:sz="8" w:space="0" w:color="FFFFFF"/>
+              <w:left w:val="single" w:sz="8" w:space="0" w:color="FFFFFF"/>
+              <w:bottom w:val="single" w:sz="8" w:space="0" w:color="FFFFFF"/>
+              <w:right w:val="single" w:sz="8" w:space="0" w:color="FFFFFF"/>
             </w:tcBorders>
           </w:tcPr>
-          <w:p wp14:textId="77777777">
+          <w:p>
             <w:pPr>
               <w:pStyle w:val="normal1"/>
               <w:suppressAutoHyphens w:val="true"/>
@@ -528,43 +481,43 @@
             </w:pPr>
             <w:r>
               <w:rPr>
+                <w:rFonts w:eastAsia="Open Sans" w:cs="Open Sans" w:ascii="Open Sans" w:hAnsi="Open Sans"/>
+                <w:color w:val="070707"/>
+                <w:sz w:val="17"/>
+                <w:szCs w:val="17"/>
+                <w:lang w:val="de-DE"/>
+              </w:rPr>
+            </w:r>
+          </w:p>
+        </w:tc>
+        <w:tc>
+          <w:tcPr>
+            <w:tcW w:w="5229" w:type="dxa"/>
+            <w:gridSpan w:val="2"/>
+            <w:tcBorders>
+              <w:top w:val="single" w:sz="8" w:space="0" w:color="FFFFFF"/>
+              <w:left w:val="single" w:sz="8" w:space="0" w:color="FFFFFF"/>
+              <w:bottom w:val="single" w:sz="8" w:space="0" w:color="FFFFFF"/>
+              <w:right w:val="single" w:sz="8" w:space="0" w:color="FFFFFF"/>
+            </w:tcBorders>
+          </w:tcPr>
+          <w:p>
+            <w:pPr>
+              <w:pStyle w:val="Normal"/>
+              <w:suppressAutoHyphens w:val="true"/>
+              <w:spacing w:before="0" w:after="0"/>
+              <w:ind w:right="127"/>
+              <w:jc w:val="left"/>
+              <w:rPr>
                 <w:rFonts w:ascii="Open Sans" w:hAnsi="Open Sans" w:eastAsia="Open Sans" w:cs="Open Sans"/>
                 <w:color w:val="070707"/>
                 <w:sz w:val="17"/>
                 <w:szCs w:val="17"/>
-                <w:lang w:val="de-DE"/>
-              </w:rPr>
-            </w:r>
-          </w:p>
-        </w:tc>
-        <w:tc>
-          <w:tcPr>
-            <w:tcW w:w="5228" w:type="dxa"/>
-            <w:gridSpan w:val="2"/>
-            <w:tcBorders>
-              <w:top w:val="single" w:color="FFFFFF" w:sz="8" w:space="0"/>
-              <w:left w:val="single" w:color="FFFFFF" w:sz="8" w:space="0"/>
-              <w:bottom w:val="single" w:color="FFFFFF" w:sz="8" w:space="0"/>
-              <w:right w:val="single" w:color="FFFFFF" w:sz="8" w:space="0"/>
-            </w:tcBorders>
-          </w:tcPr>
-          <w:p wp14:textId="77777777">
-            <w:pPr>
-              <w:pStyle w:val="Normal"/>
-              <w:suppressAutoHyphens w:val="true"/>
-              <w:spacing w:before="0" w:after="0"/>
-              <w:ind w:right="127"/>
-              <w:jc w:val="left"/>
-              <w:rPr>
-                <w:rFonts w:ascii="Open Sans" w:hAnsi="Open Sans" w:eastAsia="Open Sans" w:cs="Open Sans"/>
-                <w:color w:val="070707"/>
-                <w:sz w:val="17"/>
-                <w:szCs w:val="17"/>
-              </w:rPr>
-            </w:pPr>
-            <w:r>
-              <w:rPr>
-                <w:rFonts w:ascii="Open Sans" w:hAnsi="Open Sans" w:eastAsia="Open Sans" w:cs="Open Sans"/>
+              </w:rPr>
+            </w:pPr>
+            <w:r>
+              <w:rPr>
+                <w:rFonts w:eastAsia="Open Sans" w:cs="Open Sans" w:ascii="Open Sans" w:hAnsi="Open Sans"/>
                 <w:b/>
                 <w:bCs/>
                 <w:color w:val="1F1F1F"/>
@@ -587,7 +540,7 @@
             </w:r>
             <w:r>
               <w:rPr>
-                <w:rFonts w:ascii="Open Sans" w:hAnsi="Open Sans" w:eastAsia="Open Sans" w:cs="Open Sans"/>
+                <w:rFonts w:eastAsia="Open Sans" w:cs="Open Sans" w:ascii="Open Sans" w:hAnsi="Open Sans"/>
                 <w:kern w:val="0"/>
                 <w:sz w:val="22"/>
                 <w:szCs w:val="22"/>
@@ -599,7 +552,7 @@
         </w:tc>
       </w:tr>
     </w:tbl>
-    <w:p xmlns:wp14="http://schemas.microsoft.com/office/word/2010/wordml" wp14:textId="77777777">
+    <w:p>
       <w:pPr>
         <w:pStyle w:val="normal1"/>
         <w:rPr>
@@ -609,12 +562,12 @@
       </w:pPr>
       <w:r>
         <w:rPr>
-          <w:rFonts w:ascii="Open Sans" w:hAnsi="Open Sans" w:eastAsia="Open Sans" w:cs="Open Sans"/>
+          <w:rFonts w:eastAsia="Open Sans" w:cs="Open Sans" w:ascii="Open Sans" w:hAnsi="Open Sans"/>
           <w:color w:val="000000"/>
         </w:rPr>
       </w:r>
     </w:p>
-    <w:p xmlns:wp14="http://schemas.microsoft.com/office/word/2010/wordml" wp14:textId="77777777">
+    <w:p>
       <w:pPr>
         <w:pStyle w:val="Normal"/>
         <w:spacing w:before="156" w:after="0"/>
@@ -629,7 +582,7 @@
       </w:pPr>
       <w:r>
         <w:rPr>
-          <w:rFonts w:ascii="Arial" w:hAnsi="Arial" w:eastAsia="Arial" w:cs="Arial"/>
+          <w:rFonts w:eastAsia="Arial" w:cs="Arial" w:ascii="Arial" w:hAnsi="Arial"/>
           <w:b/>
           <w:bCs/>
           <w:color w:val="000000"/>
@@ -640,7 +593,7 @@
       </w:r>
       <w:r>
         <w:rPr>
-          <w:rFonts w:ascii="Arial" w:hAnsi="Arial" w:eastAsia="Arial" w:cs="Arial"/>
+          <w:rFonts w:eastAsia="Arial" w:cs="Arial" w:ascii="Arial" w:hAnsi="Arial"/>
           <w:b/>
           <w:bCs/>
           <w:color w:val="000000"/>
@@ -650,7 +603,7 @@
         <w:t>Ihr Angebot {Angebotsnummer}</w:t>
       </w:r>
     </w:p>
-    <w:p xmlns:wp14="http://schemas.microsoft.com/office/word/2010/wordml" wp14:textId="77777777">
+    <w:p>
       <w:pPr>
         <w:pStyle w:val="Normal"/>
         <w:spacing w:before="156" w:after="0"/>
@@ -661,28 +614,42 @@
       </w:pPr>
       <w:r>
         <w:rPr>
-          <w:rFonts w:ascii="Open Sans" w:hAnsi="Open Sans" w:eastAsia="Open Sans" w:cs="Open Sans"/>
+          <w:rFonts w:eastAsia="Open Sans" w:cs="Open Sans" w:ascii="Open Sans" w:hAnsi="Open Sans"/>
           <w:color w:val="000000"/>
         </w:rPr>
         <w:t xml:space="preserve">  </w:t>
       </w:r>
       <w:r>
         <w:rPr>
-          <w:rFonts w:ascii="Open Sans" w:hAnsi="Open Sans" w:eastAsia="Open Sans" w:cs="Open Sans"/>
+          <w:rFonts w:eastAsia="Open Sans" w:cs="Open Sans" w:ascii="Open Sans" w:hAnsi="Open Sans"/>
           <w:color w:val="000000"/>
         </w:rPr>
-        <w:t>{Greeting} {Nachname},</w:t>
+        <w:t>{Greeting</w:t>
+      </w:r>
+      <w:r>
+        <w:rPr>
+          <w:rFonts w:eastAsia="Open Sans" w:cs="Open Sans" w:ascii="Open Sans" w:hAnsi="Open Sans"/>
+          <w:color w:val="000000"/>
+        </w:rPr>
+        <w:t>Line</w:t>
+      </w:r>
+      <w:r>
+        <w:rPr>
+          <w:rFonts w:eastAsia="Open Sans" w:cs="Open Sans" w:ascii="Open Sans" w:hAnsi="Open Sans"/>
+          <w:color w:val="000000"/>
+        </w:rPr>
+        <w:t>},</w:t>
       </w:r>
       <w:r>
         <w:rPr/>
         <w:br/>
       </w:r>
     </w:p>
-    <w:p xmlns:wp14="http://schemas.microsoft.com/office/word/2010/wordml" wp14:textId="77777777">
+    <w:p>
       <w:pPr>
         <w:pStyle w:val="Normal"/>
         <w:spacing w:before="1" w:after="0"/>
-        <w:ind w:left="125" w:right="-89" w:hanging="5"/>
+        <w:ind w:hanging="5" w:left="125" w:right="-89"/>
         <w:rPr>
           <w:rFonts w:ascii="Open Sans" w:hAnsi="Open Sans" w:eastAsia="Open Sans" w:cs="Open Sans"/>
           <w:color w:val="000000"/>
@@ -690,7 +657,7 @@
       </w:pPr>
       <w:r>
         <w:rPr>
-          <w:rFonts w:ascii="Open Sans" w:hAnsi="Open Sans" w:eastAsia="Open Sans" w:cs="Open Sans"/>
+          <w:rFonts w:eastAsia="Open Sans" w:cs="Open Sans" w:ascii="Open Sans" w:hAnsi="Open Sans"/>
           <w:color w:val="070707"/>
           <w:lang w:val="de-DE"/>
         </w:rPr>
@@ -704,19 +671,19 @@
       </w:r>
       <w:r>
         <w:rPr>
-          <w:rFonts w:ascii="Open Sans" w:hAnsi="Open Sans" w:eastAsia="Open Sans" w:cs="Open Sans"/>
+          <w:rFonts w:eastAsia="Open Sans" w:cs="Open Sans" w:ascii="Open Sans" w:hAnsi="Open Sans"/>
           <w:color w:val="070707"/>
         </w:rPr>
         <w:t>Wir freuen uns, Ihnen folgendes Angebot unterbreiten zu können.</w:t>
       </w:r>
     </w:p>
-    <w:p xmlns:wp14="http://schemas.microsoft.com/office/word/2010/wordml" wp14:textId="77777777">
+    <w:p>
       <w:pPr>
         <w:pStyle w:val="normal1"/>
         <w:tabs>
           <w:tab w:val="clear" w:pos="720"/>
-          <w:tab w:val="left" w:leader="none" w:pos="750"/>
-          <w:tab w:val="left" w:leader="none" w:pos="1416"/>
+          <w:tab w:val="left" w:pos="750" w:leader="none"/>
+          <w:tab w:val="left" w:pos="1416" w:leader="none"/>
         </w:tabs>
         <w:spacing w:before="121" w:after="0"/>
         <w:rPr>
@@ -728,7 +695,7 @@
       </w:pPr>
       <w:r>
         <w:rPr>
-          <w:rFonts w:ascii="Open Sans" w:hAnsi="Open Sans" w:eastAsia="Open Sans" w:cs="Open Sans"/>
+          <w:rFonts w:eastAsia="Open Sans" w:cs="Open Sans" w:ascii="Open Sans" w:hAnsi="Open Sans"/>
           <w:color w:val="070707"/>
           <w:sz w:val="20"/>
           <w:szCs w:val="20"/>
@@ -748,16 +715,16 @@
           <w:bottom w:w="0" w:type="dxa"/>
           <w:right w:w="0" w:type="dxa"/>
         </w:tblCellMar>
-        <w:tblLook w:val="04a0" w:firstRow="1" w:lastRow="0" w:firstColumn="1" w:lastColumn="0" w:noHBand="0" w:noVBand="1"/>
+        <w:tblLook w:val="04a0" w:noVBand="1" w:noHBand="0" w:lastColumn="0" w:firstColumn="1" w:lastRow="0" w:firstRow="1"/>
       </w:tblPr>
       <w:tblGrid>
         <w:gridCol w:w="510"/>
         <w:gridCol w:w="885"/>
-        <w:gridCol w:w="5863"/>
+        <w:gridCol w:w="5862"/>
         <w:gridCol w:w="1440"/>
-        <w:gridCol w:w="1247"/>
+        <w:gridCol w:w="1248"/>
       </w:tblGrid>
-      <w:tr xmlns:wp14="http://schemas.microsoft.com/office/word/2010/wordml" wp14:textId="77777777">
+      <w:tr>
         <w:trPr>
           <w:trHeight w:val="1" w:hRule="atLeast"/>
         </w:trPr>
@@ -765,9 +732,9 @@
           <w:tcPr>
             <w:tcW w:w="510" w:type="dxa"/>
             <w:tcBorders/>
-            <w:shd w:val="clear" w:color="auto" w:fill="CCCCCC"/>
+            <w:shd w:color="auto" w:fill="CCCCCC" w:val="clear"/>
           </w:tcPr>
-          <w:p wp14:textId="77777777">
+          <w:p>
             <w:pPr>
               <w:pStyle w:val="normal1"/>
               <w:suppressAutoHyphens w:val="true"/>
@@ -783,7 +750,7 @@
             </w:pPr>
             <w:r>
               <w:rPr>
-                <w:rFonts w:ascii="Open Sans" w:hAnsi="Open Sans" w:eastAsia="Open Sans" w:cs="Open Sans"/>
+                <w:rFonts w:eastAsia="Open Sans" w:cs="Open Sans" w:ascii="Open Sans" w:hAnsi="Open Sans"/>
                 <w:color w:val="070707"/>
                 <w:kern w:val="0"/>
                 <w:sz w:val="22"/>
@@ -798,9 +765,9 @@
           <w:tcPr>
             <w:tcW w:w="885" w:type="dxa"/>
             <w:tcBorders/>
-            <w:shd w:val="clear" w:color="auto" w:fill="CCCCCC"/>
+            <w:shd w:color="auto" w:fill="CCCCCC" w:val="clear"/>
           </w:tcPr>
-          <w:p wp14:textId="77777777">
+          <w:p>
             <w:pPr>
               <w:pStyle w:val="normal1"/>
               <w:suppressAutoHyphens w:val="true"/>
@@ -816,7 +783,7 @@
             </w:pPr>
             <w:r>
               <w:rPr>
-                <w:rFonts w:ascii="Open Sans" w:hAnsi="Open Sans" w:eastAsia="Open Sans" w:cs="Open Sans"/>
+                <w:rFonts w:eastAsia="Open Sans" w:cs="Open Sans" w:ascii="Open Sans" w:hAnsi="Open Sans"/>
                 <w:color w:val="070707"/>
                 <w:kern w:val="0"/>
                 <w:sz w:val="22"/>
@@ -829,11 +796,11 @@
         </w:tc>
         <w:tc>
           <w:tcPr>
-            <w:tcW w:w="5863" w:type="dxa"/>
+            <w:tcW w:w="5862" w:type="dxa"/>
             <w:tcBorders/>
-            <w:shd w:val="clear" w:color="auto" w:fill="CCCCCC"/>
+            <w:shd w:color="auto" w:fill="CCCCCC" w:val="clear"/>
           </w:tcPr>
-          <w:p wp14:textId="77777777">
+          <w:p>
             <w:pPr>
               <w:pStyle w:val="normal1"/>
               <w:suppressAutoHyphens w:val="true"/>
@@ -846,7 +813,7 @@
             </w:pPr>
             <w:r>
               <w:rPr>
-                <w:rFonts w:ascii="Open Sans" w:hAnsi="Open Sans" w:eastAsia="Open Sans" w:cs="Open Sans"/>
+                <w:rFonts w:eastAsia="Open Sans" w:cs="Open Sans" w:ascii="Open Sans" w:hAnsi="Open Sans"/>
                 <w:color w:val="000000"/>
                 <w:kern w:val="0"/>
                 <w:sz w:val="22"/>
@@ -861,9 +828,9 @@
           <w:tcPr>
             <w:tcW w:w="1440" w:type="dxa"/>
             <w:tcBorders/>
-            <w:shd w:val="clear" w:color="auto" w:fill="CCCCCC"/>
+            <w:shd w:color="auto" w:fill="CCCCCC" w:val="clear"/>
           </w:tcPr>
-          <w:p wp14:textId="77777777">
+          <w:p>
             <w:pPr>
               <w:pStyle w:val="Normal"/>
               <w:suppressAutoHyphens w:val="true"/>
@@ -875,7 +842,7 @@
             </w:pPr>
             <w:r>
               <w:rPr>
-                <w:rFonts w:ascii="Open Sans" w:hAnsi="Open Sans" w:eastAsia="Open Sans" w:cs="Open Sans"/>
+                <w:rFonts w:eastAsia="Open Sans" w:cs="Open Sans" w:ascii="Open Sans" w:hAnsi="Open Sans"/>
                 <w:color w:val="000000"/>
                 <w:kern w:val="0"/>
                 <w:sz w:val="22"/>
@@ -888,11 +855,11 @@
         </w:tc>
         <w:tc>
           <w:tcPr>
-            <w:tcW w:w="1247" w:type="dxa"/>
+            <w:tcW w:w="1248" w:type="dxa"/>
             <w:tcBorders/>
-            <w:shd w:val="clear" w:color="auto" w:fill="CCCCCC"/>
+            <w:shd w:color="auto" w:fill="CCCCCC" w:val="clear"/>
           </w:tcPr>
-          <w:p wp14:textId="77777777">
+          <w:p>
             <w:pPr>
               <w:pStyle w:val="Normal"/>
               <w:suppressAutoHyphens w:val="true"/>
@@ -904,7 +871,7 @@
             </w:pPr>
             <w:r>
               <w:rPr>
-                <w:rFonts w:ascii="Open Sans" w:hAnsi="Open Sans" w:eastAsia="Open Sans" w:cs="Open Sans"/>
+                <w:rFonts w:eastAsia="Open Sans" w:cs="Open Sans" w:ascii="Open Sans" w:hAnsi="Open Sans"/>
                 <w:color w:val="000000"/>
                 <w:kern w:val="0"/>
                 <w:sz w:val="22"/>
@@ -916,7 +883,7 @@
           </w:p>
         </w:tc>
       </w:tr>
-      <w:tr xmlns:wp14="http://schemas.microsoft.com/office/word/2010/wordml" wp14:textId="77777777">
+      <w:tr>
         <w:trPr>
           <w:trHeight w:val="315" w:hRule="atLeast"/>
         </w:trPr>
@@ -924,9 +891,9 @@
           <w:tcPr>
             <w:tcW w:w="510" w:type="dxa"/>
             <w:tcBorders/>
-            <w:shd w:val="clear" w:color="auto" w:fill="FFFFFF"/>
+            <w:shd w:color="auto" w:fill="FFFFFF" w:val="clear"/>
           </w:tcPr>
-          <w:p wp14:textId="77777777">
+          <w:p>
             <w:pPr>
               <w:pStyle w:val="normal1"/>
               <w:suppressAutoHyphens w:val="true"/>
@@ -939,7 +906,7 @@
             </w:pPr>
             <w:r>
               <w:rPr>
-                <w:rFonts w:ascii="Arial" w:hAnsi="Arial" w:eastAsia="Arial" w:cs="Arial"/>
+                <w:rFonts w:eastAsia="Arial" w:cs="Arial" w:ascii="Arial" w:hAnsi="Arial"/>
                 <w:color w:val="070707"/>
                 <w:kern w:val="0"/>
                 <w:sz w:val="18"/>
@@ -954,9 +921,9 @@
           <w:tcPr>
             <w:tcW w:w="885" w:type="dxa"/>
             <w:tcBorders/>
-            <w:shd w:val="clear" w:color="auto" w:fill="FFFFFF"/>
+            <w:shd w:color="auto" w:fill="FFFFFF" w:val="clear"/>
           </w:tcPr>
-          <w:p wp14:textId="77777777">
+          <w:p>
             <w:pPr>
               <w:pStyle w:val="Normal"/>
               <w:suppressAutoHyphens w:val="true"/>
@@ -970,7 +937,7 @@
             </w:pPr>
             <w:r>
               <w:rPr>
-                <w:rFonts w:ascii="Arial" w:hAnsi="Arial" w:eastAsia="Arial" w:cs="Arial"/>
+                <w:rFonts w:eastAsia="Arial" w:cs="Arial" w:ascii="Arial" w:hAnsi="Arial"/>
                 <w:color w:val="070707"/>
                 <w:kern w:val="0"/>
                 <w:sz w:val="18"/>
@@ -983,11 +950,11 @@
         </w:tc>
         <w:tc>
           <w:tcPr>
-            <w:tcW w:w="5863" w:type="dxa"/>
+            <w:tcW w:w="5862" w:type="dxa"/>
             <w:tcBorders/>
-            <w:shd w:val="clear" w:color="auto" w:fill="FFFFFF"/>
+            <w:shd w:color="auto" w:fill="FFFFFF" w:val="clear"/>
           </w:tcPr>
-          <w:p wp14:textId="77777777">
+          <w:p>
             <w:pPr>
               <w:pStyle w:val="Normal"/>
               <w:suppressAutoHyphens w:val="true"/>
@@ -1002,7 +969,7 @@
             </w:pPr>
             <w:r>
               <w:rPr>
-                <w:rFonts w:ascii="Arial" w:hAnsi="Arial" w:eastAsia="Arial" w:cs="Arial"/>
+                <w:rFonts w:eastAsia="Arial" w:cs="Arial" w:ascii="Arial" w:hAnsi="Arial"/>
                 <w:b/>
                 <w:bCs/>
                 <w:color w:val="000000"/>
@@ -1019,9 +986,9 @@
           <w:tcPr>
             <w:tcW w:w="1440" w:type="dxa"/>
             <w:tcBorders/>
-            <w:shd w:val="clear" w:color="auto" w:fill="FFFFFF"/>
+            <w:shd w:color="auto" w:fill="FFFFFF" w:val="clear"/>
           </w:tcPr>
-          <w:p wp14:textId="77777777">
+          <w:p>
             <w:pPr>
               <w:pStyle w:val="Normal"/>
               <w:suppressAutoHyphens w:val="true"/>
@@ -1034,7 +1001,7 @@
             </w:pPr>
             <w:r>
               <w:rPr>
-                <w:rFonts w:ascii="Arial" w:hAnsi="Arial" w:eastAsia="Arial" w:cs="Arial"/>
+                <w:rFonts w:eastAsia="Arial" w:cs="Arial" w:ascii="Arial" w:hAnsi="Arial"/>
                 <w:color w:val="000000"/>
                 <w:kern w:val="0"/>
                 <w:sz w:val="20"/>
@@ -1047,11 +1014,11 @@
         </w:tc>
         <w:tc>
           <w:tcPr>
-            <w:tcW w:w="1247" w:type="dxa"/>
+            <w:tcW w:w="1248" w:type="dxa"/>
             <w:tcBorders/>
-            <w:shd w:val="clear" w:color="auto" w:fill="FFFFFF"/>
+            <w:shd w:color="auto" w:fill="FFFFFF" w:val="clear"/>
           </w:tcPr>
-          <w:p wp14:textId="77777777">
+          <w:p>
             <w:pPr>
               <w:pStyle w:val="Normal"/>
               <w:suppressAutoHyphens w:val="true"/>
@@ -1064,7 +1031,7 @@
             </w:pPr>
             <w:r>
               <w:rPr>
-                <w:rFonts w:ascii="Arial" w:hAnsi="Arial" w:eastAsia="Arial" w:cs="Arial"/>
+                <w:rFonts w:eastAsia="Arial" w:cs="Arial" w:ascii="Arial" w:hAnsi="Arial"/>
                 <w:color w:val="000000"/>
                 <w:kern w:val="0"/>
                 <w:sz w:val="20"/>
@@ -1076,7 +1043,7 @@
           </w:p>
         </w:tc>
       </w:tr>
-      <w:tr xmlns:wp14="http://schemas.microsoft.com/office/word/2010/wordml" wp14:textId="77777777">
+      <w:tr>
         <w:trPr>
           <w:trHeight w:val="1741" w:hRule="atLeast"/>
         </w:trPr>
@@ -1084,19 +1051,19 @@
           <w:tcPr>
             <w:tcW w:w="510" w:type="dxa"/>
             <w:tcBorders/>
-            <w:shd w:val="clear" w:color="auto" w:fill="FFFFFF"/>
+            <w:shd w:color="auto" w:fill="FFFFFF" w:val="clear"/>
             <w:tcMar>
               <w:left w:w="56" w:type="dxa"/>
               <w:right w:w="56" w:type="dxa"/>
             </w:tcMar>
           </w:tcPr>
-          <w:p wp14:textId="77777777">
+          <w:p>
             <w:pPr>
               <w:pStyle w:val="normal1"/>
               <w:tabs>
                 <w:tab w:val="clear" w:pos="720"/>
-                <w:tab w:val="left" w:leader="none" w:pos="750"/>
-                <w:tab w:val="left" w:leader="none" w:pos="1416"/>
+                <w:tab w:val="left" w:pos="750" w:leader="none"/>
+                <w:tab w:val="left" w:pos="1416" w:leader="none"/>
               </w:tabs>
               <w:suppressAutoHyphens w:val="true"/>
               <w:spacing w:before="121" w:after="0"/>
@@ -1110,14 +1077,14 @@
             </w:pPr>
             <w:r>
               <w:rPr>
-                <w:rFonts w:ascii="Arial" w:hAnsi="Arial" w:eastAsia="Arial" w:cs="Arial"/>
+                <w:rFonts w:eastAsia="Arial" w:cs="Arial" w:ascii="Arial" w:hAnsi="Arial"/>
                 <w:color w:val="070707"/>
                 <w:sz w:val="20"/>
                 <w:szCs w:val="20"/>
               </w:rPr>
             </w:r>
           </w:p>
-          <w:p wp14:textId="77777777">
+          <w:p>
             <w:pPr>
               <w:pStyle w:val="normal1"/>
               <w:suppressAutoHyphens w:val="true"/>
@@ -1129,7 +1096,7 @@
             </w:pPr>
             <w:r>
               <w:rPr>
-                <w:rFonts w:ascii="Arial" w:hAnsi="Arial" w:eastAsia="Arial" w:cs="Arial"/>
+                <w:rFonts w:eastAsia="Arial" w:cs="Arial" w:ascii="Arial" w:hAnsi="Arial"/>
               </w:rPr>
             </w:r>
           </w:p>
@@ -1138,13 +1105,13 @@
           <w:tcPr>
             <w:tcW w:w="885" w:type="dxa"/>
             <w:tcBorders/>
-            <w:shd w:val="clear" w:color="auto" w:fill="FFFFFF"/>
+            <w:shd w:color="auto" w:fill="FFFFFF" w:val="clear"/>
             <w:tcMar>
               <w:left w:w="56" w:type="dxa"/>
               <w:right w:w="56" w:type="dxa"/>
             </w:tcMar>
           </w:tcPr>
-          <w:p wp14:textId="77777777">
+          <w:p>
             <w:pPr>
               <w:pStyle w:val="normal1"/>
               <w:suppressAutoHyphens w:val="true"/>
@@ -1157,7 +1124,7 @@
             </w:pPr>
             <w:r>
               <w:rPr>
-                <w:rFonts w:ascii="Arial" w:hAnsi="Arial" w:eastAsia="Arial" w:cs="Arial"/>
+                <w:rFonts w:eastAsia="Arial" w:cs="Arial" w:ascii="Arial" w:hAnsi="Arial"/>
                 <w:color w:val="000000"/>
               </w:rPr>
             </w:r>
@@ -1165,19 +1132,19 @@
         </w:tc>
         <w:tc>
           <w:tcPr>
-            <w:tcW w:w="5863" w:type="dxa"/>
+            <w:tcW w:w="5862" w:type="dxa"/>
             <w:tcBorders/>
-            <w:shd w:val="clear" w:color="auto" w:fill="FFFFFF"/>
+            <w:shd w:color="auto" w:fill="FFFFFF" w:val="clear"/>
             <w:tcMar>
               <w:left w:w="56" w:type="dxa"/>
               <w:right w:w="56" w:type="dxa"/>
             </w:tcMar>
           </w:tcPr>
-          <w:p wp14:textId="77777777">
+          <w:p>
             <w:pPr>
               <w:pStyle w:val="normal1"/>
               <w:suppressAutoHyphens w:val="true"/>
-              <w:spacing w:before="0" w:after="0" w:line="278" w:lineRule="auto"/>
+              <w:spacing w:lineRule="auto" w:line="278" w:before="0" w:after="0"/>
               <w:jc w:val="left"/>
               <w:rPr>
                 <w:rFonts w:ascii="Arial" w:hAnsi="Arial" w:eastAsia="Arial" w:cs="Arial"/>
@@ -1188,21 +1155,46 @@
             </w:pPr>
             <w:r>
               <w:rPr>
+                <w:rFonts w:eastAsia="Arial" w:cs="Arial" w:ascii="Arial" w:hAnsi="Arial"/>
+                <w:color w:val="000000"/>
+                <w:kern w:val="0"/>
+                <w:sz w:val="20"/>
+                <w:szCs w:val="20"/>
+                <w:lang w:val="pl-PL" w:eastAsia="pl-PL" w:bidi="ar-SA"/>
+              </w:rPr>
+              <w:t>{#PrimaryServiceLines}</w:t>
+            </w:r>
+          </w:p>
+          <w:p>
+            <w:pPr>
+              <w:pStyle w:val="Normal"/>
+              <w:suppressAutoHyphens w:val="true"/>
+              <w:spacing w:lineRule="auto" w:line="278" w:before="0" w:after="0"/>
+              <w:jc w:val="left"/>
+              <w:rPr>
                 <w:rFonts w:ascii="Arial" w:hAnsi="Arial" w:eastAsia="Arial" w:cs="Arial"/>
                 <w:color w:val="000000"/>
-                <w:kern w:val="0"/>
-                <w:sz w:val="20"/>
-                <w:szCs w:val="20"/>
-                <w:lang w:val="pl-PL" w:eastAsia="pl-PL" w:bidi="ar-SA"/>
-              </w:rPr>
-              <w:t>{#PrimaryServiceLines}</w:t>
-            </w:r>
-          </w:p>
-          <w:p wp14:textId="77777777">
+                <w:sz w:val="20"/>
+                <w:szCs w:val="20"/>
+              </w:rPr>
+            </w:pPr>
+            <w:r>
+              <w:rPr>
+                <w:rFonts w:eastAsia="Arial" w:cs="Arial" w:ascii="Arial" w:hAnsi="Arial"/>
+                <w:color w:val="000000"/>
+                <w:kern w:val="0"/>
+                <w:sz w:val="20"/>
+                <w:szCs w:val="20"/>
+                <w:lang w:val="pl-PL" w:eastAsia="pl-PL" w:bidi="ar-SA"/>
+              </w:rPr>
+              <w:t>{ServiceLine}</w:t>
+            </w:r>
+          </w:p>
+          <w:p>
             <w:pPr>
               <w:pStyle w:val="Normal"/>
               <w:suppressAutoHyphens w:val="true"/>
-              <w:spacing w:before="0" w:after="0" w:line="278" w:lineRule="auto"/>
+              <w:spacing w:lineRule="auto" w:line="278" w:before="0" w:after="0"/>
               <w:jc w:val="left"/>
               <w:rPr>
                 <w:rFonts w:ascii="Arial" w:hAnsi="Arial" w:eastAsia="Arial" w:cs="Arial"/>
@@ -1213,8 +1205,155 @@
             </w:pPr>
             <w:r>
               <w:rPr>
+                <w:rFonts w:eastAsia="Arial" w:cs="Arial" w:ascii="Arial" w:hAnsi="Arial"/>
+                <w:color w:val="000000"/>
+                <w:kern w:val="0"/>
+                <w:sz w:val="20"/>
+                <w:szCs w:val="20"/>
+                <w:lang w:val="pl-PL" w:eastAsia="pl-PL" w:bidi="ar-SA"/>
+              </w:rPr>
+              <w:t>{/PrimaryServiceLines}</w:t>
+            </w:r>
+          </w:p>
+          <w:p>
+            <w:pPr>
+              <w:pStyle w:val="normal1"/>
+              <w:suppressAutoHyphens w:val="true"/>
+              <w:spacing w:lineRule="auto" w:line="278" w:before="0" w:after="0"/>
+              <w:jc w:val="left"/>
+              <w:rPr>
                 <w:rFonts w:ascii="Arial" w:hAnsi="Arial" w:eastAsia="Arial" w:cs="Arial"/>
                 <w:color w:val="000000"/>
+                <w:sz w:val="20"/>
+                <w:szCs w:val="20"/>
+              </w:rPr>
+            </w:pPr>
+            <w:r>
+              <w:rPr>
+                <w:rFonts w:eastAsia="Arial" w:cs="Arial" w:ascii="Arial" w:hAnsi="Arial"/>
+                <w:color w:val="000000"/>
+                <w:sz w:val="20"/>
+                <w:szCs w:val="20"/>
+              </w:rPr>
+            </w:r>
+          </w:p>
+          <w:p>
+            <w:pPr>
+              <w:pStyle w:val="normal1"/>
+              <w:suppressAutoHyphens w:val="true"/>
+              <w:spacing w:lineRule="auto" w:line="278" w:before="0" w:after="0"/>
+              <w:jc w:val="left"/>
+              <w:rPr>
+                <w:rFonts w:ascii="Arial" w:hAnsi="Arial" w:eastAsia="Arial" w:cs="Arial"/>
+                <w:color w:val="000000"/>
+                <w:sz w:val="20"/>
+                <w:szCs w:val="20"/>
+              </w:rPr>
+            </w:pPr>
+            <w:r>
+              <w:rPr>
+                <w:rFonts w:eastAsia="Arial" w:cs="Arial" w:ascii="Arial" w:hAnsi="Arial"/>
+                <w:color w:val="000000"/>
+                <w:kern w:val="0"/>
+                <w:sz w:val="20"/>
+                <w:szCs w:val="20"/>
+                <w:lang w:val="pl-PL" w:eastAsia="pl-PL" w:bidi="ar-SA"/>
+              </w:rPr>
+              <w:t>{#HasIncluded}</w:t>
+            </w:r>
+          </w:p>
+          <w:p>
+            <w:pPr>
+              <w:pStyle w:val="Normal"/>
+              <w:suppressAutoHyphens w:val="true"/>
+              <w:spacing w:lineRule="auto" w:line="278" w:before="0" w:after="0"/>
+              <w:jc w:val="left"/>
+              <w:rPr>
+                <w:rFonts w:ascii="Arial" w:hAnsi="Arial" w:eastAsia="Arial" w:cs="Arial"/>
+                <w:color w:val="000000"/>
+                <w:sz w:val="20"/>
+                <w:szCs w:val="20"/>
+              </w:rPr>
+            </w:pPr>
+            <w:r>
+              <w:rPr>
+                <w:rFonts w:eastAsia="Arial" w:cs="Arial" w:ascii="Arial" w:hAnsi="Arial"/>
+                <w:color w:val="000000"/>
+                <w:kern w:val="0"/>
+                <w:sz w:val="20"/>
+                <w:szCs w:val="20"/>
+                <w:lang w:val="pl-PL" w:eastAsia="pl-PL" w:bidi="ar-SA"/>
+              </w:rPr>
+              <w:t>Enthält je Einheit</w:t>
+            </w:r>
+          </w:p>
+          <w:p>
+            <w:pPr>
+              <w:pStyle w:val="Normal"/>
+              <w:suppressAutoHyphens w:val="true"/>
+              <w:spacing w:lineRule="auto" w:line="278" w:before="0" w:after="0"/>
+              <w:jc w:val="left"/>
+              <w:rPr>
+                <w:rFonts w:ascii="Arial" w:hAnsi="Arial" w:eastAsia="Arial" w:cs="Arial"/>
+                <w:color w:val="000000"/>
+                <w:sz w:val="20"/>
+                <w:szCs w:val="20"/>
+              </w:rPr>
+            </w:pPr>
+            <w:r>
+              <w:rPr>
+                <w:rFonts w:eastAsia="Arial" w:cs="Arial" w:ascii="Arial" w:hAnsi="Arial"/>
+                <w:color w:val="000000"/>
+                <w:kern w:val="0"/>
+                <w:sz w:val="20"/>
+                <w:szCs w:val="20"/>
+                <w:lang w:val="pl-PL" w:eastAsia="pl-PL" w:bidi="ar-SA"/>
+              </w:rPr>
+              <w:t>{/HasIncluded}</w:t>
+            </w:r>
+          </w:p>
+          <w:p>
+            <w:pPr>
+              <w:pStyle w:val="normal1"/>
+              <w:suppressAutoHyphens w:val="true"/>
+              <w:spacing w:lineRule="auto" w:line="278" w:before="0" w:after="0"/>
+              <w:jc w:val="left"/>
+              <w:rPr>
+                <w:rFonts w:ascii="Arial" w:hAnsi="Arial" w:eastAsia="Arial" w:cs="Arial"/>
+                <w:color w:val="000000"/>
+                <w:sz w:val="20"/>
+                <w:szCs w:val="20"/>
+              </w:rPr>
+            </w:pPr>
+            <w:r>
+              <w:rPr>
+                <w:rFonts w:eastAsia="Arial" w:cs="Arial" w:ascii="Arial" w:hAnsi="Arial"/>
+                <w:color w:val="000000"/>
+                <w:kern w:val="0"/>
+                <w:sz w:val="20"/>
+                <w:szCs w:val="20"/>
+                <w:lang w:val="pl-PL" w:eastAsia="pl-PL" w:bidi="ar-SA"/>
+              </w:rPr>
+              <w:t>{#IncludedServiceLines}</w:t>
+            </w:r>
+          </w:p>
+          <w:p>
+            <w:pPr>
+              <w:pStyle w:val="Normal"/>
+              <w:suppressAutoHyphens w:val="true"/>
+              <w:spacing w:lineRule="auto" w:line="278" w:before="0" w:after="0"/>
+              <w:jc w:val="left"/>
+              <w:rPr>
+                <w:rFonts w:ascii="Arial" w:hAnsi="Arial" w:eastAsia="Arial" w:cs="Arial"/>
+                <w:color w:val="000000"/>
+                <w:sz w:val="20"/>
+                <w:szCs w:val="20"/>
+              </w:rPr>
+            </w:pPr>
+            <w:r>
+              <w:rPr>
+                <w:rFonts w:eastAsia="Arial" w:cs="Arial" w:ascii="Arial" w:hAnsi="Arial"/>
+                <w:color w:val="000000"/>
                 <w:kern w:val="0"/>
                 <w:sz w:val="20"/>
                 <w:szCs w:val="20"/>
@@ -1223,194 +1362,22 @@
               <w:t>{ServiceLine}</w:t>
             </w:r>
           </w:p>
-          <w:p wp14:textId="77777777">
+          <w:p>
             <w:pPr>
               <w:pStyle w:val="Normal"/>
               <w:suppressAutoHyphens w:val="true"/>
-              <w:spacing w:before="0" w:after="0" w:line="278" w:lineRule="auto"/>
+              <w:spacing w:lineRule="auto" w:line="278" w:before="0" w:after="0"/>
               <w:jc w:val="left"/>
               <w:rPr>
                 <w:rFonts w:ascii="Arial" w:hAnsi="Arial" w:eastAsia="Arial" w:cs="Arial"/>
                 <w:color w:val="000000"/>
                 <w:sz w:val="20"/>
-                <w:szCs w:val="20"/>
-              </w:rPr>
-            </w:pPr>
-            <w:r>
-              <w:rPr>
-                <w:rFonts w:ascii="Arial" w:hAnsi="Arial" w:eastAsia="Arial" w:cs="Arial"/>
-                <w:color w:val="000000"/>
-                <w:kern w:val="0"/>
-                <w:sz w:val="20"/>
-                <w:szCs w:val="20"/>
-                <w:lang w:val="pl-PL" w:eastAsia="pl-PL" w:bidi="ar-SA"/>
-              </w:rPr>
-              <w:t>{/PrimaryServiceLines}</w:t>
-            </w:r>
-          </w:p>
-          <w:p wp14:textId="77777777">
-            <w:pPr>
-              <w:pStyle w:val="normal1"/>
-              <w:suppressAutoHyphens w:val="true"/>
-              <w:spacing w:before="0" w:after="0" w:line="278" w:lineRule="auto"/>
-              <w:jc w:val="left"/>
-              <w:rPr>
-                <w:rFonts w:ascii="Arial" w:hAnsi="Arial" w:eastAsia="Arial" w:cs="Arial"/>
-                <w:color w:val="000000"/>
-                <w:sz w:val="20"/>
-                <w:szCs w:val="20"/>
-              </w:rPr>
-            </w:pPr>
-            <w:r>
-              <w:rPr>
-                <w:rFonts w:ascii="Arial" w:hAnsi="Arial" w:eastAsia="Arial" w:cs="Arial"/>
-                <w:color w:val="000000"/>
-                <w:sz w:val="20"/>
-                <w:szCs w:val="20"/>
-              </w:rPr>
-            </w:r>
-          </w:p>
-          <w:p wp14:textId="77777777">
-            <w:pPr>
-              <w:pStyle w:val="normal1"/>
-              <w:suppressAutoHyphens w:val="true"/>
-              <w:spacing w:before="0" w:after="0" w:line="278" w:lineRule="auto"/>
-              <w:jc w:val="left"/>
-              <w:rPr>
-                <w:rFonts w:ascii="Arial" w:hAnsi="Arial" w:eastAsia="Arial" w:cs="Arial"/>
-                <w:color w:val="000000"/>
-                <w:sz w:val="20"/>
-                <w:szCs w:val="20"/>
-              </w:rPr>
-            </w:pPr>
-            <w:r>
-              <w:rPr>
-                <w:rFonts w:ascii="Arial" w:hAnsi="Arial" w:eastAsia="Arial" w:cs="Arial"/>
-                <w:color w:val="000000"/>
-                <w:kern w:val="0"/>
-                <w:sz w:val="20"/>
-                <w:szCs w:val="20"/>
-                <w:lang w:val="pl-PL" w:eastAsia="pl-PL" w:bidi="ar-SA"/>
-              </w:rPr>
-              <w:t>{#HasIncluded}</w:t>
-            </w:r>
-          </w:p>
-          <w:p wp14:textId="77777777">
-            <w:pPr>
-              <w:pStyle w:val="Normal"/>
-              <w:suppressAutoHyphens w:val="true"/>
-              <w:spacing w:before="0" w:after="0" w:line="278" w:lineRule="auto"/>
-              <w:jc w:val="left"/>
-              <w:rPr>
-                <w:rFonts w:ascii="Arial" w:hAnsi="Arial" w:eastAsia="Arial" w:cs="Arial"/>
-                <w:color w:val="000000"/>
-                <w:sz w:val="20"/>
-                <w:szCs w:val="20"/>
-              </w:rPr>
-            </w:pPr>
-            <w:r>
-              <w:rPr>
-                <w:rFonts w:ascii="Arial" w:hAnsi="Arial" w:eastAsia="Arial" w:cs="Arial"/>
-                <w:color w:val="000000"/>
-                <w:kern w:val="0"/>
-                <w:sz w:val="20"/>
-                <w:szCs w:val="20"/>
-                <w:lang w:val="pl-PL" w:eastAsia="pl-PL" w:bidi="ar-SA"/>
-              </w:rPr>
-              <w:t>Enthält je Einheit</w:t>
-            </w:r>
-          </w:p>
-          <w:p wp14:textId="77777777">
-            <w:pPr>
-              <w:pStyle w:val="Normal"/>
-              <w:suppressAutoHyphens w:val="true"/>
-              <w:spacing w:before="0" w:after="0" w:line="278" w:lineRule="auto"/>
-              <w:jc w:val="left"/>
-              <w:rPr>
-                <w:rFonts w:ascii="Arial" w:hAnsi="Arial" w:eastAsia="Arial" w:cs="Arial"/>
-                <w:color w:val="000000"/>
-                <w:sz w:val="20"/>
-                <w:szCs w:val="20"/>
-              </w:rPr>
-            </w:pPr>
-            <w:r>
-              <w:rPr>
-                <w:rFonts w:ascii="Arial" w:hAnsi="Arial" w:eastAsia="Arial" w:cs="Arial"/>
-                <w:color w:val="000000"/>
-                <w:kern w:val="0"/>
-                <w:sz w:val="20"/>
-                <w:szCs w:val="20"/>
-                <w:lang w:val="pl-PL" w:eastAsia="pl-PL" w:bidi="ar-SA"/>
-              </w:rPr>
-              <w:t>{/HasIncluded}</w:t>
-            </w:r>
-          </w:p>
-          <w:p wp14:textId="77777777">
-            <w:pPr>
-              <w:pStyle w:val="normal1"/>
-              <w:suppressAutoHyphens w:val="true"/>
-              <w:spacing w:before="0" w:after="0" w:line="278" w:lineRule="auto"/>
-              <w:jc w:val="left"/>
-              <w:rPr>
-                <w:rFonts w:ascii="Arial" w:hAnsi="Arial" w:eastAsia="Arial" w:cs="Arial"/>
-                <w:color w:val="000000"/>
-                <w:sz w:val="20"/>
-                <w:szCs w:val="20"/>
-              </w:rPr>
-            </w:pPr>
-            <w:r>
-              <w:rPr>
-                <w:rFonts w:ascii="Arial" w:hAnsi="Arial" w:eastAsia="Arial" w:cs="Arial"/>
-                <w:color w:val="000000"/>
-                <w:kern w:val="0"/>
-                <w:sz w:val="20"/>
-                <w:szCs w:val="20"/>
-                <w:lang w:val="pl-PL" w:eastAsia="pl-PL" w:bidi="ar-SA"/>
-              </w:rPr>
-              <w:t>{#IncludedServiceLines}</w:t>
-            </w:r>
-          </w:p>
-          <w:p wp14:textId="77777777">
-            <w:pPr>
-              <w:pStyle w:val="Normal"/>
-              <w:suppressAutoHyphens w:val="true"/>
-              <w:spacing w:before="0" w:after="0" w:line="278" w:lineRule="auto"/>
-              <w:jc w:val="left"/>
-              <w:rPr>
-                <w:rFonts w:ascii="Arial" w:hAnsi="Arial" w:eastAsia="Arial" w:cs="Arial"/>
-                <w:color w:val="000000"/>
-                <w:sz w:val="20"/>
-                <w:szCs w:val="20"/>
-              </w:rPr>
-            </w:pPr>
-            <w:r>
-              <w:rPr>
-                <w:rFonts w:ascii="Arial" w:hAnsi="Arial" w:eastAsia="Arial" w:cs="Arial"/>
-                <w:color w:val="000000"/>
-                <w:kern w:val="0"/>
-                <w:sz w:val="20"/>
-                <w:szCs w:val="20"/>
-                <w:lang w:val="pl-PL" w:eastAsia="pl-PL" w:bidi="ar-SA"/>
-              </w:rPr>
-              <w:t>{ServiceLine}</w:t>
-            </w:r>
-          </w:p>
-          <w:p wp14:textId="77777777">
-            <w:pPr>
-              <w:pStyle w:val="Normal"/>
-              <w:suppressAutoHyphens w:val="true"/>
-              <w:spacing w:before="0" w:after="0" w:line="278" w:lineRule="auto"/>
-              <w:jc w:val="left"/>
-              <w:rPr>
-                <w:rFonts w:ascii="Arial" w:hAnsi="Arial" w:eastAsia="Arial" w:cs="Arial"/>
-                <w:color w:val="000000"/>
-                <w:sz w:val="20"/>
                 <w:szCs w:val="18"/>
               </w:rPr>
             </w:pPr>
             <w:r>
               <w:rPr>
-                <w:rFonts w:ascii="Arial" w:hAnsi="Arial" w:eastAsia="Arial" w:cs="Arial"/>
+                <w:rFonts w:eastAsia="Arial" w:cs="Arial" w:ascii="Arial" w:hAnsi="Arial"/>
                 <w:color w:val="000000"/>
                 <w:kern w:val="0"/>
                 <w:sz w:val="20"/>
@@ -1425,17 +1392,17 @@
           <w:tcPr>
             <w:tcW w:w="1440" w:type="dxa"/>
             <w:tcBorders/>
-            <w:shd w:val="clear" w:color="auto" w:fill="FFFFFF"/>
+            <w:shd w:color="auto" w:fill="FFFFFF" w:val="clear"/>
             <w:tcMar>
               <w:left w:w="56" w:type="dxa"/>
               <w:right w:w="56" w:type="dxa"/>
             </w:tcMar>
           </w:tcPr>
-          <w:p wp14:textId="77777777">
+          <w:p>
             <w:pPr>
               <w:pStyle w:val="normal1"/>
               <w:suppressAutoHyphens w:val="true"/>
-              <w:spacing w:before="0" w:after="0" w:line="278" w:lineRule="auto"/>
+              <w:spacing w:lineRule="auto" w:line="278" w:before="0" w:after="0"/>
               <w:ind w:right="314"/>
               <w:jc w:val="center"/>
               <w:rPr>
@@ -1445,7 +1412,7 @@
             </w:pPr>
             <w:r>
               <w:rPr>
-                <w:rFonts w:ascii="Arial" w:hAnsi="Arial" w:eastAsia="Arial" w:cs="Arial"/>
+                <w:rFonts w:eastAsia="Arial" w:cs="Arial" w:ascii="Arial" w:hAnsi="Arial"/>
                 <w:color w:val="000000"/>
               </w:rPr>
             </w:r>
@@ -1453,20 +1420,20 @@
         </w:tc>
         <w:tc>
           <w:tcPr>
-            <w:tcW w:w="1247" w:type="dxa"/>
+            <w:tcW w:w="1248" w:type="dxa"/>
             <w:tcBorders/>
-            <w:shd w:val="clear" w:color="auto" w:fill="FFFFFF"/>
+            <w:shd w:color="auto" w:fill="FFFFFF" w:val="clear"/>
             <w:tcMar>
               <w:left w:w="56" w:type="dxa"/>
               <w:right w:w="56" w:type="dxa"/>
             </w:tcMar>
             <w:vAlign w:val="center"/>
           </w:tcPr>
-          <w:p wp14:textId="77777777">
+          <w:p>
             <w:pPr>
               <w:pStyle w:val="normal1"/>
               <w:suppressAutoHyphens w:val="true"/>
-              <w:spacing w:before="0" w:after="0" w:line="278" w:lineRule="auto"/>
+              <w:spacing w:lineRule="auto" w:line="278" w:before="0" w:after="0"/>
               <w:ind w:right="314"/>
               <w:jc w:val="center"/>
               <w:rPr>
@@ -1476,7 +1443,7 @@
             </w:pPr>
             <w:r>
               <w:rPr>
-                <w:rFonts w:ascii="Arial" w:hAnsi="Arial" w:eastAsia="Arial" w:cs="Arial"/>
+                <w:rFonts w:eastAsia="Arial" w:cs="Arial" w:ascii="Arial" w:hAnsi="Arial"/>
                 <w:color w:val="000000"/>
               </w:rPr>
             </w:r>
@@ -1484,13 +1451,13 @@
         </w:tc>
       </w:tr>
     </w:tbl>
-    <w:p xmlns:wp14="http://schemas.microsoft.com/office/word/2010/wordml" wp14:textId="77777777">
+    <w:p>
       <w:pPr>
         <w:pStyle w:val="normal1"/>
         <w:tabs>
           <w:tab w:val="clear" w:pos="720"/>
-          <w:tab w:val="left" w:leader="none" w:pos="750"/>
-          <w:tab w:val="left" w:leader="none" w:pos="1416"/>
+          <w:tab w:val="left" w:pos="750" w:leader="none"/>
+          <w:tab w:val="left" w:pos="1416" w:leader="none"/>
         </w:tabs>
         <w:spacing w:before="121" w:after="0"/>
         <w:rPr>
@@ -1502,7 +1469,7 @@
       </w:pPr>
       <w:r>
         <w:rPr>
-          <w:rFonts w:ascii="Arial" w:hAnsi="Arial" w:eastAsia="Arial" w:cs="Arial"/>
+          <w:rFonts w:eastAsia="Arial" w:cs="Arial" w:ascii="Arial" w:hAnsi="Arial"/>
           <w:color w:val="070707"/>
           <w:sz w:val="20"/>
           <w:szCs w:val="20"/>
@@ -1522,16 +1489,16 @@
           <w:bottom w:w="0" w:type="dxa"/>
           <w:right w:w="56" w:type="dxa"/>
         </w:tblCellMar>
-        <w:tblLook w:val="04a0" w:firstRow="1" w:lastRow="0" w:firstColumn="1" w:lastColumn="0" w:noHBand="0" w:noVBand="1"/>
+        <w:tblLook w:val="04a0" w:noVBand="1" w:noHBand="0" w:lastColumn="0" w:firstColumn="1" w:lastRow="0" w:firstRow="1"/>
       </w:tblPr>
       <w:tblGrid>
         <w:gridCol w:w="510"/>
         <w:gridCol w:w="885"/>
-        <w:gridCol w:w="5863"/>
+        <w:gridCol w:w="5862"/>
         <w:gridCol w:w="1440"/>
-        <w:gridCol w:w="1247"/>
+        <w:gridCol w:w="1248"/>
       </w:tblGrid>
-      <w:tr xmlns:wp14="http://schemas.microsoft.com/office/word/2010/wordml" wp14:textId="77777777">
+      <w:tr>
         <w:trPr>
           <w:trHeight w:val="379" w:hRule="atLeast"/>
         </w:trPr>
@@ -1539,9 +1506,9 @@
           <w:tcPr>
             <w:tcW w:w="510" w:type="dxa"/>
             <w:tcBorders/>
-            <w:shd w:val="clear" w:color="auto" w:fill="FFFFFF"/>
+            <w:shd w:color="auto" w:fill="FFFFFF" w:val="clear"/>
           </w:tcPr>
-          <w:p wp14:textId="77777777">
+          <w:p>
             <w:pPr>
               <w:pStyle w:val="normal1"/>
               <w:suppressAutoHyphens w:val="true"/>
@@ -1554,7 +1521,7 @@
             </w:pPr>
             <w:r>
               <w:rPr>
-                <w:rFonts w:ascii="Arial" w:hAnsi="Arial" w:eastAsia="Arial" w:cs="Arial"/>
+                <w:rFonts w:eastAsia="Arial" w:cs="Arial" w:ascii="Arial" w:hAnsi="Arial"/>
                 <w:color w:val="070707"/>
                 <w:kern w:val="0"/>
                 <w:sz w:val="18"/>
@@ -1569,9 +1536,9 @@
           <w:tcPr>
             <w:tcW w:w="885" w:type="dxa"/>
             <w:tcBorders/>
-            <w:shd w:val="clear" w:color="auto" w:fill="FFFFFF"/>
+            <w:shd w:color="auto" w:fill="FFFFFF" w:val="clear"/>
           </w:tcPr>
-          <w:p wp14:textId="77777777">
+          <w:p>
             <w:pPr>
               <w:pStyle w:val="Normal"/>
               <w:suppressAutoHyphens w:val="true"/>
@@ -1585,7 +1552,7 @@
             </w:pPr>
             <w:r>
               <w:rPr>
-                <w:rFonts w:ascii="Arial" w:hAnsi="Arial" w:eastAsia="Arial" w:cs="Arial"/>
+                <w:rFonts w:eastAsia="Arial" w:cs="Arial" w:ascii="Arial" w:hAnsi="Arial"/>
                 <w:color w:val="070707"/>
                 <w:kern w:val="0"/>
                 <w:sz w:val="18"/>
@@ -1598,17 +1565,17 @@
         </w:tc>
         <w:tc>
           <w:tcPr>
-            <w:tcW w:w="5863" w:type="dxa"/>
+            <w:tcW w:w="5862" w:type="dxa"/>
             <w:tcBorders/>
-            <w:shd w:val="clear" w:color="auto" w:fill="FFFFFF"/>
+            <w:shd w:color="auto" w:fill="FFFFFF" w:val="clear"/>
           </w:tcPr>
-          <w:p wp14:textId="77777777">
+          <w:p>
             <w:pPr>
               <w:pStyle w:val="Normal"/>
               <w:tabs>
                 <w:tab w:val="clear" w:pos="720"/>
-                <w:tab w:val="left" w:leader="none" w:pos="6739"/>
-                <w:tab w:val="left" w:leader="none" w:pos="6907"/>
+                <w:tab w:val="left" w:pos="6739" w:leader="none"/>
+                <w:tab w:val="left" w:pos="6907" w:leader="none"/>
               </w:tabs>
               <w:suppressAutoHyphens w:val="true"/>
               <w:spacing w:before="10" w:after="10"/>
@@ -1622,7 +1589,7 @@
             </w:pPr>
             <w:r>
               <w:rPr>
-                <w:rFonts w:ascii="Arial" w:hAnsi="Arial" w:eastAsia="Arial" w:cs="Arial"/>
+                <w:rFonts w:eastAsia="Arial" w:cs="Arial" w:ascii="Arial" w:hAnsi="Arial"/>
                 <w:b/>
                 <w:bCs/>
                 <w:color w:val="000000"/>
@@ -1639,9 +1606,9 @@
           <w:tcPr>
             <w:tcW w:w="1440" w:type="dxa"/>
             <w:tcBorders/>
-            <w:shd w:val="clear" w:color="auto" w:fill="FFFFFF"/>
+            <w:shd w:color="auto" w:fill="FFFFFF" w:val="clear"/>
           </w:tcPr>
-          <w:p wp14:textId="77777777">
+          <w:p>
             <w:pPr>
               <w:pStyle w:val="Normal"/>
               <w:suppressAutoHyphens w:val="true"/>
@@ -1656,7 +1623,7 @@
             </w:pPr>
             <w:r>
               <w:rPr>
-                <w:rFonts w:ascii="Arial" w:hAnsi="Arial" w:eastAsia="Arial" w:cs="Arial"/>
+                <w:rFonts w:eastAsia="Arial" w:cs="Arial" w:ascii="Arial" w:hAnsi="Arial"/>
                 <w:color w:val="000000"/>
                 <w:kern w:val="0"/>
                 <w:sz w:val="20"/>
@@ -1669,15 +1636,15 @@
         </w:tc>
         <w:tc>
           <w:tcPr>
-            <w:tcW w:w="1247" w:type="dxa"/>
+            <w:tcW w:w="1248" w:type="dxa"/>
             <w:tcBorders/>
-            <w:shd w:val="clear" w:color="auto" w:fill="FFFFFF"/>
+            <w:shd w:color="auto" w:fill="FFFFFF" w:val="clear"/>
             <w:tcMar>
               <w:left w:w="0" w:type="dxa"/>
               <w:right w:w="0" w:type="dxa"/>
             </w:tcMar>
           </w:tcPr>
-          <w:p wp14:textId="77777777">
+          <w:p>
             <w:pPr>
               <w:pStyle w:val="Normal"/>
               <w:suppressAutoHyphens w:val="true"/>
@@ -1691,7 +1658,7 @@
             </w:pPr>
             <w:r>
               <w:rPr>
-                <w:rFonts w:ascii="Arial" w:hAnsi="Arial" w:eastAsia="Arial" w:cs="Arial"/>
+                <w:rFonts w:eastAsia="Arial" w:cs="Arial" w:ascii="Arial" w:hAnsi="Arial"/>
                 <w:kern w:val="0"/>
                 <w:sz w:val="20"/>
                 <w:szCs w:val="20"/>
@@ -1702,7 +1669,7 @@
           </w:p>
         </w:tc>
       </w:tr>
-      <w:tr xmlns:wp14="http://schemas.microsoft.com/office/word/2010/wordml" wp14:textId="77777777">
+      <w:tr>
         <w:trPr>
           <w:trHeight w:val="1" w:hRule="atLeast"/>
         </w:trPr>
@@ -1710,9 +1677,9 @@
           <w:tcPr>
             <w:tcW w:w="510" w:type="dxa"/>
             <w:tcBorders/>
-            <w:shd w:val="clear" w:color="auto" w:fill="FFFFFF"/>
+            <w:shd w:color="auto" w:fill="FFFFFF" w:val="clear"/>
           </w:tcPr>
-          <w:p wp14:textId="77777777">
+          <w:p>
             <w:pPr>
               <w:pStyle w:val="normal1"/>
               <w:suppressAutoHyphens w:val="true"/>
@@ -1725,7 +1692,7 @@
             </w:pPr>
             <w:r>
               <w:rPr>
-                <w:rFonts w:ascii="Arial" w:hAnsi="Arial" w:eastAsia="Arial" w:cs="Arial"/>
+                <w:rFonts w:eastAsia="Arial" w:cs="Arial" w:ascii="Arial" w:hAnsi="Arial"/>
                 <w:color w:val="000000"/>
               </w:rPr>
             </w:r>
@@ -1735,9 +1702,9 @@
           <w:tcPr>
             <w:tcW w:w="885" w:type="dxa"/>
             <w:tcBorders/>
-            <w:shd w:val="clear" w:color="auto" w:fill="FFFFFF"/>
+            <w:shd w:color="auto" w:fill="FFFFFF" w:val="clear"/>
           </w:tcPr>
-          <w:p wp14:textId="77777777">
+          <w:p>
             <w:pPr>
               <w:pStyle w:val="normal1"/>
               <w:suppressAutoHyphens w:val="true"/>
@@ -1750,7 +1717,7 @@
             </w:pPr>
             <w:r>
               <w:rPr>
-                <w:rFonts w:ascii="Arial" w:hAnsi="Arial" w:eastAsia="Arial" w:cs="Arial"/>
+                <w:rFonts w:eastAsia="Arial" w:cs="Arial" w:ascii="Arial" w:hAnsi="Arial"/>
                 <w:color w:val="000000"/>
               </w:rPr>
             </w:r>
@@ -1758,26 +1725,24 @@
         </w:tc>
         <w:tc>
           <w:tcPr>
-            <w:tcW w:w="5863" w:type="dxa"/>
+            <w:tcW w:w="5862" w:type="dxa"/>
             <w:tcBorders/>
-            <w:shd w:val="clear" w:color="auto" w:fill="FFFFFF"/>
+            <w:shd w:color="auto" w:fill="FFFFFF" w:val="clear"/>
           </w:tcPr>
-          <w:p wp14:textId="77777777">
+          <w:p>
             <w:pPr>
               <w:pStyle w:val="normal1"/>
               <w:suppressAutoHyphens w:val="true"/>
-              <w:spacing w:before="0" w:after="0" w:line="278" w:lineRule="auto"/>
+              <w:spacing w:lineRule="auto" w:line="278" w:before="0" w:after="0"/>
               <w:jc w:val="left"/>
               <w:rPr>
-                <w:rFonts w:ascii="Arial" w:hAnsi="Arial" w:eastAsia="Arial" w:cs="Arial"/>
-                <w:color w:val="000000"/>
-                <w:sz w:val="20"/>
-                <w:szCs w:val="20"/>
-              </w:rPr>
-            </w:pPr>
-            <w:r>
-              <w:rPr>
-                <w:rFonts w:ascii="Arial" w:hAnsi="Arial" w:eastAsia="Arial" w:cs="Arial"/>
+                <w:sz w:val="20"/>
+                <w:szCs w:val="20"/>
+              </w:rPr>
+            </w:pPr>
+            <w:r>
+              <w:rPr>
+                <w:rFonts w:eastAsia="Arial" w:cs="Arial" w:ascii="Arial" w:hAnsi="Arial"/>
                 <w:color w:val="000000"/>
                 <w:kern w:val="0"/>
                 <w:sz w:val="20"/>
@@ -1787,31 +1752,38 @@
               <w:t>{#MaterialsLines}</w:t>
             </w:r>
           </w:p>
-          <w:p wp14:textId="77777777">
-            <w:r>
-              <w:t xml:space="preserve">{#IsSub}</w:t>
-            </w:r>
-          </w:p>
-          <w:p wp14:textId="77777777">
+          <w:p>
             <w:pPr>
               <w:pStyle w:val="Normal"/>
-              <w:suppressAutoHyphens w:val="true"/>
-              <w:spacing w:before="120" w:after="0" w:line="278" w:lineRule="auto"/>
+              <w:rPr>
+                <w:sz w:val="20"/>
+                <w:szCs w:val="20"/>
+              </w:rPr>
+            </w:pPr>
+            <w:r>
+              <w:rPr>
+                <w:sz w:val="20"/>
+                <w:szCs w:val="20"/>
+              </w:rPr>
+              <w:t>{#IsSub}</w:t>
+            </w:r>
+          </w:p>
+          <w:p>
+            <w:pPr>
+              <w:pStyle w:val="Normal"/>
+              <w:suppressAutoHyphens w:val="true"/>
+              <w:spacing w:lineRule="auto" w:line="278" w:before="120" w:after="0"/>
               <w:jc w:val="left"/>
               <w:rPr>
+                <w:sz w:val="20"/>
+                <w:szCs w:val="20"/>
+              </w:rPr>
+            </w:pPr>
+            <w:r>
+              <w:rPr>
+                <w:rFonts w:eastAsia="Arial" w:cs="Arial" w:ascii="Arial" w:hAnsi="Arial"/>
                 <w:b/>
                 <w:bCs/>
-                <w:rFonts w:ascii="Arial" w:hAnsi="Arial" w:eastAsia="Arial" w:cs="Arial"/>
-                <w:color w:val="000000"/>
-                <w:sz w:val="20"/>
-                <w:szCs w:val="20"/>
-              </w:rPr>
-            </w:pPr>
-            <w:r>
-              <w:rPr>
-                <w:b/>
-                <w:bCs/>
-                <w:rFonts w:ascii="Arial" w:hAnsi="Arial" w:eastAsia="Arial" w:cs="Arial"/>
                 <w:color w:val="000000"/>
                 <w:kern w:val="0"/>
                 <w:sz w:val="20"/>
@@ -1821,32 +1793,52 @@
               <w:t>{MaterialLine}</w:t>
             </w:r>
           </w:p>
-          <w:p wp14:textId="77777777">
-            <w:r>
-              <w:t xml:space="preserve">{/IsSub}</w:t>
-            </w:r>
-          </w:p>
-          <w:p wp14:textId="77777777">
-            <w:r>
-              <w:t xml:space="preserve">{^IsSub}</w:t>
-            </w:r>
-          </w:p>
-          <w:p wp14:textId="77777777">
+          <w:p>
             <w:pPr>
               <w:pStyle w:val="Normal"/>
-              <w:suppressAutoHyphens w:val="true"/>
-              <w:spacing w:before="0" w:after="0" w:line="278" w:lineRule="auto"/>
+              <w:rPr>
+                <w:sz w:val="20"/>
+                <w:szCs w:val="20"/>
+              </w:rPr>
+            </w:pPr>
+            <w:r>
+              <w:rPr>
+                <w:sz w:val="20"/>
+                <w:szCs w:val="20"/>
+              </w:rPr>
+              <w:t>{/IsSub}</w:t>
+            </w:r>
+          </w:p>
+          <w:p>
+            <w:pPr>
+              <w:pStyle w:val="Normal"/>
+              <w:rPr>
+                <w:sz w:val="20"/>
+                <w:szCs w:val="20"/>
+              </w:rPr>
+            </w:pPr>
+            <w:r>
+              <w:rPr>
+                <w:sz w:val="20"/>
+                <w:szCs w:val="20"/>
+              </w:rPr>
+              <w:t>{^IsSub}</w:t>
+            </w:r>
+          </w:p>
+          <w:p>
+            <w:pPr>
+              <w:pStyle w:val="Normal"/>
+              <w:suppressAutoHyphens w:val="true"/>
+              <w:spacing w:lineRule="auto" w:line="278" w:before="0" w:after="0"/>
               <w:jc w:val="left"/>
               <w:rPr>
-                <w:rFonts w:ascii="Arial" w:hAnsi="Arial" w:eastAsia="Arial" w:cs="Arial"/>
-                <w:color w:val="000000"/>
-                <w:sz w:val="20"/>
-                <w:szCs w:val="20"/>
-              </w:rPr>
-            </w:pPr>
-            <w:r>
-              <w:rPr>
-                <w:rFonts w:ascii="Arial" w:hAnsi="Arial" w:eastAsia="Arial" w:cs="Arial"/>
+                <w:sz w:val="20"/>
+                <w:szCs w:val="20"/>
+              </w:rPr>
+            </w:pPr>
+            <w:r>
+              <w:rPr>
+                <w:rFonts w:eastAsia="Arial" w:cs="Arial" w:ascii="Arial" w:hAnsi="Arial"/>
                 <w:color w:val="000000"/>
                 <w:kern w:val="0"/>
                 <w:sz w:val="20"/>
@@ -1856,27 +1848,36 @@
               <w:t>{MaterialLine}</w:t>
             </w:r>
           </w:p>
-          <w:p wp14:textId="77777777">
-            <w:r>
-              <w:t xml:space="preserve">{/IsSub}</w:t>
-            </w:r>
-          </w:p>
-          <w:p wp14:textId="77777777">
+          <w:p>
             <w:pPr>
               <w:pStyle w:val="Normal"/>
-              <w:suppressAutoHyphens w:val="true"/>
-              <w:spacing w:before="0" w:after="0" w:line="278" w:lineRule="auto"/>
+              <w:rPr>
+                <w:sz w:val="20"/>
+                <w:szCs w:val="20"/>
+              </w:rPr>
+            </w:pPr>
+            <w:r>
+              <w:rPr>
+                <w:sz w:val="20"/>
+                <w:szCs w:val="20"/>
+              </w:rPr>
+              <w:t>{/IsSub}</w:t>
+            </w:r>
+          </w:p>
+          <w:p>
+            <w:pPr>
+              <w:pStyle w:val="Normal"/>
+              <w:suppressAutoHyphens w:val="true"/>
+              <w:spacing w:lineRule="auto" w:line="278" w:before="0" w:after="0"/>
               <w:jc w:val="left"/>
               <w:rPr>
-                <w:rFonts w:ascii="Arial" w:hAnsi="Arial" w:eastAsia="Arial" w:cs="Arial"/>
-                <w:color w:val="000000"/>
-                <w:sz w:val="20"/>
-                <w:szCs w:val="18"/>
-              </w:rPr>
-            </w:pPr>
-            <w:r>
-              <w:rPr>
-                <w:rFonts w:ascii="Arial" w:hAnsi="Arial" w:eastAsia="Arial" w:cs="Arial"/>
+                <w:sz w:val="20"/>
+                <w:szCs w:val="20"/>
+              </w:rPr>
+            </w:pPr>
+            <w:r>
+              <w:rPr>
+                <w:rFonts w:eastAsia="Arial" w:cs="Arial" w:ascii="Arial" w:hAnsi="Arial"/>
                 <w:color w:val="000000"/>
                 <w:kern w:val="0"/>
                 <w:sz w:val="20"/>
@@ -1891,13 +1892,13 @@
           <w:tcPr>
             <w:tcW w:w="1440" w:type="dxa"/>
             <w:tcBorders/>
-            <w:shd w:val="clear" w:color="auto" w:fill="FFFFFF"/>
+            <w:shd w:color="auto" w:fill="FFFFFF" w:val="clear"/>
           </w:tcPr>
-          <w:p wp14:textId="77777777">
+          <w:p>
             <w:pPr>
               <w:pStyle w:val="normal1"/>
               <w:suppressAutoHyphens w:val="true"/>
-              <w:spacing w:before="0" w:after="0" w:line="278" w:lineRule="auto"/>
+              <w:spacing w:lineRule="auto" w:line="278" w:before="0" w:after="0"/>
               <w:ind w:right="314"/>
               <w:jc w:val="center"/>
               <w:rPr>
@@ -1907,7 +1908,7 @@
             </w:pPr>
             <w:r>
               <w:rPr>
-                <w:rFonts w:ascii="Arial" w:hAnsi="Arial" w:eastAsia="Arial" w:cs="Arial"/>
+                <w:rFonts w:eastAsia="Arial" w:cs="Arial" w:ascii="Arial" w:hAnsi="Arial"/>
                 <w:color w:val="000000"/>
               </w:rPr>
             </w:r>
@@ -1915,16 +1916,16 @@
         </w:tc>
         <w:tc>
           <w:tcPr>
-            <w:tcW w:w="1247" w:type="dxa"/>
+            <w:tcW w:w="1248" w:type="dxa"/>
             <w:tcBorders/>
-            <w:shd w:val="clear" w:color="auto" w:fill="FFFFFF"/>
+            <w:shd w:color="auto" w:fill="FFFFFF" w:val="clear"/>
             <w:vAlign w:val="center"/>
           </w:tcPr>
-          <w:p wp14:textId="77777777">
+          <w:p>
             <w:pPr>
               <w:pStyle w:val="normal1"/>
               <w:suppressAutoHyphens w:val="true"/>
-              <w:spacing w:before="0" w:after="0" w:line="278" w:lineRule="auto"/>
+              <w:spacing w:lineRule="auto" w:line="278" w:before="0" w:after="0"/>
               <w:ind w:right="314"/>
               <w:jc w:val="center"/>
               <w:rPr>
@@ -1934,14 +1935,14 @@
             </w:pPr>
             <w:r>
               <w:rPr>
-                <w:rFonts w:ascii="Arial" w:hAnsi="Arial" w:eastAsia="Arial" w:cs="Arial"/>
+                <w:rFonts w:eastAsia="Arial" w:cs="Arial" w:ascii="Arial" w:hAnsi="Arial"/>
                 <w:color w:val="000000"/>
               </w:rPr>
             </w:r>
           </w:p>
         </w:tc>
       </w:tr>
-      <w:tr xmlns:wp14="http://schemas.microsoft.com/office/word/2010/wordml" wp14:textId="77777777">
+      <w:tr>
         <w:trPr>
           <w:trHeight w:val="1" w:hRule="atLeast"/>
         </w:trPr>
@@ -1949,13 +1950,13 @@
           <w:tcPr>
             <w:tcW w:w="510" w:type="dxa"/>
             <w:tcBorders/>
-            <w:shd w:val="clear" w:color="auto" w:fill="FFFFFF"/>
+            <w:shd w:color="auto" w:fill="FFFFFF" w:val="clear"/>
           </w:tcPr>
-          <w:p wp14:textId="77777777">
+          <w:p>
             <w:pPr>
               <w:pStyle w:val="Normal"/>
               <w:suppressAutoHyphens w:val="true"/>
-              <w:spacing w:before="0" w:after="0" w:line="278" w:lineRule="auto"/>
+              <w:spacing w:lineRule="auto" w:line="278" w:before="0" w:after="0"/>
               <w:ind w:right="-26"/>
               <w:jc w:val="center"/>
               <w:rPr>
@@ -1967,7 +1968,7 @@
             </w:pPr>
             <w:r>
               <w:rPr>
-                <w:rFonts w:ascii="Arial" w:hAnsi="Arial" w:eastAsia="Arial" w:cs="Arial"/>
+                <w:rFonts w:eastAsia="Arial" w:cs="Arial" w:ascii="Arial" w:hAnsi="Arial"/>
                 <w:color w:val="000000"/>
                 <w:kern w:val="0"/>
                 <w:sz w:val="18"/>
@@ -1982,13 +1983,13 @@
           <w:tcPr>
             <w:tcW w:w="885" w:type="dxa"/>
             <w:tcBorders/>
-            <w:shd w:val="clear" w:color="auto" w:fill="FFFFFF"/>
+            <w:shd w:color="auto" w:fill="FFFFFF" w:val="clear"/>
           </w:tcPr>
-          <w:p wp14:textId="77777777">
+          <w:p>
             <w:pPr>
               <w:pStyle w:val="Normal"/>
               <w:suppressAutoHyphens w:val="true"/>
-              <w:spacing w:before="0" w:after="0" w:line="278" w:lineRule="auto"/>
+              <w:spacing w:lineRule="auto" w:line="278" w:before="0" w:after="0"/>
               <w:jc w:val="center"/>
               <w:rPr>
                 <w:rFonts w:ascii="Arial" w:hAnsi="Arial" w:eastAsia="Arial" w:cs="Arial"/>
@@ -1999,7 +2000,7 @@
             </w:pPr>
             <w:r>
               <w:rPr>
-                <w:rFonts w:ascii="Arial" w:hAnsi="Arial" w:eastAsia="Arial" w:cs="Arial"/>
+                <w:rFonts w:eastAsia="Arial" w:cs="Arial" w:ascii="Arial" w:hAnsi="Arial"/>
                 <w:color w:val="000000"/>
                 <w:kern w:val="0"/>
                 <w:sz w:val="18"/>
@@ -2012,15 +2013,15 @@
         </w:tc>
         <w:tc>
           <w:tcPr>
-            <w:tcW w:w="5863" w:type="dxa"/>
+            <w:tcW w:w="5862" w:type="dxa"/>
             <w:tcBorders/>
-            <w:shd w:val="clear" w:color="auto" w:fill="FFFFFF"/>
+            <w:shd w:color="auto" w:fill="FFFFFF" w:val="clear"/>
           </w:tcPr>
-          <w:p wp14:textId="77777777">
+          <w:p>
             <w:pPr>
               <w:pStyle w:val="Normal"/>
               <w:suppressAutoHyphens w:val="true"/>
-              <w:spacing w:before="0" w:after="0" w:line="278" w:lineRule="auto"/>
+              <w:spacing w:lineRule="auto" w:line="278" w:before="0" w:after="0"/>
               <w:jc w:val="left"/>
               <w:rPr>
                 <w:rFonts w:ascii="Arial" w:hAnsi="Arial" w:eastAsia="Arial" w:cs="Arial"/>
@@ -2033,7 +2034,7 @@
             </w:pPr>
             <w:r>
               <w:rPr>
-                <w:rFonts w:ascii="Arial" w:hAnsi="Arial" w:eastAsia="Arial" w:cs="Arial"/>
+                <w:rFonts w:eastAsia="Arial" w:cs="Arial" w:ascii="Arial" w:hAnsi="Arial"/>
                 <w:b/>
                 <w:bCs/>
                 <w:color w:val="000000"/>
@@ -2045,11 +2046,11 @@
               <w:t>{BonusLabel}</w:t>
             </w:r>
           </w:p>
-          <w:p wp14:textId="77777777">
+          <w:p>
             <w:pPr>
               <w:pStyle w:val="Normal"/>
               <w:suppressAutoHyphens w:val="true"/>
-              <w:spacing w:before="0" w:after="0" w:line="278" w:lineRule="auto"/>
+              <w:spacing w:lineRule="auto" w:line="278" w:before="0" w:after="0"/>
               <w:jc w:val="left"/>
               <w:rPr>
                 <w:rFonts w:ascii="Arial" w:hAnsi="Arial" w:eastAsia="Arial" w:cs="Arial"/>
@@ -2060,7 +2061,7 @@
             </w:pPr>
             <w:r>
               <w:rPr>
-                <w:rFonts w:ascii="Arial" w:hAnsi="Arial" w:eastAsia="Arial" w:cs="Arial"/>
+                <w:rFonts w:eastAsia="Arial" w:cs="Arial" w:ascii="Arial" w:hAnsi="Arial"/>
                 <w:color w:val="000000"/>
                 <w:kern w:val="0"/>
                 <w:sz w:val="20"/>
@@ -2075,13 +2076,13 @@
           <w:tcPr>
             <w:tcW w:w="1440" w:type="dxa"/>
             <w:tcBorders/>
-            <w:shd w:val="clear" w:color="auto" w:fill="FFFFFF"/>
+            <w:shd w:color="auto" w:fill="FFFFFF" w:val="clear"/>
           </w:tcPr>
-          <w:p wp14:textId="77777777">
+          <w:p>
             <w:pPr>
               <w:pStyle w:val="Normal"/>
               <w:suppressAutoHyphens w:val="true"/>
-              <w:spacing w:before="0" w:after="0" w:line="278" w:lineRule="auto"/>
+              <w:spacing w:lineRule="auto" w:line="278" w:before="0" w:after="0"/>
               <w:jc w:val="center"/>
               <w:rPr>
                 <w:rFonts w:ascii="Arial" w:hAnsi="Arial" w:eastAsia="Arial" w:cs="Arial"/>
@@ -2090,7 +2091,7 @@
             </w:pPr>
             <w:r>
               <w:rPr>
-                <w:rFonts w:ascii="Arial" w:hAnsi="Arial" w:eastAsia="Arial" w:cs="Arial"/>
+                <w:rFonts w:eastAsia="Arial" w:cs="Arial" w:ascii="Arial" w:hAnsi="Arial"/>
                 <w:color w:val="000000"/>
                 <w:kern w:val="0"/>
                 <w:sz w:val="20"/>
@@ -2103,15 +2104,15 @@
         </w:tc>
         <w:tc>
           <w:tcPr>
-            <w:tcW w:w="1247" w:type="dxa"/>
+            <w:tcW w:w="1248" w:type="dxa"/>
             <w:tcBorders/>
-            <w:shd w:val="clear" w:color="auto" w:fill="FFFFFF"/>
+            <w:shd w:color="auto" w:fill="FFFFFF" w:val="clear"/>
           </w:tcPr>
-          <w:p wp14:textId="77777777">
+          <w:p>
             <w:pPr>
               <w:pStyle w:val="Normal"/>
               <w:suppressAutoHyphens w:val="true"/>
-              <w:spacing w:before="0" w:after="0" w:line="278" w:lineRule="auto"/>
+              <w:spacing w:lineRule="auto" w:line="278" w:before="0" w:after="0"/>
               <w:jc w:val="center"/>
               <w:rPr>
                 <w:rFonts w:ascii="Arial" w:hAnsi="Arial" w:eastAsia="Arial" w:cs="Arial"/>
@@ -2120,7 +2121,7 @@
             </w:pPr>
             <w:r>
               <w:rPr>
-                <w:rFonts w:ascii="Arial" w:hAnsi="Arial" w:eastAsia="Arial" w:cs="Arial"/>
+                <w:rFonts w:eastAsia="Arial" w:cs="Arial" w:ascii="Arial" w:hAnsi="Arial"/>
                 <w:color w:val="000000"/>
                 <w:kern w:val="0"/>
                 <w:sz w:val="20"/>
@@ -2133,13 +2134,13 @@
         </w:tc>
       </w:tr>
     </w:tbl>
-    <w:p xmlns:wp14="http://schemas.microsoft.com/office/word/2010/wordml" wp14:textId="77777777">
+    <w:p>
       <w:pPr>
         <w:pStyle w:val="normal1"/>
         <w:tabs>
           <w:tab w:val="clear" w:pos="720"/>
-          <w:tab w:val="left" w:leader="none" w:pos="750"/>
-          <w:tab w:val="left" w:leader="none" w:pos="1416"/>
+          <w:tab w:val="left" w:pos="750" w:leader="none"/>
+          <w:tab w:val="left" w:pos="1416" w:leader="none"/>
         </w:tabs>
         <w:spacing w:before="121" w:after="0"/>
         <w:rPr>
@@ -2150,7 +2151,7 @@
       </w:pPr>
       <w:r>
         <w:rPr>
-          <w:rFonts w:ascii="Open Sans" w:hAnsi="Open Sans" w:eastAsia="Open Sans" w:cs="Open Sans"/>
+          <w:rFonts w:eastAsia="Open Sans" w:cs="Open Sans" w:ascii="Open Sans" w:hAnsi="Open Sans"/>
           <w:color w:val="070707"/>
           <w:szCs w:val="20"/>
         </w:rPr>
@@ -2169,14 +2170,14 @@
           <w:bottom w:w="0" w:type="dxa"/>
           <w:right w:w="0" w:type="dxa"/>
         </w:tblCellMar>
-        <w:tblLook w:val="04a0" w:firstRow="1" w:lastRow="0" w:firstColumn="1" w:lastColumn="0" w:noHBand="0" w:noVBand="1"/>
+        <w:tblLook w:val="04a0" w:noVBand="1" w:noHBand="0" w:lastColumn="0" w:firstColumn="1" w:lastRow="0" w:firstRow="1"/>
       </w:tblPr>
       <w:tblGrid>
         <w:gridCol w:w="2843"/>
         <w:gridCol w:w="3249"/>
         <w:gridCol w:w="3853"/>
       </w:tblGrid>
-      <w:tr xmlns:wp14="http://schemas.microsoft.com/office/word/2010/wordml" wp14:textId="77777777">
+      <w:tr>
         <w:trPr>
           <w:trHeight w:val="1" w:hRule="atLeast"/>
         </w:trPr>
@@ -2184,9 +2185,9 @@
           <w:tcPr>
             <w:tcW w:w="2843" w:type="dxa"/>
             <w:tcBorders/>
-            <w:shd w:val="clear" w:color="auto" w:fill="CCCCCC"/>
+            <w:shd w:color="auto" w:fill="CCCCCC" w:val="clear"/>
           </w:tcPr>
-          <w:p wp14:textId="77777777">
+          <w:p>
             <w:pPr>
               <w:pStyle w:val="Normal"/>
               <w:keepNext w:val="true"/>
@@ -2205,7 +2206,7 @@
             </w:pPr>
             <w:r>
               <w:rPr>
-                <w:rFonts w:ascii="Open Sans Semibold" w:hAnsi="Open Sans Semibold" w:eastAsia="Open Sans Semibold" w:cs="Open Sans Semibold"/>
+                <w:rFonts w:eastAsia="Open Sans Semibold" w:cs="Open Sans Semibold" w:ascii="Open Sans Semibold" w:hAnsi="Open Sans Semibold"/>
                 <w:color w:val="030303"/>
                 <w:kern w:val="0"/>
                 <w:sz w:val="22"/>
@@ -2216,7 +2217,7 @@
             </w:r>
             <w:r>
               <w:rPr>
-                <w:rFonts w:ascii="Open Sans Semibold" w:hAnsi="Open Sans Semibold" w:eastAsia="Open Sans Semibold" w:cs="Open Sans Semibold"/>
+                <w:rFonts w:eastAsia="Open Sans Semibold" w:cs="Open Sans Semibold" w:ascii="Open Sans Semibold" w:hAnsi="Open Sans Semibold"/>
                 <w:b/>
                 <w:bCs/>
                 <w:color w:val="030303"/>
@@ -2233,9 +2234,9 @@
           <w:tcPr>
             <w:tcW w:w="3249" w:type="dxa"/>
             <w:tcBorders/>
-            <w:shd w:val="clear" w:color="auto" w:fill="CCCCCC"/>
+            <w:shd w:color="auto" w:fill="CCCCCC" w:val="clear"/>
           </w:tcPr>
-          <w:p wp14:textId="77777777">
+          <w:p>
             <w:pPr>
               <w:pStyle w:val="Normal"/>
               <w:suppressAutoHyphens w:val="true"/>
@@ -2256,9 +2257,9 @@
           <w:tcPr>
             <w:tcW w:w="3853" w:type="dxa"/>
             <w:tcBorders/>
-            <w:shd w:val="clear" w:color="auto" w:fill="CCCCCC"/>
+            <w:shd w:color="auto" w:fill="CCCCCC" w:val="clear"/>
           </w:tcPr>
-          <w:p wp14:textId="77777777">
+          <w:p>
             <w:pPr>
               <w:pStyle w:val="Normal"/>
               <w:keepNext w:val="true"/>
@@ -2273,7 +2274,7 @@
             </w:pPr>
             <w:r>
               <w:rPr>
-                <w:rFonts w:ascii="Open Sans Semibold" w:hAnsi="Open Sans Semibold" w:eastAsia="Open Sans Semibold" w:cs="Open Sans Semibold"/>
+                <w:rFonts w:eastAsia="Open Sans Semibold" w:cs="Open Sans Semibold" w:ascii="Open Sans Semibold" w:hAnsi="Open Sans Semibold"/>
                 <w:b/>
                 <w:bCs/>
                 <w:color w:val="000000"/>
@@ -2286,7 +2287,7 @@
             </w:r>
             <w:r>
               <w:rPr>
-                <w:rFonts w:ascii="Open Sans Semibold" w:hAnsi="Open Sans Semibold" w:eastAsia="Open Sans Semibold" w:cs="Open Sans Semibold"/>
+                <w:rFonts w:eastAsia="Open Sans Semibold" w:cs="Open Sans Semibold" w:ascii="Open Sans Semibold" w:hAnsi="Open Sans Semibold"/>
                 <w:color w:val="000000"/>
                 <w:kern w:val="0"/>
                 <w:sz w:val="22"/>
@@ -2297,7 +2298,7 @@
             </w:r>
             <w:r>
               <w:rPr>
-                <w:rFonts w:ascii="Open Sans Semibold" w:hAnsi="Open Sans Semibold" w:eastAsia="Open Sans Semibold" w:cs="Open Sans Semibold"/>
+                <w:rFonts w:eastAsia="Open Sans Semibold" w:cs="Open Sans Semibold" w:ascii="Open Sans Semibold" w:hAnsi="Open Sans Semibold"/>
                 <w:color w:val="CCCCCC"/>
                 <w:kern w:val="0"/>
                 <w:sz w:val="22"/>
@@ -2309,7 +2310,7 @@
           </w:p>
         </w:tc>
       </w:tr>
-      <w:tr xmlns:wp14="http://schemas.microsoft.com/office/word/2010/wordml" wp14:textId="77777777">
+      <w:tr>
         <w:trPr>
           <w:trHeight w:val="1" w:hRule="atLeast"/>
         </w:trPr>
@@ -2317,9 +2318,9 @@
           <w:tcPr>
             <w:tcW w:w="2843" w:type="dxa"/>
             <w:tcBorders/>
-            <w:shd w:val="clear" w:color="auto" w:fill="FFFFFF"/>
+            <w:shd w:color="auto" w:fill="FFFFFF" w:val="clear"/>
           </w:tcPr>
-          <w:p wp14:textId="77777777">
+          <w:p>
             <w:pPr>
               <w:pStyle w:val="Normal"/>
               <w:keepNext w:val="true"/>
@@ -2337,7 +2338,7 @@
             </w:pPr>
             <w:r>
               <w:rPr>
-                <w:rFonts w:ascii="Open Sans Semibold" w:hAnsi="Open Sans Semibold" w:eastAsia="Open Sans Semibold" w:cs="Open Sans Semibold"/>
+                <w:rFonts w:eastAsia="Open Sans Semibold" w:cs="Open Sans Semibold" w:ascii="Open Sans Semibold" w:hAnsi="Open Sans Semibold"/>
                 <w:color w:val="030303"/>
                 <w:kern w:val="0"/>
                 <w:sz w:val="22"/>
@@ -2348,7 +2349,7 @@
             </w:r>
             <w:r>
               <w:rPr>
-                <w:rFonts w:ascii="Open Sans Semibold" w:hAnsi="Open Sans Semibold" w:eastAsia="Open Sans Semibold" w:cs="Open Sans Semibold"/>
+                <w:rFonts w:eastAsia="Open Sans Semibold" w:cs="Open Sans Semibold" w:ascii="Open Sans Semibold" w:hAnsi="Open Sans Semibold"/>
                 <w:b/>
                 <w:bCs/>
                 <w:color w:val="030303"/>
@@ -2365,9 +2366,9 @@
           <w:tcPr>
             <w:tcW w:w="3249" w:type="dxa"/>
             <w:tcBorders/>
-            <w:shd w:val="clear" w:color="auto" w:fill="FFFFFF"/>
+            <w:shd w:color="auto" w:fill="FFFFFF" w:val="clear"/>
           </w:tcPr>
-          <w:p wp14:textId="77777777">
+          <w:p>
             <w:pPr>
               <w:pStyle w:val="Normal"/>
               <w:suppressAutoHyphens w:val="true"/>
@@ -2380,7 +2381,7 @@
             </w:pPr>
             <w:r>
               <w:rPr>
-                <w:rFonts w:ascii="Open Sans" w:hAnsi="Open Sans" w:eastAsia="Open Sans" w:cs="Open Sans"/>
+                <w:rFonts w:eastAsia="Open Sans" w:cs="Open Sans" w:ascii="Open Sans" w:hAnsi="Open Sans"/>
                 <w:color w:val="000000"/>
               </w:rPr>
             </w:r>
@@ -2390,9 +2391,9 @@
           <w:tcPr>
             <w:tcW w:w="3853" w:type="dxa"/>
             <w:tcBorders/>
-            <w:shd w:val="clear" w:color="auto" w:fill="FFFFFF"/>
+            <w:shd w:color="auto" w:fill="FFFFFF" w:val="clear"/>
           </w:tcPr>
-          <w:p wp14:textId="77777777">
+          <w:p>
             <w:pPr>
               <w:pStyle w:val="Normal"/>
               <w:keepNext w:val="true"/>
@@ -2408,7 +2409,7 @@
             </w:pPr>
             <w:r>
               <w:rPr>
-                <w:rFonts w:ascii="Open Sans" w:hAnsi="Open Sans" w:eastAsia="Open Sans" w:cs="Open Sans"/>
+                <w:rFonts w:eastAsia="Open Sans" w:cs="Open Sans" w:ascii="Open Sans" w:hAnsi="Open Sans"/>
                 <w:color w:val="000000"/>
                 <w:kern w:val="0"/>
                 <w:sz w:val="22"/>
@@ -2419,7 +2420,7 @@
             </w:r>
             <w:r>
               <w:rPr>
-                <w:rFonts w:ascii="Open Sans" w:hAnsi="Open Sans" w:eastAsia="Open Sans" w:cs="Open Sans"/>
+                <w:rFonts w:eastAsia="Open Sans" w:cs="Open Sans" w:ascii="Open Sans" w:hAnsi="Open Sans"/>
                 <w:b/>
                 <w:color w:val="000000"/>
                 <w:kern w:val="0"/>
@@ -2431,7 +2432,7 @@
             </w:r>
             <w:r>
               <w:rPr>
-                <w:rFonts w:ascii="Open Sans" w:hAnsi="Open Sans" w:eastAsia="Open Sans" w:cs="Open Sans"/>
+                <w:rFonts w:eastAsia="Open Sans" w:cs="Open Sans" w:ascii="Open Sans" w:hAnsi="Open Sans"/>
                 <w:color w:val="000000"/>
                 <w:kern w:val="0"/>
                 <w:sz w:val="22"/>
@@ -2442,7 +2443,7 @@
             </w:r>
             <w:r>
               <w:rPr>
-                <w:rFonts w:ascii="Open Sans Semibold" w:hAnsi="Open Sans Semibold" w:eastAsia="Open Sans Semibold" w:cs="Open Sans Semibold"/>
+                <w:rFonts w:eastAsia="Open Sans Semibold" w:cs="Open Sans Semibold" w:ascii="Open Sans Semibold" w:hAnsi="Open Sans Semibold"/>
                 <w:b/>
                 <w:bCs/>
                 <w:color w:val="000000"/>
@@ -2455,7 +2456,7 @@
             </w:r>
             <w:r>
               <w:rPr>
-                <w:rFonts w:ascii="Open Sans Semibold" w:hAnsi="Open Sans Semibold" w:eastAsia="Open Sans Semibold" w:cs="Open Sans Semibold"/>
+                <w:rFonts w:eastAsia="Open Sans Semibold" w:cs="Open Sans Semibold" w:ascii="Open Sans Semibold" w:hAnsi="Open Sans Semibold"/>
                 <w:color w:val="000000"/>
                 <w:kern w:val="0"/>
                 <w:sz w:val="22"/>
@@ -2466,7 +2467,7 @@
             </w:r>
             <w:r>
               <w:rPr>
-                <w:rFonts w:ascii="Open Sans Semibold" w:hAnsi="Open Sans Semibold" w:eastAsia="Open Sans Semibold" w:cs="Open Sans Semibold"/>
+                <w:rFonts w:eastAsia="Open Sans Semibold" w:cs="Open Sans Semibold" w:ascii="Open Sans Semibold" w:hAnsi="Open Sans Semibold"/>
                 <w:color w:val="FFFFFF"/>
                 <w:kern w:val="0"/>
                 <w:sz w:val="22"/>
@@ -2479,13 +2480,13 @@
         </w:tc>
       </w:tr>
     </w:tbl>
-    <w:p xmlns:wp14="http://schemas.microsoft.com/office/word/2010/wordml" wp14:textId="77777777">
+    <w:p>
       <w:pPr>
         <w:pStyle w:val="normal1"/>
         <w:tabs>
           <w:tab w:val="clear" w:pos="720"/>
-          <w:tab w:val="left" w:leader="none" w:pos="750"/>
-          <w:tab w:val="left" w:leader="none" w:pos="1416"/>
+          <w:tab w:val="left" w:pos="750" w:leader="none"/>
+          <w:tab w:val="left" w:pos="1416" w:leader="none"/>
         </w:tabs>
         <w:spacing w:before="121" w:after="0"/>
         <w:rPr>
@@ -2496,13 +2497,13 @@
       </w:pPr>
       <w:r>
         <w:rPr>
-          <w:rFonts w:ascii="Open Sans" w:hAnsi="Open Sans" w:eastAsia="Open Sans" w:cs="Open Sans"/>
+          <w:rFonts w:eastAsia="Open Sans" w:cs="Open Sans" w:ascii="Open Sans" w:hAnsi="Open Sans"/>
           <w:color w:val="070707"/>
           <w:szCs w:val="20"/>
         </w:rPr>
       </w:r>
     </w:p>
-    <w:p xmlns:wp14="http://schemas.microsoft.com/office/word/2010/wordml" wp14:textId="77777777">
+    <w:p>
       <w:pPr>
         <w:pStyle w:val="Normal"/>
         <w:ind w:left="125"/>
@@ -2514,79 +2515,79 @@
       </w:pPr>
       <w:r>
         <w:rPr>
+          <w:rFonts w:eastAsia="Open Sans" w:cs="Open Sans" w:ascii="Open Sans" w:hAnsi="Open Sans"/>
+          <w:color w:val="030303"/>
+          <w:lang w:val="de-DE"/>
+        </w:rPr>
+        <w:t>Es handelt sich hierbei um ein Festpreisangebot für die oben definierten Leistungen. Für eine Teilbeauftragung wäre ein neues Angebot erforderlich.{#EbenerdigHinweis}</w:t>
+      </w:r>
+    </w:p>
+    <w:p>
+      <w:pPr>
+        <w:pStyle w:val="normal1"/>
+        <w:spacing w:before="23" w:after="0"/>
+        <w:rPr>
+          <w:rFonts w:ascii="Open Sans" w:hAnsi="Open Sans" w:eastAsia="Open Sans" w:cs="Open Sans"/>
+          <w:color w:val="000000"/>
+          <w:lang w:val="de-DE"/>
+        </w:rPr>
+      </w:pPr>
+      <w:r>
+        <w:rPr>
+          <w:rFonts w:eastAsia="Open Sans" w:cs="Open Sans" w:ascii="Open Sans" w:hAnsi="Open Sans"/>
+          <w:color w:val="000000"/>
+          <w:lang w:val="de-DE"/>
+        </w:rPr>
+      </w:r>
+    </w:p>
+    <w:p>
+      <w:pPr>
+        <w:pStyle w:val="Normal"/>
+        <w:spacing w:lineRule="auto" w:line="286"/>
+        <w:ind w:left="123"/>
+        <w:rPr>
+          <w:rFonts w:ascii="Open Sans" w:hAnsi="Open Sans" w:eastAsia="Open Sans" w:cs="Open Sans"/>
+          <w:color w:val="000000"/>
+          <w:lang w:val="de-DE"/>
+        </w:rPr>
+      </w:pPr>
+      <w:r>
+        <w:rPr>
+          <w:rFonts w:eastAsia="Open Sans Semibold" w:cs="Open Sans Semibold" w:ascii="Open Sans Semibold" w:hAnsi="Open Sans Semibold"/>
+          <w:color w:val="030303"/>
+          <w:lang w:val="de-DE"/>
+        </w:rPr>
+        <w:t>ACHTUNG:</w:t>
+      </w:r>
+      <w:r>
+        <w:rPr>
+          <w:rFonts w:eastAsia="Open Sans" w:cs="Open Sans" w:ascii="Open Sans" w:hAnsi="Open Sans"/>
+          <w:color w:val="030303"/>
+          <w:lang w:val="de-DE"/>
+        </w:rPr>
+        <w:t xml:space="preserve"> Ob eine ebenerdige Montage der Duschwanne möglich ist, kann erst nach dem Ausbau der bestehenden Wanne beurteilen werden. Sollten dabei zusätzliche oder weitere Leistungen erforderlich oder von Ihnen gewünscht sein, können zusätzliche Kosten entstehen.{/EbenerdigHinweis}</w:t>
+      </w:r>
+      <w:r>
+        <w:rPr>
+          <w:lang w:val="de-DE"/>
+        </w:rPr>
+        <w:br/>
+      </w:r>
+    </w:p>
+    <w:p>
+      <w:pPr>
+        <w:pStyle w:val="Normal"/>
+        <w:spacing w:lineRule="auto" w:line="283"/>
+        <w:ind w:left="125" w:right="1024"/>
+        <w:rPr>
           <w:rFonts w:ascii="Open Sans" w:hAnsi="Open Sans" w:eastAsia="Open Sans" w:cs="Open Sans"/>
           <w:color w:val="030303"/>
           <w:lang w:val="de-DE"/>
         </w:rPr>
-        <w:t>Es handelt sich hierbei um ein Festpreisangebot für die oben definierten Leistungen. Für eine Teilbeauftragung wäre ein neues Angebot erforderlich.{#EbenerdigHinweis}</w:t>
-      </w:r>
-    </w:p>
-    <w:p xmlns:wp14="http://schemas.microsoft.com/office/word/2010/wordml" wp14:textId="77777777">
-      <w:pPr>
-        <w:pStyle w:val="normal1"/>
-        <w:spacing w:before="23" w:after="0"/>
-        <w:rPr>
-          <w:rFonts w:ascii="Open Sans" w:hAnsi="Open Sans" w:eastAsia="Open Sans" w:cs="Open Sans"/>
-          <w:color w:val="000000"/>
-          <w:lang w:val="de-DE"/>
-        </w:rPr>
       </w:pPr>
       <w:r>
         <w:rPr>
-          <w:rFonts w:ascii="Open Sans" w:hAnsi="Open Sans" w:eastAsia="Open Sans" w:cs="Open Sans"/>
-          <w:color w:val="000000"/>
-          <w:lang w:val="de-DE"/>
-        </w:rPr>
-      </w:r>
-    </w:p>
-    <w:p xmlns:wp14="http://schemas.microsoft.com/office/word/2010/wordml" wp14:textId="77777777">
-      <w:pPr>
-        <w:pStyle w:val="Normal"/>
-        <w:spacing w:line="286" w:lineRule="auto"/>
-        <w:ind w:left="123"/>
-        <w:rPr>
-          <w:rFonts w:ascii="Open Sans" w:hAnsi="Open Sans" w:eastAsia="Open Sans" w:cs="Open Sans"/>
-          <w:color w:val="000000"/>
-          <w:lang w:val="de-DE"/>
-        </w:rPr>
-      </w:pPr>
-      <w:r>
-        <w:rPr>
-          <w:rFonts w:ascii="Open Sans Semibold" w:hAnsi="Open Sans Semibold" w:eastAsia="Open Sans Semibold" w:cs="Open Sans Semibold"/>
-          <w:color w:val="030303"/>
-          <w:lang w:val="de-DE"/>
-        </w:rPr>
-        <w:t>ACHTUNG:</w:t>
-      </w:r>
-      <w:r>
-        <w:rPr>
-          <w:rFonts w:ascii="Open Sans" w:hAnsi="Open Sans" w:eastAsia="Open Sans" w:cs="Open Sans"/>
-          <w:color w:val="030303"/>
-          <w:lang w:val="de-DE"/>
-        </w:rPr>
-        <w:t xml:space="preserve"> Ob eine ebenerdige Montage der Duschwanne möglich ist, kann erst nach dem Ausbau der bestehenden Wanne beurteilen werden. Sollten dabei zusätzliche oder weitere Leistungen erforderlich oder von Ihnen gewünscht sein, können zusätzliche Kosten entstehen.{/EbenerdigHinweis}</w:t>
-      </w:r>
-      <w:r>
-        <w:rPr>
-          <w:lang w:val="de-DE"/>
-        </w:rPr>
-        <w:br/>
-      </w:r>
-    </w:p>
-    <w:p xmlns:wp14="http://schemas.microsoft.com/office/word/2010/wordml" wp14:textId="77777777">
-      <w:pPr>
-        <w:pStyle w:val="Normal"/>
-        <w:spacing w:line="283" w:lineRule="auto"/>
-        <w:ind w:left="125" w:right="1024"/>
-        <w:rPr>
-          <w:rFonts w:ascii="Open Sans" w:hAnsi="Open Sans" w:eastAsia="Open Sans" w:cs="Open Sans"/>
-          <w:color w:val="030303"/>
-          <w:lang w:val="de-DE"/>
-        </w:rPr>
-      </w:pPr>
-      <w:r>
-        <w:rPr>
-          <w:rFonts w:ascii="Open Sans" w:hAnsi="Open Sans" w:eastAsia="Open Sans" w:cs="Open Sans"/>
+          <w:rFonts w:eastAsia="Open Sans" w:cs="Open Sans" w:ascii="Open Sans" w:hAnsi="Open Sans"/>
           <w:color w:val="030303"/>
           <w:lang w:val="de-DE"/>
         </w:rPr>
@@ -2597,16 +2598,11 @@
           <w:lang w:val="de-DE"/>
         </w:rPr>
         <w:br/>
-      </w:r>
-      <w:r>
-        <w:rPr>
-          <w:lang w:val="de-DE"/>
-        </w:rPr>
         <w:br/>
       </w:r>
       <w:r>
         <w:rPr>
-          <w:rFonts w:ascii="Open Sans" w:hAnsi="Open Sans" w:eastAsia="Open Sans" w:cs="Open Sans"/>
+          <w:rFonts w:eastAsia="Open Sans" w:cs="Open Sans" w:ascii="Open Sans" w:hAnsi="Open Sans"/>
           <w:color w:val="030303"/>
           <w:lang w:val="de-DE"/>
         </w:rPr>
@@ -2614,7 +2610,7 @@
       </w:r>
       <w:r>
         <w:rPr>
-          <w:rFonts w:ascii="Open Sans" w:hAnsi="Open Sans" w:eastAsia="Open Sans" w:cs="Open Sans"/>
+          <w:rFonts w:eastAsia="Open Sans" w:cs="Open Sans" w:ascii="Open Sans" w:hAnsi="Open Sans"/>
           <w:b/>
           <w:bCs/>
           <w:color w:val="030303"/>
@@ -2624,7 +2620,7 @@
       </w:r>
       <w:r>
         <w:rPr>
-          <w:rFonts w:ascii="Open Sans" w:hAnsi="Open Sans" w:eastAsia="Open Sans" w:cs="Open Sans"/>
+          <w:rFonts w:eastAsia="Open Sans" w:cs="Open Sans" w:ascii="Open Sans" w:hAnsi="Open Sans"/>
           <w:color w:val="030303"/>
           <w:lang w:val="de-DE"/>
         </w:rPr>
@@ -2632,7 +2628,7 @@
       </w:r>
       <w:r>
         <w:rPr>
-          <w:rFonts w:ascii="Open Sans" w:hAnsi="Open Sans" w:eastAsia="Open Sans" w:cs="Open Sans"/>
+          <w:rFonts w:eastAsia="Open Sans" w:cs="Open Sans" w:ascii="Open Sans" w:hAnsi="Open Sans"/>
           <w:b/>
           <w:bCs/>
           <w:color w:val="030303"/>
@@ -2642,17 +2638,17 @@
       </w:r>
       <w:r>
         <w:rPr>
-          <w:rFonts w:ascii="Open Sans" w:hAnsi="Open Sans" w:eastAsia="Open Sans" w:cs="Open Sans"/>
+          <w:rFonts w:eastAsia="Open Sans" w:cs="Open Sans" w:ascii="Open Sans" w:hAnsi="Open Sans"/>
           <w:color w:val="030303"/>
           <w:lang w:val="de-DE"/>
         </w:rPr>
         <w:t>.{/hasSubsidyLine}</w:t>
       </w:r>
     </w:p>
-    <w:p xmlns:wp14="http://schemas.microsoft.com/office/word/2010/wordml" wp14:textId="77777777">
+    <w:p>
       <w:pPr>
         <w:pStyle w:val="Normal"/>
-        <w:spacing w:line="283" w:lineRule="auto"/>
+        <w:spacing w:lineRule="auto" w:line="283"/>
         <w:ind w:left="125" w:right="1024"/>
         <w:rPr>
           <w:rFonts w:ascii="Open Sans" w:hAnsi="Open Sans" w:eastAsia="Open Sans" w:cs="Open Sans"/>
@@ -2670,17 +2666,7 @@
           <w:lang w:val="de-DE"/>
         </w:rPr>
         <w:t>{#SelfPayLines}</w:t>
-      </w:r>
-      <w:r>
-        <w:rPr>
-          <w:lang w:val="de-DE"/>
-        </w:rPr>
         <w:br/>
-      </w:r>
-      <w:r>
-        <w:rPr>
-          <w:lang w:val="de-DE"/>
-        </w:rPr>
         <w:t>{#IsTitle}</w:t>
       </w:r>
       <w:r>
@@ -2697,10 +2683,10 @@
         <w:t>{/IsTitle}{^IsTitle}{Text}{/IsTitle}{/SelfPayLines}</w:t>
       </w:r>
     </w:p>
-    <w:p xmlns:wp14="http://schemas.microsoft.com/office/word/2010/wordml" wp14:textId="77777777">
+    <w:p>
       <w:pPr>
         <w:pStyle w:val="Normal"/>
-        <w:spacing w:before="215" w:after="0" w:line="286" w:lineRule="auto"/>
+        <w:spacing w:lineRule="auto" w:line="286" w:before="215" w:after="0"/>
         <w:ind w:left="123" w:right="222"/>
         <w:rPr>
           <w:rFonts w:ascii="Open Sans" w:hAnsi="Open Sans" w:eastAsia="Open Sans" w:cs="Open Sans"/>
@@ -2710,7 +2696,7 @@
       </w:pPr>
       <w:r>
         <w:rPr>
-          <w:rFonts w:ascii="Open Sans" w:hAnsi="Open Sans" w:eastAsia="Open Sans" w:cs="Open Sans"/>
+          <w:rFonts w:eastAsia="Open Sans" w:cs="Open Sans" w:ascii="Open Sans" w:hAnsi="Open Sans"/>
           <w:color w:val="030303"/>
           <w:lang w:val="de-DE"/>
         </w:rPr>
@@ -2720,7 +2706,7 @@
         <w:r>
           <w:rPr>
             <w:rStyle w:val="Style"/>
-            <w:rFonts w:ascii="Open Sans" w:hAnsi="Open Sans" w:eastAsia="Open Sans" w:cs="Open Sans"/>
+            <w:rFonts w:eastAsia="Open Sans" w:cs="Open Sans" w:ascii="Open Sans" w:hAnsi="Open Sans"/>
             <w:color w:val="030303"/>
             <w:u w:val="single"/>
             <w:lang w:val="de-DE"/>
@@ -2730,14 +2716,14 @@
       </w:hyperlink>
       <w:r>
         <w:rPr>
-          <w:rFonts w:ascii="Open Sans" w:hAnsi="Open Sans" w:eastAsia="Open Sans" w:cs="Open Sans"/>
+          <w:rFonts w:eastAsia="Open Sans" w:cs="Open Sans" w:ascii="Open Sans" w:hAnsi="Open Sans"/>
           <w:color w:val="030303"/>
           <w:lang w:val="de-DE"/>
         </w:rPr>
         <w:t xml:space="preserve"> Die Unterschrift gilt für uns als Auftragsbestätigung.</w:t>
       </w:r>
     </w:p>
-    <w:p xmlns:wp14="http://schemas.microsoft.com/office/word/2010/wordml" wp14:textId="77777777">
+    <w:p>
       <w:pPr>
         <w:pStyle w:val="normal1"/>
         <w:spacing w:before="26" w:after="0"/>
@@ -2749,32 +2735,32 @@
       </w:pPr>
       <w:r>
         <w:rPr>
+          <w:rFonts w:eastAsia="Open Sans" w:cs="Open Sans" w:ascii="Open Sans" w:hAnsi="Open Sans"/>
+          <w:color w:val="000000"/>
+          <w:lang w:val="de-DE"/>
+        </w:rPr>
+      </w:r>
+    </w:p>
+    <w:p>
+      <w:pPr>
+        <w:pStyle w:val="Normal"/>
+        <w:ind w:left="123"/>
+        <w:rPr>
           <w:rFonts w:ascii="Open Sans" w:hAnsi="Open Sans" w:eastAsia="Open Sans" w:cs="Open Sans"/>
           <w:color w:val="000000"/>
           <w:lang w:val="de-DE"/>
         </w:rPr>
-      </w:r>
-    </w:p>
-    <w:p xmlns:wp14="http://schemas.microsoft.com/office/word/2010/wordml" wp14:textId="77777777">
-      <w:pPr>
-        <w:pStyle w:val="Normal"/>
-        <w:ind w:left="123"/>
-        <w:rPr>
-          <w:rFonts w:ascii="Open Sans" w:hAnsi="Open Sans" w:eastAsia="Open Sans" w:cs="Open Sans"/>
-          <w:color w:val="000000"/>
-          <w:lang w:val="de-DE"/>
-        </w:rPr>
       </w:pPr>
       <w:r>
         <w:rPr>
-          <w:rFonts w:ascii="Open Sans" w:hAnsi="Open Sans" w:eastAsia="Open Sans" w:cs="Open Sans"/>
+          <w:rFonts w:eastAsia="Open Sans" w:cs="Open Sans" w:ascii="Open Sans" w:hAnsi="Open Sans"/>
           <w:color w:val="030303"/>
           <w:lang w:val="de-DE"/>
         </w:rPr>
         <w:t xml:space="preserve">Angebot akzeptiert / Auftrag bestätigt:                                       </w:t>
       </w:r>
     </w:p>
-    <w:p xmlns:wp14="http://schemas.microsoft.com/office/word/2010/wordml" wp14:textId="77777777">
+    <w:p>
       <w:pPr>
         <w:pStyle w:val="normal1"/>
         <w:rPr>
@@ -2787,36 +2773,36 @@
       </w:pPr>
       <w:r>
         <w:rPr>
+          <w:rFonts w:eastAsia="Open Sans" w:cs="Open Sans" w:ascii="Open Sans" w:hAnsi="Open Sans"/>
+          <w:color w:val="000000"/>
+          <w:sz w:val="20"/>
+          <w:szCs w:val="20"/>
+          <w:lang w:val="de-DE"/>
+        </w:rPr>
+      </w:r>
+    </w:p>
+    <w:p>
+      <w:pPr>
+        <w:pStyle w:val="normal1"/>
+        <w:rPr>
           <w:rFonts w:ascii="Open Sans" w:hAnsi="Open Sans" w:eastAsia="Open Sans" w:cs="Open Sans"/>
           <w:color w:val="000000"/>
           <w:sz w:val="20"/>
           <w:szCs w:val="20"/>
           <w:lang w:val="de-DE"/>
         </w:rPr>
-      </w:r>
-    </w:p>
-    <w:p xmlns:wp14="http://schemas.microsoft.com/office/word/2010/wordml" wp14:textId="77777777">
-      <w:pPr>
-        <w:pStyle w:val="normal1"/>
-        <w:rPr>
-          <w:rFonts w:ascii="Open Sans" w:hAnsi="Open Sans" w:eastAsia="Open Sans" w:cs="Open Sans"/>
+      </w:pPr>
+      <w:r>
+        <w:rPr>
+          <w:rFonts w:eastAsia="Open Sans" w:cs="Open Sans" w:ascii="Open Sans" w:hAnsi="Open Sans"/>
           <w:color w:val="000000"/>
           <w:sz w:val="20"/>
           <w:szCs w:val="20"/>
           <w:lang w:val="de-DE"/>
         </w:rPr>
-      </w:pPr>
-      <w:r>
-        <w:rPr>
-          <w:rFonts w:ascii="Open Sans" w:hAnsi="Open Sans" w:eastAsia="Open Sans" w:cs="Open Sans"/>
-          <w:color w:val="000000"/>
-          <w:sz w:val="20"/>
-          <w:szCs w:val="20"/>
-          <w:lang w:val="de-DE"/>
-        </w:rPr>
       </w:r>
     </w:p>
-    <w:p xmlns:wp14="http://schemas.microsoft.com/office/word/2010/wordml" wp14:textId="77777777">
+    <w:p>
       <w:pPr>
         <w:pStyle w:val="normal1"/>
         <w:spacing w:before="81" w:after="0"/>
@@ -2829,15 +2815,101 @@
       </w:pPr>
       <w:r>
         <w:rPr>
+          <w:rFonts w:eastAsia="Open Sans" w:cs="Open Sans" w:ascii="Open Sans" w:hAnsi="Open Sans"/>
+          <w:sz w:val="20"/>
+          <w:szCs w:val="20"/>
+          <w:lang w:val="de-DE"/>
+        </w:rPr>
+        <w:t>{%SignatureImage}</w:t>
+      </w:r>
+    </w:p>
+    <w:p>
+      <w:pPr>
+        <w:pStyle w:val="normal1"/>
+        <w:spacing w:before="81" w:after="0"/>
+        <w:rPr>
           <w:rFonts w:ascii="Open Sans" w:hAnsi="Open Sans" w:eastAsia="Open Sans" w:cs="Open Sans"/>
           <w:sz w:val="20"/>
           <w:szCs w:val="20"/>
           <w:lang w:val="de-DE"/>
         </w:rPr>
-        <w:t>{%SignatureImage}</w:t>
+      </w:pPr>
+      <w:r>
+        <w:rPr>
+          <w:rFonts w:eastAsia="Open Sans" w:cs="Open Sans" w:ascii="Open Sans" w:hAnsi="Open Sans"/>
+          <w:sz w:val="20"/>
+          <w:szCs w:val="20"/>
+          <w:lang w:val="de-DE"/>
+        </w:rPr>
+        <w:t>_________________________________</w:t>
       </w:r>
     </w:p>
-    <w:p xmlns:wp14="http://schemas.microsoft.com/office/word/2010/wordml" wp14:textId="77777777">
+    <w:p>
+      <w:pPr>
+        <w:pStyle w:val="Normal"/>
+        <w:spacing w:lineRule="auto" w:line="360" w:before="67" w:after="0"/>
+        <w:rPr>
+          <w:rFonts w:ascii="Open Sans" w:hAnsi="Open Sans" w:eastAsia="Open Sans" w:cs="Open Sans"/>
+          <w:color w:val="030303"/>
+          <w:lang w:val="de-DE"/>
+        </w:rPr>
+      </w:pPr>
+      <w:r>
+        <w:rPr>
+          <w:rFonts w:eastAsia="Open Sans" w:cs="Open Sans" w:ascii="Open Sans" w:hAnsi="Open Sans"/>
+          <w:color w:val="030303"/>
+          <w:lang w:val="de-DE"/>
+        </w:rPr>
+        <w:t>Ort, Datum, Unterschrift</w:t>
+      </w:r>
+      <w:r>
+        <w:rPr>
+          <w:lang w:val="de-DE"/>
+        </w:rPr>
+        <w:br/>
+        <w:br/>
+      </w:r>
+      <w:r>
+        <w:rPr>
+          <w:rFonts w:eastAsia="Open Sans" w:cs="Open Sans" w:ascii="Open Sans" w:hAnsi="Open Sans"/>
+          <w:color w:val="030303"/>
+          <w:lang w:val="de-DE"/>
+        </w:rPr>
+        <w:t>Für Rückfragen stehen wir Ihnen gerne zur Verfügung.  Wir bedanken uns für Ihr Vertrauen und freuen uns, von Ihnen zu hören. Dieses Angebot ist gültig bis {ValidityDate}.</w:t>
+      </w:r>
+    </w:p>
+    <w:p>
+      <w:pPr>
+        <w:pStyle w:val="Normal"/>
+        <w:spacing w:lineRule="auto" w:line="276" w:before="67" w:after="0"/>
+        <w:rPr>
+          <w:rFonts w:ascii="Open Sans" w:hAnsi="Open Sans" w:eastAsia="Open Sans" w:cs="Open Sans"/>
+          <w:color w:val="000000"/>
+          <w:lang w:val="de-DE"/>
+        </w:rPr>
+      </w:pPr>
+      <w:r>
+        <w:rPr>
+          <w:lang w:val="de-DE"/>
+        </w:rPr>
+        <w:br/>
+      </w:r>
+      <w:r>
+        <w:rPr>
+          <w:rFonts w:eastAsia="Open Sans" w:cs="Open Sans" w:ascii="Open Sans" w:hAnsi="Open Sans"/>
+          <w:color w:val="030303"/>
+          <w:lang w:val="de-DE"/>
+        </w:rPr>
+        <w:t>Mit freundlichen Grüßen</w:t>
+      </w:r>
+      <w:r>
+        <w:rPr>
+          <w:lang w:val="de-DE"/>
+        </w:rPr>
+        <w:br/>
+      </w:r>
+    </w:p>
+    <w:p>
       <w:pPr>
         <w:pStyle w:val="normal1"/>
         <w:spacing w:before="81" w:after="0"/>
@@ -2850,18 +2922,24 @@
       </w:pPr>
       <w:r>
         <w:rPr>
-          <w:rFonts w:ascii="Open Sans" w:hAnsi="Open Sans" w:eastAsia="Open Sans" w:cs="Open Sans"/>
+          <w:rFonts w:eastAsia="Open Sans" w:cs="Open Sans" w:ascii="Open Sans" w:hAnsi="Open Sans"/>
           <w:sz w:val="20"/>
           <w:szCs w:val="20"/>
           <w:lang w:val="de-DE"/>
         </w:rPr>
-        <w:t>_________________________________</w:t>
+        <w:t>{%OurSignatureImage}</w:t>
+      </w:r>
+      <w:r>
+        <w:rPr>
+          <w:lang w:val="de-DE"/>
+        </w:rPr>
+        <w:br/>
       </w:r>
     </w:p>
-    <w:p xmlns:wp14="http://schemas.microsoft.com/office/word/2010/wordml" wp14:textId="77777777">
+    <w:p>
       <w:pPr>
         <w:pStyle w:val="Normal"/>
-        <w:spacing w:before="67" w:after="0" w:line="360" w:lineRule="auto"/>
+        <w:spacing w:lineRule="auto" w:line="276" w:before="67" w:after="0"/>
         <w:rPr>
           <w:rFonts w:ascii="Open Sans" w:hAnsi="Open Sans" w:eastAsia="Open Sans" w:cs="Open Sans"/>
           <w:color w:val="030303"/>
@@ -2870,37 +2948,17 @@
       </w:pPr>
       <w:r>
         <w:rPr>
-          <w:rFonts w:ascii="Open Sans" w:hAnsi="Open Sans" w:eastAsia="Open Sans" w:cs="Open Sans"/>
+          <w:rFonts w:eastAsia="Open Sans" w:cs="Open Sans" w:ascii="Open Sans" w:hAnsi="Open Sans"/>
           <w:color w:val="030303"/>
           <w:lang w:val="de-DE"/>
         </w:rPr>
-        <w:t>Ort, Datum, Unterschrift</w:t>
-      </w:r>
-      <w:r>
-        <w:rPr>
-          <w:lang w:val="de-DE"/>
-        </w:rPr>
-        <w:br/>
-      </w:r>
-      <w:r>
-        <w:rPr>
-          <w:lang w:val="de-DE"/>
-        </w:rPr>
-        <w:br/>
-      </w:r>
-      <w:r>
-        <w:rPr>
-          <w:rFonts w:ascii="Open Sans" w:hAnsi="Open Sans" w:eastAsia="Open Sans" w:cs="Open Sans"/>
-          <w:color w:val="030303"/>
-          <w:lang w:val="de-DE"/>
-        </w:rPr>
-        <w:t>Für Rückfragen stehen wir Ihnen gerne zur Verfügung.  Wir bedanken uns für Ihr Vertrauen und freuen uns, von Ihnen zu hören. Dieses Angebot ist gültig bis {ValidityDate}.</w:t>
+        <w:t>Ihr Team von EmC2</w:t>
       </w:r>
     </w:p>
-    <w:p xmlns:wp14="http://schemas.microsoft.com/office/word/2010/wordml" wp14:textId="77777777">
+    <w:p>
       <w:pPr>
         <w:pStyle w:val="Normal"/>
-        <w:spacing w:before="67" w:after="0" w:line="276" w:lineRule="auto"/>
+        <w:spacing w:lineRule="auto" w:line="276" w:before="67" w:after="0"/>
         <w:rPr>
           <w:rFonts w:ascii="Open Sans" w:hAnsi="Open Sans" w:eastAsia="Open Sans" w:cs="Open Sans"/>
           <w:color w:val="000000"/>
@@ -2909,84 +2967,7 @@
       </w:pPr>
       <w:r>
         <w:rPr>
-          <w:lang w:val="de-DE"/>
-        </w:rPr>
-        <w:br/>
-      </w:r>
-      <w:r>
-        <w:rPr>
-          <w:rFonts w:ascii="Open Sans" w:hAnsi="Open Sans" w:eastAsia="Open Sans" w:cs="Open Sans"/>
-          <w:color w:val="030303"/>
-          <w:lang w:val="de-DE"/>
-        </w:rPr>
-        <w:t>Mit freundlichen Grüßen</w:t>
-      </w:r>
-      <w:r>
-        <w:rPr>
-          <w:lang w:val="de-DE"/>
-        </w:rPr>
-        <w:br/>
-      </w:r>
-    </w:p>
-    <w:p xmlns:wp14="http://schemas.microsoft.com/office/word/2010/wordml" wp14:textId="77777777">
-      <w:pPr>
-        <w:pStyle w:val="normal1"/>
-        <w:spacing w:before="81" w:after="0"/>
-        <w:rPr>
-          <w:rFonts w:ascii="Open Sans" w:hAnsi="Open Sans" w:eastAsia="Open Sans" w:cs="Open Sans"/>
-          <w:sz w:val="20"/>
-          <w:szCs w:val="20"/>
-          <w:lang w:val="de-DE"/>
-        </w:rPr>
-      </w:pPr>
-      <w:r>
-        <w:rPr>
-          <w:rFonts w:ascii="Open Sans" w:hAnsi="Open Sans" w:eastAsia="Open Sans" w:cs="Open Sans"/>
-          <w:sz w:val="20"/>
-          <w:szCs w:val="20"/>
-          <w:lang w:val="de-DE"/>
-        </w:rPr>
-        <w:t>{%OurSignatureImage}</w:t>
-      </w:r>
-      <w:r>
-        <w:rPr>
-          <w:lang w:val="de-DE"/>
-        </w:rPr>
-        <w:br/>
-      </w:r>
-    </w:p>
-    <w:p xmlns:wp14="http://schemas.microsoft.com/office/word/2010/wordml" wp14:textId="77777777">
-      <w:pPr>
-        <w:pStyle w:val="Normal"/>
-        <w:spacing w:before="67" w:after="0" w:line="276" w:lineRule="auto"/>
-        <w:rPr>
-          <w:rFonts w:ascii="Open Sans" w:hAnsi="Open Sans" w:eastAsia="Open Sans" w:cs="Open Sans"/>
-          <w:color w:val="030303"/>
-          <w:lang w:val="de-DE"/>
-        </w:rPr>
-      </w:pPr>
-      <w:r>
-        <w:rPr>
-          <w:rFonts w:ascii="Open Sans" w:hAnsi="Open Sans" w:eastAsia="Open Sans" w:cs="Open Sans"/>
-          <w:color w:val="030303"/>
-          <w:lang w:val="de-DE"/>
-        </w:rPr>
-        <w:t>Ihr Team von EmC2</w:t>
-      </w:r>
-    </w:p>
-    <w:p xmlns:wp14="http://schemas.microsoft.com/office/word/2010/wordml" wp14:textId="77777777">
-      <w:pPr>
-        <w:pStyle w:val="Normal"/>
-        <w:spacing w:before="67" w:after="0" w:line="276" w:lineRule="auto"/>
-        <w:rPr>
-          <w:rFonts w:ascii="Open Sans" w:hAnsi="Open Sans" w:eastAsia="Open Sans" w:cs="Open Sans"/>
-          <w:color w:val="000000"/>
-          <w:lang w:val="de-DE"/>
-        </w:rPr>
-      </w:pPr>
-      <w:r>
-        <w:rPr>
-          <w:rFonts w:ascii="Open Sans" w:hAnsi="Open Sans" w:eastAsia="Open Sans" w:cs="Open Sans"/>
+          <w:rFonts w:eastAsia="Open Sans" w:cs="Open Sans" w:ascii="Open Sans" w:hAnsi="Open Sans"/>
           <w:color w:val="000000"/>
           <w:lang w:val="de-DE"/>
         </w:rPr>
@@ -3000,13 +2981,12 @@
       <w:footerReference w:type="default" r:id="rId7"/>
       <w:footerReference w:type="first" r:id="rId8"/>
       <w:type w:val="nextPage"/>
-      <w:pgSz w:w="12240" w:h="15840" w:orient="portrait"/>
-      <w:pgMar w:top="1440" w:right="1440" w:bottom="1440" w:left="1440" w:header="0" w:footer="0" w:gutter="0"/>
-      <w:pgNumType w:fmt="decimal" w:start="1"/>
+      <w:pgSz w:w="12240" w:h="15840"/>
+      <w:pgMar w:left="1440" w:right="1440" w:gutter="0" w:header="0" w:top="1440" w:footer="0" w:bottom="1440"/>
+      <w:pgNumType w:start="1" w:fmt="decimal"/>
       <w:formProt w:val="false"/>
       <w:textDirection w:val="lrTb"/>
       <w:docGrid w:type="default" w:linePitch="100" w:charSpace="4096"/>
-      <w:cols w:num="1"/>
     </w:sectPr>
   </w:body>
 </w:document>
@@ -3014,7 +2994,7 @@
 
 <file path=word/footer1.xml><?xml version="1.0" encoding="utf-8"?>
 <w:ftr xmlns:o="urn:schemas-microsoft-com:office:office" xmlns:r="http://schemas.openxmlformats.org/officeDocument/2006/relationships" xmlns:v="urn:schemas-microsoft-com:vml" xmlns:w="http://schemas.openxmlformats.org/wordprocessingml/2006/main" xmlns:w10="urn:schemas-microsoft-com:office:word" xmlns:wp="http://schemas.openxmlformats.org/drawingml/2006/wordprocessingDrawing" xmlns:pic="http://schemas.openxmlformats.org/drawingml/2006/picture" xmlns:wps="http://schemas.microsoft.com/office/word/2010/wordprocessingShape" xmlns:wpg="http://schemas.microsoft.com/office/word/2010/wordprocessingGroup" xmlns:mc="http://schemas.openxmlformats.org/markup-compatibility/2006" xmlns:wp14="http://schemas.microsoft.com/office/word/2010/wordprocessingDrawing" xmlns:w14="http://schemas.microsoft.com/office/word/2010/wordml" xmlns:w15="http://schemas.microsoft.com/office/word/2012/wordml" mc:Ignorable="w14 wp14 w15">
-  <w:p xmlns:wp14="http://schemas.microsoft.com/office/word/2010/wordml" wp14:textId="77777777">
+  <w:p>
     <w:pPr>
       <w:pStyle w:val="Footer"/>
       <w:rPr/>
@@ -3031,60 +3011,59 @@
   <w:tbl>
     <w:tblPr>
       <w:tblStyle w:val="Standardowy"/>
-      <w:bidiVisual w:val="0"/>
-      <w:tblW w:w="0" w:type="auto"/>
-      <w:tblBorders>
-        <w:top w:val="single" w:color="2E74B5" w:themeColor="accent5" w:themeShade="BF" w:sz="18"/>
-        <w:left w:val="none" w:color="000000" w:themeColor="text1" w:sz="4"/>
-        <w:bottom w:val="none" w:color="000000" w:themeColor="text1" w:sz="4"/>
-        <w:right w:val="none" w:color="000000" w:themeColor="text1" w:sz="4"/>
-        <w:insideH w:val="none" w:color="000000" w:themeColor="text1" w:sz="4"/>
-        <w:insideV w:val="none" w:color="000000" w:themeColor="text1" w:sz="4"/>
-      </w:tblBorders>
-      <w:tblLook w:val="0600" w:firstRow="0" w:lastRow="0" w:firstColumn="0" w:lastColumn="0" w:noHBand="1" w:noVBand="1"/>
+      <w:tblW w:w="9475" w:type="dxa"/>
+      <w:jc w:val="left"/>
+      <w:tblInd w:w="-63" w:type="dxa"/>
+      <w:tblLayout w:type="fixed"/>
+      <w:tblCellMar>
+        <w:top w:w="45" w:type="dxa"/>
+        <w:left w:w="45" w:type="dxa"/>
+        <w:bottom w:w="45" w:type="dxa"/>
+        <w:right w:w="45" w:type="dxa"/>
+      </w:tblCellMar>
+      <w:tblLook w:val="0600" w:noVBand="1" w:noHBand="1" w:lastColumn="0" w:firstColumn="0" w:lastRow="0" w:firstRow="0"/>
     </w:tblPr>
     <w:tblGrid>
       <w:gridCol w:w="3158"/>
       <w:gridCol w:w="3158"/>
-      <w:gridCol w:w="3158"/>
+      <w:gridCol w:w="3159"/>
     </w:tblGrid>
     <w:tr>
       <w:trPr>
-        <w:trHeight w:val="660"/>
+        <w:trHeight w:val="660" w:hRule="atLeast"/>
       </w:trPr>
       <w:tc>
         <w:tcPr>
           <w:tcW w:w="3158" w:type="dxa"/>
-          <w:tcMar>
-            <w:top w:w="45" w:type="dxa"/>
-            <w:left w:w="45" w:type="dxa"/>
-            <w:bottom w:w="45" w:type="dxa"/>
-            <w:right w:w="45" w:type="dxa"/>
-          </w:tcMar>
+          <w:tcBorders>
+            <w:top w:val="single" w:sz="18" w:space="0" w:color="2E74B5"/>
+          </w:tcBorders>
           <w:vAlign w:val="center"/>
         </w:tcPr>
         <w:p>
           <w:pPr>
-            <w:widowControl w:val="0"/>
+            <w:pStyle w:val="Normal"/>
+            <w:widowControl w:val="false"/>
             <w:spacing w:before="0" w:after="0"/>
             <w:jc w:val="center"/>
             <w:rPr>
               <w:rFonts w:ascii="Open Sans" w:hAnsi="Open Sans" w:eastAsia="Open Sans" w:cs="Open Sans"/>
-              <w:b w:val="0"/>
-              <w:bCs w:val="0"/>
-              <w:i w:val="0"/>
-              <w:iCs w:val="0"/>
+              <w:b w:val="false"/>
+              <w:bCs w:val="false"/>
+              <w:i w:val="false"/>
+              <w:i w:val="false"/>
+              <w:iCs w:val="false"/>
               <w:sz w:val="15"/>
               <w:szCs w:val="15"/>
             </w:rPr>
           </w:pPr>
           <w:r>
             <w:rPr>
-              <w:rFonts w:ascii="Open Sans" w:hAnsi="Open Sans" w:eastAsia="Open Sans" w:cs="Open Sans"/>
-              <w:b w:val="0"/>
-              <w:bCs w:val="0"/>
-              <w:i w:val="0"/>
-              <w:iCs w:val="0"/>
+              <w:rFonts w:eastAsia="Open Sans" w:cs="Open Sans" w:ascii="Open Sans" w:hAnsi="Open Sans"/>
+              <w:b w:val="false"/>
+              <w:bCs w:val="false"/>
+              <w:i w:val="false"/>
+              <w:iCs w:val="false"/>
               <w:sz w:val="15"/>
               <w:szCs w:val="15"/>
               <w:lang w:val="pl-PL"/>
@@ -3094,26 +3073,28 @@
         </w:p>
         <w:p>
           <w:pPr>
-            <w:widowControl w:val="0"/>
+            <w:pStyle w:val="Normal"/>
+            <w:widowControl w:val="false"/>
             <w:spacing w:before="0" w:after="0"/>
             <w:jc w:val="center"/>
             <w:rPr>
               <w:rFonts w:ascii="Open Sans" w:hAnsi="Open Sans" w:eastAsia="Open Sans" w:cs="Open Sans"/>
-              <w:b w:val="0"/>
-              <w:bCs w:val="0"/>
-              <w:i w:val="0"/>
-              <w:iCs w:val="0"/>
+              <w:b w:val="false"/>
+              <w:bCs w:val="false"/>
+              <w:i w:val="false"/>
+              <w:i w:val="false"/>
+              <w:iCs w:val="false"/>
               <w:sz w:val="15"/>
               <w:szCs w:val="15"/>
             </w:rPr>
           </w:pPr>
           <w:r>
             <w:rPr>
-              <w:rFonts w:ascii="Open Sans" w:hAnsi="Open Sans" w:eastAsia="Open Sans" w:cs="Open Sans"/>
-              <w:b w:val="0"/>
-              <w:bCs w:val="0"/>
-              <w:i w:val="0"/>
-              <w:iCs w:val="0"/>
+              <w:rFonts w:eastAsia="Open Sans" w:cs="Open Sans" w:ascii="Open Sans" w:hAnsi="Open Sans"/>
+              <w:b w:val="false"/>
+              <w:bCs w:val="false"/>
+              <w:i w:val="false"/>
+              <w:iCs w:val="false"/>
               <w:sz w:val="15"/>
               <w:szCs w:val="15"/>
               <w:lang w:val="pl-PL"/>
@@ -3123,26 +3104,28 @@
         </w:p>
         <w:p>
           <w:pPr>
-            <w:widowControl w:val="0"/>
+            <w:pStyle w:val="Normal"/>
+            <w:widowControl w:val="false"/>
             <w:spacing w:before="0" w:after="0"/>
             <w:jc w:val="center"/>
             <w:rPr>
               <w:rFonts w:ascii="Open Sans" w:hAnsi="Open Sans" w:eastAsia="Open Sans" w:cs="Open Sans"/>
-              <w:b w:val="0"/>
-              <w:bCs w:val="0"/>
-              <w:i w:val="0"/>
-              <w:iCs w:val="0"/>
+              <w:b w:val="false"/>
+              <w:bCs w:val="false"/>
+              <w:i w:val="false"/>
+              <w:i w:val="false"/>
+              <w:iCs w:val="false"/>
               <w:sz w:val="15"/>
               <w:szCs w:val="15"/>
             </w:rPr>
           </w:pPr>
           <w:r>
             <w:rPr>
-              <w:rFonts w:ascii="Open Sans" w:hAnsi="Open Sans" w:eastAsia="Open Sans" w:cs="Open Sans"/>
-              <w:b w:val="0"/>
-              <w:bCs w:val="0"/>
-              <w:i w:val="0"/>
-              <w:iCs w:val="0"/>
+              <w:rFonts w:eastAsia="Open Sans" w:cs="Open Sans" w:ascii="Open Sans" w:hAnsi="Open Sans"/>
+              <w:b w:val="false"/>
+              <w:bCs w:val="false"/>
+              <w:i w:val="false"/>
+              <w:iCs w:val="false"/>
               <w:sz w:val="15"/>
               <w:szCs w:val="15"/>
               <w:lang w:val="pl-PL"/>
@@ -3152,26 +3135,28 @@
         </w:p>
         <w:p>
           <w:pPr>
-            <w:widowControl w:val="0"/>
+            <w:pStyle w:val="Normal"/>
+            <w:widowControl w:val="false"/>
             <w:spacing w:before="0" w:after="0"/>
             <w:jc w:val="center"/>
             <w:rPr>
               <w:rFonts w:ascii="Open Sans" w:hAnsi="Open Sans" w:eastAsia="Open Sans" w:cs="Open Sans"/>
-              <w:b w:val="0"/>
-              <w:bCs w:val="0"/>
-              <w:i w:val="0"/>
-              <w:iCs w:val="0"/>
+              <w:b w:val="false"/>
+              <w:bCs w:val="false"/>
+              <w:i w:val="false"/>
+              <w:i w:val="false"/>
+              <w:iCs w:val="false"/>
               <w:sz w:val="15"/>
               <w:szCs w:val="15"/>
             </w:rPr>
           </w:pPr>
           <w:r>
             <w:rPr>
-              <w:rFonts w:ascii="Open Sans" w:hAnsi="Open Sans" w:eastAsia="Open Sans" w:cs="Open Sans"/>
-              <w:b w:val="0"/>
-              <w:bCs w:val="0"/>
-              <w:i w:val="0"/>
-              <w:iCs w:val="0"/>
+              <w:rFonts w:eastAsia="Open Sans" w:cs="Open Sans" w:ascii="Open Sans" w:hAnsi="Open Sans"/>
+              <w:b w:val="false"/>
+              <w:bCs w:val="false"/>
+              <w:i w:val="false"/>
+              <w:iCs w:val="false"/>
               <w:sz w:val="15"/>
               <w:szCs w:val="15"/>
               <w:lang w:val="pl-PL"/>
@@ -3183,36 +3168,35 @@
       <w:tc>
         <w:tcPr>
           <w:tcW w:w="3158" w:type="dxa"/>
-          <w:tcMar>
-            <w:top w:w="45" w:type="dxa"/>
-            <w:left w:w="45" w:type="dxa"/>
-            <w:bottom w:w="45" w:type="dxa"/>
-            <w:right w:w="45" w:type="dxa"/>
-          </w:tcMar>
+          <w:tcBorders>
+            <w:top w:val="single" w:sz="18" w:space="0" w:color="2E74B5"/>
+          </w:tcBorders>
           <w:vAlign w:val="center"/>
         </w:tcPr>
         <w:p>
           <w:pPr>
-            <w:widowControl w:val="0"/>
+            <w:pStyle w:val="Normal"/>
+            <w:widowControl w:val="false"/>
             <w:spacing w:before="0" w:after="0"/>
             <w:jc w:val="center"/>
             <w:rPr>
               <w:rFonts w:ascii="Open Sans" w:hAnsi="Open Sans" w:eastAsia="Open Sans" w:cs="Open Sans"/>
-              <w:b w:val="0"/>
-              <w:bCs w:val="0"/>
-              <w:i w:val="0"/>
-              <w:iCs w:val="0"/>
+              <w:b w:val="false"/>
+              <w:bCs w:val="false"/>
+              <w:i w:val="false"/>
+              <w:i w:val="false"/>
+              <w:iCs w:val="false"/>
               <w:sz w:val="15"/>
               <w:szCs w:val="15"/>
             </w:rPr>
           </w:pPr>
           <w:r>
             <w:rPr>
-              <w:rFonts w:ascii="Open Sans" w:hAnsi="Open Sans" w:eastAsia="Open Sans" w:cs="Open Sans"/>
-              <w:b w:val="0"/>
-              <w:bCs w:val="0"/>
-              <w:i w:val="0"/>
-              <w:iCs w:val="0"/>
+              <w:rFonts w:eastAsia="Open Sans" w:cs="Open Sans" w:ascii="Open Sans" w:hAnsi="Open Sans"/>
+              <w:b w:val="false"/>
+              <w:bCs w:val="false"/>
+              <w:i w:val="false"/>
+              <w:iCs w:val="false"/>
               <w:sz w:val="15"/>
               <w:szCs w:val="15"/>
               <w:lang w:val="pl-PL"/>
@@ -3222,26 +3206,28 @@
         </w:p>
         <w:p>
           <w:pPr>
-            <w:widowControl w:val="0"/>
+            <w:pStyle w:val="Normal"/>
+            <w:widowControl w:val="false"/>
             <w:spacing w:before="0" w:after="0"/>
             <w:jc w:val="center"/>
             <w:rPr>
               <w:rFonts w:ascii="Open Sans" w:hAnsi="Open Sans" w:eastAsia="Open Sans" w:cs="Open Sans"/>
-              <w:b w:val="0"/>
-              <w:bCs w:val="0"/>
-              <w:i w:val="0"/>
-              <w:iCs w:val="0"/>
+              <w:b w:val="false"/>
+              <w:bCs w:val="false"/>
+              <w:i w:val="false"/>
+              <w:i w:val="false"/>
+              <w:iCs w:val="false"/>
               <w:sz w:val="15"/>
               <w:szCs w:val="15"/>
             </w:rPr>
           </w:pPr>
           <w:r>
             <w:rPr>
-              <w:rFonts w:ascii="Open Sans" w:hAnsi="Open Sans" w:eastAsia="Open Sans" w:cs="Open Sans"/>
-              <w:b w:val="0"/>
-              <w:bCs w:val="0"/>
-              <w:i w:val="0"/>
-              <w:iCs w:val="0"/>
+              <w:rFonts w:eastAsia="Open Sans" w:cs="Open Sans" w:ascii="Open Sans" w:hAnsi="Open Sans"/>
+              <w:b w:val="false"/>
+              <w:bCs w:val="false"/>
+              <w:i w:val="false"/>
+              <w:iCs w:val="false"/>
               <w:sz w:val="15"/>
               <w:szCs w:val="15"/>
               <w:lang w:val="pl-PL"/>
@@ -3251,24 +3237,26 @@
         </w:p>
         <w:p>
           <w:pPr>
-            <w:widowControl w:val="0"/>
+            <w:pStyle w:val="Normal"/>
+            <w:widowControl w:val="false"/>
             <w:spacing w:before="0" w:after="0"/>
             <w:jc w:val="center"/>
             <w:rPr>
-              <w:b w:val="0"/>
-              <w:bCs w:val="0"/>
-              <w:i w:val="0"/>
-              <w:iCs w:val="0"/>
+              <w:b w:val="false"/>
+              <w:bCs w:val="false"/>
+              <w:i w:val="false"/>
+              <w:i w:val="false"/>
+              <w:iCs w:val="false"/>
               <w:lang w:val="pl-PL"/>
             </w:rPr>
           </w:pPr>
           <w:r>
             <w:rPr>
-              <w:rFonts w:ascii="Open Sans" w:hAnsi="Open Sans" w:eastAsia="Open Sans" w:cs="Open Sans"/>
-              <w:b w:val="0"/>
-              <w:bCs w:val="0"/>
-              <w:i w:val="0"/>
-              <w:iCs w:val="0"/>
+              <w:rFonts w:eastAsia="Open Sans" w:cs="Open Sans" w:ascii="Open Sans" w:hAnsi="Open Sans"/>
+              <w:b w:val="false"/>
+              <w:bCs w:val="false"/>
+              <w:i w:val="false"/>
+              <w:iCs w:val="false"/>
               <w:sz w:val="15"/>
               <w:szCs w:val="15"/>
               <w:lang w:val="pl-PL"/>
@@ -3278,26 +3266,28 @@
         </w:p>
         <w:p>
           <w:pPr>
-            <w:widowControl w:val="0"/>
+            <w:pStyle w:val="Normal"/>
+            <w:widowControl w:val="false"/>
             <w:spacing w:before="0" w:after="0"/>
             <w:jc w:val="center"/>
             <w:rPr>
               <w:rFonts w:ascii="Open Sans" w:hAnsi="Open Sans" w:eastAsia="Open Sans" w:cs="Open Sans"/>
-              <w:b w:val="0"/>
-              <w:bCs w:val="0"/>
-              <w:i w:val="0"/>
-              <w:iCs w:val="0"/>
+              <w:b w:val="false"/>
+              <w:bCs w:val="false"/>
+              <w:i w:val="false"/>
+              <w:i w:val="false"/>
+              <w:iCs w:val="false"/>
               <w:sz w:val="15"/>
               <w:szCs w:val="15"/>
             </w:rPr>
           </w:pPr>
           <w:r>
             <w:rPr>
-              <w:rFonts w:ascii="Open Sans" w:hAnsi="Open Sans" w:eastAsia="Open Sans" w:cs="Open Sans"/>
-              <w:b w:val="0"/>
-              <w:bCs w:val="0"/>
-              <w:i w:val="0"/>
-              <w:iCs w:val="0"/>
+              <w:rFonts w:eastAsia="Open Sans" w:cs="Open Sans" w:ascii="Open Sans" w:hAnsi="Open Sans"/>
+              <w:b w:val="false"/>
+              <w:bCs w:val="false"/>
+              <w:i w:val="false"/>
+              <w:iCs w:val="false"/>
               <w:sz w:val="15"/>
               <w:szCs w:val="15"/>
               <w:lang w:val="pl-PL"/>
@@ -3308,118 +3298,81 @@
       </w:tc>
       <w:tc>
         <w:tcPr>
-          <w:tcW w:w="3158" w:type="dxa"/>
-          <w:tcMar>
-            <w:top w:w="45" w:type="dxa"/>
-            <w:left w:w="45" w:type="dxa"/>
-            <w:bottom w:w="45" w:type="dxa"/>
-            <w:right w:w="45" w:type="dxa"/>
-          </w:tcMar>
+          <w:tcW w:w="3159" w:type="dxa"/>
+          <w:tcBorders>
+            <w:top w:val="single" w:sz="18" w:space="0" w:color="2E74B5"/>
+          </w:tcBorders>
           <w:vAlign w:val="center"/>
         </w:tcPr>
         <w:p>
           <w:pPr>
-            <w:widowControl w:val="0"/>
+            <w:pStyle w:val="Normal"/>
+            <w:widowControl w:val="false"/>
             <w:spacing w:before="0" w:after="0"/>
             <w:jc w:val="center"/>
             <w:rPr>
               <w:rFonts w:ascii="Open Sans" w:hAnsi="Open Sans" w:eastAsia="Open Sans" w:cs="Open Sans"/>
-              <w:b w:val="0"/>
-              <w:bCs w:val="0"/>
-              <w:i w:val="0"/>
-              <w:iCs w:val="0"/>
+              <w:b w:val="false"/>
+              <w:bCs w:val="false"/>
+              <w:i w:val="false"/>
+              <w:i w:val="false"/>
+              <w:iCs w:val="false"/>
               <w:sz w:val="15"/>
               <w:szCs w:val="15"/>
             </w:rPr>
           </w:pPr>
           <w:r>
             <w:rPr>
-              <w:rFonts w:ascii="Open Sans" w:hAnsi="Open Sans" w:eastAsia="Open Sans" w:cs="Open Sans"/>
-              <w:b w:val="0"/>
-              <w:bCs w:val="0"/>
-              <w:i w:val="0"/>
-              <w:iCs w:val="0"/>
+              <w:rFonts w:eastAsia="Open Sans" w:cs="Open Sans" w:ascii="Open Sans" w:hAnsi="Open Sans"/>
+              <w:b w:val="false"/>
+              <w:bCs w:val="false"/>
+              <w:i w:val="false"/>
+              <w:iCs w:val="false"/>
               <w:sz w:val="15"/>
               <w:szCs w:val="15"/>
               <w:lang w:val="pl-PL"/>
             </w:rPr>
-            <w:t>Hof</w:t>
-          </w:r>
-          <w:r>
-            <w:rPr>
-              <w:rFonts w:ascii="Open Sans" w:hAnsi="Open Sans" w:eastAsia="Open Sans" w:cs="Open Sans"/>
-              <w:b w:val="0"/>
-              <w:bCs w:val="0"/>
-              <w:i w:val="0"/>
-              <w:iCs w:val="0"/>
-              <w:sz w:val="15"/>
-              <w:szCs w:val="15"/>
-              <w:lang w:val="pl-PL"/>
-            </w:rPr>
-            <w:t>/</w:t>
-          </w:r>
-          <w:r>
-            <w:rPr>
-              <w:rFonts w:ascii="Open Sans" w:hAnsi="Open Sans" w:eastAsia="Open Sans" w:cs="Open Sans"/>
-              <w:b w:val="0"/>
-              <w:bCs w:val="0"/>
-              <w:i w:val="0"/>
-              <w:iCs w:val="0"/>
-              <w:sz w:val="15"/>
-              <w:szCs w:val="15"/>
-              <w:lang w:val="pl-PL"/>
-            </w:rPr>
-            <w:t>Saale</w:t>
+            <w:t>Hof/Saale</w:t>
           </w:r>
         </w:p>
         <w:p>
           <w:pPr>
             <w:pStyle w:val="Normal"/>
-            <w:widowControl w:val="0"/>
+            <w:widowControl w:val="false"/>
             <w:suppressLineNumbers w:val="0"/>
             <w:bidi w:val="0"/>
-            <w:spacing w:before="0" w:beforeAutospacing="off" w:after="0" w:afterAutospacing="off" w:line="259" w:lineRule="auto"/>
+            <w:spacing w:lineRule="auto" w:line="259" w:beforeAutospacing="0" w:before="0" w:afterAutospacing="0" w:after="0"/>
             <w:ind w:left="0" w:right="0"/>
             <w:jc w:val="center"/>
+            <w:rPr/>
           </w:pPr>
           <w:r>
             <w:rPr>
-              <w:rFonts w:ascii="Open Sans" w:hAnsi="Open Sans" w:eastAsia="Open Sans" w:cs="Open Sans"/>
-              <w:b w:val="0"/>
-              <w:bCs w:val="0"/>
-              <w:i w:val="0"/>
-              <w:iCs w:val="0"/>
+              <w:rFonts w:eastAsia="Open Sans" w:cs="Open Sans" w:ascii="Open Sans" w:hAnsi="Open Sans"/>
+              <w:b w:val="false"/>
+              <w:bCs w:val="false"/>
+              <w:i w:val="false"/>
+              <w:iCs w:val="false"/>
               <w:sz w:val="15"/>
               <w:szCs w:val="15"/>
               <w:lang w:val="pl-PL"/>
             </w:rPr>
-            <w:t>USt.</w:t>
-          </w:r>
-          <w:r>
-            <w:rPr>
-              <w:rFonts w:ascii="Open Sans" w:hAnsi="Open Sans" w:eastAsia="Open Sans" w:cs="Open Sans"/>
-              <w:b w:val="0"/>
-              <w:bCs w:val="0"/>
-              <w:i w:val="0"/>
-              <w:iCs w:val="0"/>
-              <w:sz w:val="15"/>
-              <w:szCs w:val="15"/>
-              <w:lang w:val="pl-PL"/>
-            </w:rPr>
-            <w:t>-ID: DE296903997</w:t>
+            <w:t>USt.-ID: DE296903997</w:t>
           </w:r>
         </w:p>
         <w:p>
           <w:pPr>
-            <w:widowControl w:val="0"/>
+            <w:pStyle w:val="Normal"/>
+            <w:widowControl w:val="false"/>
             <w:spacing w:before="0" w:after="0"/>
             <w:jc w:val="center"/>
             <w:rPr>
               <w:rFonts w:ascii="Open Sans" w:hAnsi="Open Sans" w:eastAsia="Open Sans" w:cs="Open Sans"/>
-              <w:b w:val="0"/>
-              <w:bCs w:val="0"/>
-              <w:i w:val="0"/>
-              <w:iCs w:val="0"/>
+              <w:b w:val="false"/>
+              <w:bCs w:val="false"/>
+              <w:i w:val="false"/>
+              <w:i w:val="false"/>
+              <w:iCs w:val="false"/>
               <w:sz w:val="15"/>
               <w:szCs w:val="15"/>
               <w:lang w:val="en-US"/>
@@ -3427,81 +3380,56 @@
           </w:pPr>
           <w:r>
             <w:rPr>
-              <w:rFonts w:ascii="Open Sans" w:hAnsi="Open Sans" w:eastAsia="Open Sans" w:cs="Open Sans"/>
-              <w:b w:val="0"/>
-              <w:bCs w:val="0"/>
-              <w:i w:val="0"/>
-              <w:iCs w:val="0"/>
+              <w:rFonts w:eastAsia="Open Sans" w:cs="Open Sans" w:ascii="Open Sans" w:hAnsi="Open Sans"/>
+              <w:b w:val="false"/>
+              <w:bCs w:val="false"/>
+              <w:i w:val="false"/>
+              <w:iCs w:val="false"/>
               <w:sz w:val="15"/>
               <w:szCs w:val="15"/>
               <w:lang w:val="pl-PL"/>
             </w:rPr>
-            <w:t xml:space="preserve">Inhaber: </w:t>
-          </w:r>
-          <w:r>
-            <w:rPr>
-              <w:rFonts w:ascii="Open Sans" w:hAnsi="Open Sans" w:eastAsia="Open Sans" w:cs="Open Sans"/>
-              <w:b w:val="0"/>
-              <w:bCs w:val="0"/>
-              <w:i w:val="0"/>
-              <w:iCs w:val="0"/>
-              <w:sz w:val="15"/>
-              <w:szCs w:val="15"/>
-              <w:lang w:val="pl-PL"/>
-            </w:rPr>
-            <w:t>Attila</w:t>
-          </w:r>
-          <w:r>
-            <w:rPr>
-              <w:rFonts w:ascii="Open Sans" w:hAnsi="Open Sans" w:eastAsia="Open Sans" w:cs="Open Sans"/>
-              <w:b w:val="0"/>
-              <w:bCs w:val="0"/>
-              <w:i w:val="0"/>
-              <w:iCs w:val="0"/>
-              <w:sz w:val="15"/>
-              <w:szCs w:val="15"/>
-              <w:lang w:val="pl-PL"/>
-            </w:rPr>
-            <w:t xml:space="preserve"> </w:t>
-          </w:r>
-          <w:r>
-            <w:rPr>
-              <w:rFonts w:ascii="Open Sans" w:hAnsi="Open Sans" w:eastAsia="Open Sans" w:cs="Open Sans"/>
-              <w:b w:val="0"/>
-              <w:bCs w:val="0"/>
-              <w:i w:val="0"/>
-              <w:iCs w:val="0"/>
-              <w:sz w:val="15"/>
-              <w:szCs w:val="15"/>
-              <w:lang w:val="pl-PL"/>
-            </w:rPr>
-            <w:t>Landgrafe</w:t>
+            <w:t>Inhaber: Attila Landgrafe</w:t>
           </w:r>
         </w:p>
         <w:p>
           <w:pPr>
-            <w:widowControl w:val="0"/>
+            <w:pStyle w:val="Normal"/>
+            <w:widowControl w:val="false"/>
             <w:spacing w:before="0" w:after="0"/>
             <w:jc w:val="center"/>
             <w:rPr>
               <w:rFonts w:ascii="Open Sans" w:hAnsi="Open Sans" w:eastAsia="Open Sans" w:cs="Open Sans"/>
-              <w:b w:val="0"/>
-              <w:bCs w:val="0"/>
-              <w:i w:val="0"/>
-              <w:iCs w:val="0"/>
+              <w:b w:val="false"/>
+              <w:bCs w:val="false"/>
+              <w:i w:val="false"/>
+              <w:i w:val="false"/>
+              <w:iCs w:val="false"/>
               <w:sz w:val="15"/>
               <w:szCs w:val="15"/>
               <w:lang w:val="en-US"/>
             </w:rPr>
           </w:pPr>
+          <w:r>
+            <w:rPr>
+              <w:rFonts w:eastAsia="Open Sans" w:cs="Open Sans" w:ascii="Open Sans" w:hAnsi="Open Sans"/>
+              <w:b w:val="false"/>
+              <w:bCs w:val="false"/>
+              <w:i w:val="false"/>
+              <w:iCs w:val="false"/>
+              <w:sz w:val="15"/>
+              <w:szCs w:val="15"/>
+              <w:lang w:val="en-US"/>
+            </w:rPr>
+          </w:r>
         </w:p>
       </w:tc>
     </w:tr>
   </w:tbl>
-  <w:p xmlns:wp14="http://schemas.microsoft.com/office/word/2010/wordml" wp14:textId="5612AD8F">
+  <w:p>
     <w:pPr>
       <w:pStyle w:val="normal1"/>
-      <w:spacing w:before="240" w:after="240" w:line="14" w:lineRule="auto"/>
+      <w:spacing w:lineRule="auto" w:line="14" w:before="240" w:after="240"/>
       <w:jc w:val="right"/>
       <w:rPr>
         <w:sz w:val="16"/>
@@ -3517,41 +3445,71 @@
     </w:r>
     <w:r>
       <w:rPr>
-        <w:rFonts w:ascii="Open Sans" w:hAnsi="Open Sans" w:eastAsia="Open Sans" w:cs="Open Sans"/>
-        <w:b w:val="0"/>
-        <w:bCs w:val="0"/>
-        <w:i w:val="0"/>
-        <w:iCs w:val="0"/>
+        <w:rFonts w:eastAsia="Open Sans" w:cs="Open Sans" w:ascii="Open Sans" w:hAnsi="Open Sans"/>
+        <w:b w:val="false"/>
+        <w:bCs w:val="false"/>
+        <w:i w:val="false"/>
+        <w:iCs w:val="false"/>
         <w:sz w:val="15"/>
         <w:szCs w:val="15"/>
       </w:rPr>
       <w:fldChar w:fldCharType="begin"/>
     </w:r>
     <w:r>
-      <w:instrText xml:space="preserve">PAGE</w:instrText>
+      <w:rPr>
+        <w:sz w:val="15"/>
+        <w:i w:val="false"/>
+        <w:b w:val="false"/>
+        <w:szCs w:val="15"/>
+        <w:iCs w:val="false"/>
+        <w:bCs w:val="false"/>
+        <w:rFonts w:eastAsia="Open Sans" w:cs="Open Sans" w:ascii="Open Sans" w:hAnsi="Open Sans"/>
+      </w:rPr>
+      <w:instrText xml:space="preserve"> PAGE </w:instrText>
     </w:r>
     <w:r>
+      <w:rPr>
+        <w:sz w:val="15"/>
+        <w:i w:val="false"/>
+        <w:b w:val="false"/>
+        <w:szCs w:val="15"/>
+        <w:iCs w:val="false"/>
+        <w:bCs w:val="false"/>
+        <w:rFonts w:eastAsia="Open Sans" w:cs="Open Sans" w:ascii="Open Sans" w:hAnsi="Open Sans"/>
+      </w:rPr>
       <w:fldChar w:fldCharType="separate"/>
     </w:r>
     <w:r>
       <w:rPr>
-        <w:rFonts w:ascii="Open Sans" w:hAnsi="Open Sans" w:eastAsia="Open Sans" w:cs="Open Sans"/>
-        <w:b w:val="0"/>
-        <w:bCs w:val="0"/>
-        <w:i w:val="0"/>
-        <w:iCs w:val="0"/>
         <w:sz w:val="15"/>
+        <w:i w:val="false"/>
+        <w:b w:val="false"/>
         <w:szCs w:val="15"/>
+        <w:iCs w:val="false"/>
+        <w:bCs w:val="false"/>
+        <w:rFonts w:eastAsia="Open Sans" w:cs="Open Sans" w:ascii="Open Sans" w:hAnsi="Open Sans"/>
+      </w:rPr>
+      <w:t>3</w:t>
+    </w:r>
+    <w:r>
+      <w:rPr>
+        <w:sz w:val="15"/>
+        <w:i w:val="false"/>
+        <w:b w:val="false"/>
+        <w:szCs w:val="15"/>
+        <w:iCs w:val="false"/>
+        <w:bCs w:val="false"/>
+        <w:rFonts w:eastAsia="Open Sans" w:cs="Open Sans" w:ascii="Open Sans" w:hAnsi="Open Sans"/>
       </w:rPr>
       <w:fldChar w:fldCharType="end"/>
     </w:r>
     <w:r>
       <w:rPr>
-        <w:rFonts w:ascii="Open Sans" w:hAnsi="Open Sans" w:eastAsia="Open Sans" w:cs="Open Sans"/>
-        <w:b w:val="0"/>
-        <w:bCs w:val="0"/>
-        <w:i w:val="0"/>
-        <w:iCs w:val="0"/>
+        <w:rFonts w:eastAsia="Open Sans" w:cs="Open Sans" w:ascii="Open Sans" w:hAnsi="Open Sans"/>
+        <w:b w:val="false"/>
+        <w:bCs w:val="false"/>
+        <w:i w:val="false"/>
+        <w:iCs w:val="false"/>
         <w:sz w:val="15"/>
         <w:szCs w:val="15"/>
       </w:rPr>
@@ -3559,31 +3517,61 @@
     </w:r>
     <w:r>
       <w:rPr>
-        <w:rFonts w:ascii="Open Sans" w:hAnsi="Open Sans" w:eastAsia="Open Sans" w:cs="Open Sans"/>
-        <w:b w:val="0"/>
-        <w:bCs w:val="0"/>
-        <w:i w:val="0"/>
-        <w:iCs w:val="0"/>
+        <w:rFonts w:eastAsia="Open Sans" w:cs="Open Sans" w:ascii="Open Sans" w:hAnsi="Open Sans"/>
+        <w:b w:val="false"/>
+        <w:bCs w:val="false"/>
+        <w:i w:val="false"/>
+        <w:iCs w:val="false"/>
         <w:sz w:val="15"/>
         <w:szCs w:val="15"/>
       </w:rPr>
       <w:fldChar w:fldCharType="begin"/>
     </w:r>
     <w:r>
-      <w:instrText xml:space="preserve">NUMPAGES</w:instrText>
+      <w:rPr>
+        <w:sz w:val="15"/>
+        <w:i w:val="false"/>
+        <w:b w:val="false"/>
+        <w:szCs w:val="15"/>
+        <w:iCs w:val="false"/>
+        <w:bCs w:val="false"/>
+        <w:rFonts w:eastAsia="Open Sans" w:cs="Open Sans" w:ascii="Open Sans" w:hAnsi="Open Sans"/>
+      </w:rPr>
+      <w:instrText xml:space="preserve"> NUMPAGES </w:instrText>
     </w:r>
     <w:r>
+      <w:rPr>
+        <w:sz w:val="15"/>
+        <w:i w:val="false"/>
+        <w:b w:val="false"/>
+        <w:szCs w:val="15"/>
+        <w:iCs w:val="false"/>
+        <w:bCs w:val="false"/>
+        <w:rFonts w:eastAsia="Open Sans" w:cs="Open Sans" w:ascii="Open Sans" w:hAnsi="Open Sans"/>
+      </w:rPr>
       <w:fldChar w:fldCharType="separate"/>
     </w:r>
     <w:r>
       <w:rPr>
-        <w:rFonts w:ascii="Open Sans" w:hAnsi="Open Sans" w:eastAsia="Open Sans" w:cs="Open Sans"/>
-        <w:b w:val="0"/>
-        <w:bCs w:val="0"/>
-        <w:i w:val="0"/>
-        <w:iCs w:val="0"/>
         <w:sz w:val="15"/>
+        <w:i w:val="false"/>
+        <w:b w:val="false"/>
         <w:szCs w:val="15"/>
+        <w:iCs w:val="false"/>
+        <w:bCs w:val="false"/>
+        <w:rFonts w:eastAsia="Open Sans" w:cs="Open Sans" w:ascii="Open Sans" w:hAnsi="Open Sans"/>
+      </w:rPr>
+      <w:t>3</w:t>
+    </w:r>
+    <w:r>
+      <w:rPr>
+        <w:sz w:val="15"/>
+        <w:i w:val="false"/>
+        <w:b w:val="false"/>
+        <w:szCs w:val="15"/>
+        <w:iCs w:val="false"/>
+        <w:bCs w:val="false"/>
+        <w:rFonts w:eastAsia="Open Sans" w:cs="Open Sans" w:ascii="Open Sans" w:hAnsi="Open Sans"/>
       </w:rPr>
       <w:fldChar w:fldCharType="end"/>
     </w:r>
@@ -3594,299 +3582,585 @@
       </w:rPr>
       <w:t xml:space="preserve"> </w:t>
     </w:r>
-    <w:r>
-      <w:rPr/>
-    </w:r>
   </w:p>
 </w:ftr>
 </file>
 
 <file path=word/footer3.xml><?xml version="1.0" encoding="utf-8"?>
 <w:ftr xmlns:o="urn:schemas-microsoft-com:office:office" xmlns:r="http://schemas.openxmlformats.org/officeDocument/2006/relationships" xmlns:v="urn:schemas-microsoft-com:vml" xmlns:w="http://schemas.openxmlformats.org/wordprocessingml/2006/main" xmlns:w10="urn:schemas-microsoft-com:office:word" xmlns:wp="http://schemas.openxmlformats.org/drawingml/2006/wordprocessingDrawing" xmlns:pic="http://schemas.openxmlformats.org/drawingml/2006/picture" xmlns:wps="http://schemas.microsoft.com/office/word/2010/wordprocessingShape" xmlns:wpg="http://schemas.microsoft.com/office/word/2010/wordprocessingGroup" xmlns:mc="http://schemas.openxmlformats.org/markup-compatibility/2006" xmlns:wp14="http://schemas.microsoft.com/office/word/2010/wordprocessingDrawing" xmlns:w14="http://schemas.microsoft.com/office/word/2010/wordml" xmlns:w15="http://schemas.microsoft.com/office/word/2012/wordml" mc:Ignorable="w14 wp14 w15">
-  <w:p xmlns:wp14="http://schemas.microsoft.com/office/word/2010/wordml" wp14:textId="77777777">
-    <w:pPr>
-      <w:pStyle w:val="normal1"/>
-      <w:spacing w:before="240" w:after="240" w:line="14" w:lineRule="auto"/>
-      <w:rPr/>
-    </w:pPr>
-    <w:r>
-      <w:rPr/>
-    </w:r>
-  </w:p>
   <w:tbl>
     <w:tblPr>
-      <w:tblStyle w:val="NormalTable0"/>
-      <w:tblW w:w="9885" w:type="dxa"/>
+      <w:tblStyle w:val="Standardowy"/>
+      <w:tblW w:w="9475" w:type="dxa"/>
       <w:jc w:val="left"/>
-      <w:tblInd w:w="0" w:type="dxa"/>
+      <w:tblInd w:w="-63" w:type="dxa"/>
       <w:tblLayout w:type="fixed"/>
       <w:tblCellMar>
-        <w:top w:w="0" w:type="dxa"/>
-        <w:left w:w="10" w:type="dxa"/>
-        <w:bottom w:w="0" w:type="dxa"/>
-        <w:right w:w="10" w:type="dxa"/>
+        <w:top w:w="45" w:type="dxa"/>
+        <w:left w:w="45" w:type="dxa"/>
+        <w:bottom w:w="45" w:type="dxa"/>
+        <w:right w:w="45" w:type="dxa"/>
       </w:tblCellMar>
-      <w:tblLook w:val="04a0" w:firstRow="1" w:lastRow="0" w:firstColumn="1" w:lastColumn="0" w:noHBand="0" w:noVBand="1"/>
+      <w:tblLook w:val="0600" w:noVBand="1" w:noHBand="1" w:lastColumn="0" w:firstColumn="0" w:lastRow="0" w:firstRow="0"/>
     </w:tblPr>
     <w:tblGrid>
-      <w:gridCol w:w="8056"/>
-      <w:gridCol w:w="1828"/>
+      <w:gridCol w:w="3158"/>
+      <w:gridCol w:w="3158"/>
+      <w:gridCol w:w="3159"/>
     </w:tblGrid>
-    <w:tr xmlns:wp14="http://schemas.microsoft.com/office/word/2010/wordml" wp14:textId="77777777">
+    <w:tr>
       <w:trPr>
-        <w:trHeight w:val="20" w:hRule="atLeast"/>
+        <w:trHeight w:val="660" w:hRule="atLeast"/>
       </w:trPr>
       <w:tc>
         <w:tcPr>
-          <w:tcW w:w="8056" w:type="dxa"/>
+          <w:tcW w:w="3158" w:type="dxa"/>
           <w:tcBorders>
-            <w:top w:val="single" w:color="FFFFFF" w:sz="8" w:space="0"/>
-            <w:left w:val="single" w:color="FFFFFF" w:sz="8" w:space="0"/>
-            <w:bottom w:val="single" w:color="FFFFFF" w:sz="8" w:space="0"/>
-            <w:right w:val="single" w:color="FFFFFF" w:sz="8" w:space="0"/>
+            <w:top w:val="single" w:sz="18" w:space="0" w:color="2E74B5"/>
           </w:tcBorders>
-          <w:vAlign w:val="bottom"/>
+          <w:vAlign w:val="center"/>
         </w:tcPr>
-        <w:p wp14:textId="77777777">
+        <w:p>
           <w:pPr>
             <w:pStyle w:val="Normal"/>
-            <w:keepLines/>
-            <w:suppressAutoHyphens w:val="true"/>
+            <w:widowControl w:val="false"/>
             <w:spacing w:before="0" w:after="0"/>
-            <w:ind w:left="720"/>
             <w:jc w:val="center"/>
             <w:rPr>
-              <w:sz w:val="14"/>
-              <w:szCs w:val="14"/>
-              <w:lang w:val="de-DE"/>
+              <w:rFonts w:ascii="Open Sans" w:hAnsi="Open Sans" w:eastAsia="Open Sans" w:cs="Open Sans"/>
+              <w:b w:val="false"/>
+              <w:bCs w:val="false"/>
+              <w:i w:val="false"/>
+              <w:i w:val="false"/>
+              <w:iCs w:val="false"/>
+              <w:sz w:val="15"/>
+              <w:szCs w:val="15"/>
             </w:rPr>
           </w:pPr>
           <w:r>
             <w:rPr>
-              <w:rFonts w:eastAsia="Calibri" w:cs="Calibri"/>
-              <w:kern w:val="0"/>
-              <w:sz w:val="14"/>
-              <w:szCs w:val="14"/>
-              <w:lang w:val="de-DE" w:eastAsia="pl-PL" w:bidi="ar-SA"/>
+              <w:rFonts w:eastAsia="Open Sans" w:cs="Open Sans" w:ascii="Open Sans" w:hAnsi="Open Sans"/>
+              <w:b w:val="false"/>
+              <w:bCs w:val="false"/>
+              <w:i w:val="false"/>
+              <w:iCs w:val="false"/>
+              <w:sz w:val="15"/>
+              <w:szCs w:val="15"/>
+              <w:lang w:val="pl-PL"/>
             </w:rPr>
-            <w:t>EmC2 Attila Landgrafe | Waldstraße 5 | 95032 Hof</w:t>
+            <w:t>emc2 Atilla Landgrafe</w:t>
           </w:r>
         </w:p>
-        <w:p wp14:textId="77777777">
+        <w:p>
           <w:pPr>
             <w:pStyle w:val="Normal"/>
-            <w:keepLines/>
-            <w:suppressAutoHyphens w:val="true"/>
+            <w:widowControl w:val="false"/>
             <w:spacing w:before="0" w:after="0"/>
-            <w:ind w:left="720"/>
             <w:jc w:val="center"/>
             <w:rPr>
-              <w:sz w:val="14"/>
-              <w:szCs w:val="14"/>
-              <w:lang w:val="de-DE"/>
+              <w:rFonts w:ascii="Open Sans" w:hAnsi="Open Sans" w:eastAsia="Open Sans" w:cs="Open Sans"/>
+              <w:b w:val="false"/>
+              <w:bCs w:val="false"/>
+              <w:i w:val="false"/>
+              <w:i w:val="false"/>
+              <w:iCs w:val="false"/>
+              <w:sz w:val="15"/>
+              <w:szCs w:val="15"/>
             </w:rPr>
           </w:pPr>
           <w:r>
             <w:rPr>
-              <w:rFonts w:eastAsia="Calibri" w:cs="Calibri"/>
-              <w:kern w:val="0"/>
-              <w:sz w:val="14"/>
-              <w:szCs w:val="14"/>
-              <w:lang w:val="de-DE" w:eastAsia="pl-PL" w:bidi="ar-SA"/>
+              <w:rFonts w:eastAsia="Open Sans" w:cs="Open Sans" w:ascii="Open Sans" w:hAnsi="Open Sans"/>
+              <w:b w:val="false"/>
+              <w:bCs w:val="false"/>
+              <w:i w:val="false"/>
+              <w:iCs w:val="false"/>
+              <w:sz w:val="15"/>
+              <w:szCs w:val="15"/>
+              <w:lang w:val="pl-PL"/>
             </w:rPr>
-            <w:t>Steuernummer: 22324320478 | USt-IdNr.: DE296903997</w:t>
+            <w:t>Waldstraße 5</w:t>
           </w:r>
         </w:p>
-        <w:p wp14:textId="77777777">
+        <w:p>
           <w:pPr>
             <w:pStyle w:val="Normal"/>
-            <w:keepLines/>
-            <w:suppressAutoHyphens w:val="true"/>
+            <w:widowControl w:val="false"/>
             <w:spacing w:before="0" w:after="0"/>
-            <w:ind w:left="720"/>
             <w:jc w:val="center"/>
             <w:rPr>
-              <w:sz w:val="14"/>
-              <w:szCs w:val="14"/>
-              <w:lang w:val="de-DE"/>
+              <w:rFonts w:ascii="Open Sans" w:hAnsi="Open Sans" w:eastAsia="Open Sans" w:cs="Open Sans"/>
+              <w:b w:val="false"/>
+              <w:bCs w:val="false"/>
+              <w:i w:val="false"/>
+              <w:i w:val="false"/>
+              <w:iCs w:val="false"/>
+              <w:sz w:val="15"/>
+              <w:szCs w:val="15"/>
             </w:rPr>
           </w:pPr>
           <w:r>
             <w:rPr>
-              <w:rFonts w:eastAsia="Calibri" w:cs="Calibri"/>
-              <w:kern w:val="0"/>
-              <w:sz w:val="14"/>
-              <w:szCs w:val="14"/>
-              <w:lang w:val="de-DE" w:eastAsia="pl-PL" w:bidi="ar-SA"/>
+              <w:rFonts w:eastAsia="Open Sans" w:cs="Open Sans" w:ascii="Open Sans" w:hAnsi="Open Sans"/>
+              <w:b w:val="false"/>
+              <w:bCs w:val="false"/>
+              <w:i w:val="false"/>
+              <w:iCs w:val="false"/>
+              <w:sz w:val="15"/>
+              <w:szCs w:val="15"/>
+              <w:lang w:val="pl-PL"/>
             </w:rPr>
-            <w:t>VR Bank Bayreuth-Hof eG | IBAN: DE43 7806 0896 0007 0794 43 | BIC: GENODEF1HO1</w:t>
+            <w:t>95032 Hof</w:t>
+          </w:r>
+        </w:p>
+        <w:p>
+          <w:pPr>
+            <w:pStyle w:val="Normal"/>
+            <w:widowControl w:val="false"/>
+            <w:spacing w:before="0" w:after="0"/>
+            <w:jc w:val="center"/>
+            <w:rPr>
+              <w:rFonts w:ascii="Open Sans" w:hAnsi="Open Sans" w:eastAsia="Open Sans" w:cs="Open Sans"/>
+              <w:b w:val="false"/>
+              <w:bCs w:val="false"/>
+              <w:i w:val="false"/>
+              <w:i w:val="false"/>
+              <w:iCs w:val="false"/>
+              <w:sz w:val="15"/>
+              <w:szCs w:val="15"/>
+            </w:rPr>
+          </w:pPr>
+          <w:r>
+            <w:rPr>
+              <w:rFonts w:eastAsia="Open Sans" w:cs="Open Sans" w:ascii="Open Sans" w:hAnsi="Open Sans"/>
+              <w:b w:val="false"/>
+              <w:bCs w:val="false"/>
+              <w:i w:val="false"/>
+              <w:iCs w:val="false"/>
+              <w:sz w:val="15"/>
+              <w:szCs w:val="15"/>
+              <w:lang w:val="pl-PL"/>
+            </w:rPr>
+            <w:t>Deutschland</w:t>
           </w:r>
         </w:p>
       </w:tc>
       <w:tc>
         <w:tcPr>
-          <w:tcW w:w="1828" w:type="dxa"/>
+          <w:tcW w:w="3158" w:type="dxa"/>
           <w:tcBorders>
-            <w:top w:val="single" w:color="FFFFFF" w:sz="8" w:space="0"/>
-            <w:left w:val="single" w:color="FFFFFF" w:sz="8" w:space="0"/>
-            <w:bottom w:val="single" w:color="FFFFFF" w:sz="8" w:space="0"/>
-            <w:right w:val="single" w:color="FFFFFF" w:sz="8" w:space="0"/>
+            <w:top w:val="single" w:sz="18" w:space="0" w:color="2E74B5"/>
           </w:tcBorders>
+          <w:vAlign w:val="center"/>
         </w:tcPr>
-        <w:p wp14:textId="77777777">
+        <w:p>
           <w:pPr>
-            <w:pStyle w:val="normal1"/>
-            <w:suppressAutoHyphens w:val="true"/>
+            <w:pStyle w:val="Normal"/>
+            <w:widowControl w:val="false"/>
             <w:spacing w:before="0" w:after="0"/>
-            <w:jc w:val="right"/>
+            <w:jc w:val="center"/>
             <w:rPr>
-              <w:sz w:val="16"/>
-              <w:szCs w:val="16"/>
+              <w:rFonts w:ascii="Open Sans" w:hAnsi="Open Sans" w:eastAsia="Open Sans" w:cs="Open Sans"/>
+              <w:b w:val="false"/>
+              <w:bCs w:val="false"/>
+              <w:i w:val="false"/>
+              <w:i w:val="false"/>
+              <w:iCs w:val="false"/>
+              <w:sz w:val="15"/>
+              <w:szCs w:val="15"/>
             </w:rPr>
           </w:pPr>
           <w:r>
             <w:rPr>
-              <w:rFonts w:eastAsia="Calibri" w:cs="Calibri"/>
-              <w:kern w:val="0"/>
-              <w:sz w:val="16"/>
-              <w:szCs w:val="16"/>
-              <w:lang w:val="de-DE" w:eastAsia="pl-PL" w:bidi="ar-SA"/>
+              <w:rFonts w:eastAsia="Open Sans" w:cs="Open Sans" w:ascii="Open Sans" w:hAnsi="Open Sans"/>
+              <w:b w:val="false"/>
+              <w:bCs w:val="false"/>
+              <w:i w:val="false"/>
+              <w:iCs w:val="false"/>
+              <w:sz w:val="15"/>
+              <w:szCs w:val="15"/>
+              <w:lang w:val="pl-PL"/>
             </w:rPr>
-            <w:br/>
+            <w:t>Tel.: 09281 5915900</w:t>
           </w:r>
+        </w:p>
+        <w:p>
+          <w:pPr>
+            <w:pStyle w:val="Normal"/>
+            <w:widowControl w:val="false"/>
+            <w:spacing w:before="0" w:after="0"/>
+            <w:jc w:val="center"/>
+            <w:rPr>
+              <w:rFonts w:ascii="Open Sans" w:hAnsi="Open Sans" w:eastAsia="Open Sans" w:cs="Open Sans"/>
+              <w:b w:val="false"/>
+              <w:bCs w:val="false"/>
+              <w:i w:val="false"/>
+              <w:i w:val="false"/>
+              <w:iCs w:val="false"/>
+              <w:sz w:val="15"/>
+              <w:szCs w:val="15"/>
+            </w:rPr>
+          </w:pPr>
           <w:r>
             <w:rPr>
-              <w:rFonts w:eastAsia="Calibri" w:cs="Calibri"/>
-              <w:kern w:val="0"/>
-              <w:sz w:val="16"/>
-              <w:szCs w:val="16"/>
-              <w:lang w:val="pl-PL" w:eastAsia="pl-PL" w:bidi="ar-SA"/>
+              <w:rFonts w:eastAsia="Open Sans" w:cs="Open Sans" w:ascii="Open Sans" w:hAnsi="Open Sans"/>
+              <w:b w:val="false"/>
+              <w:bCs w:val="false"/>
+              <w:i w:val="false"/>
+              <w:iCs w:val="false"/>
+              <w:sz w:val="15"/>
+              <w:szCs w:val="15"/>
+              <w:lang w:val="pl-PL"/>
             </w:rPr>
-            <w:t xml:space="preserve">Seite </w:t>
+            <w:t>Fax.: 09281 5915909</w:t>
           </w:r>
+        </w:p>
+        <w:p>
+          <w:pPr>
+            <w:pStyle w:val="Normal"/>
+            <w:widowControl w:val="false"/>
+            <w:spacing w:before="0" w:after="0"/>
+            <w:jc w:val="center"/>
+            <w:rPr>
+              <w:b w:val="false"/>
+              <w:bCs w:val="false"/>
+              <w:i w:val="false"/>
+              <w:i w:val="false"/>
+              <w:iCs w:val="false"/>
+              <w:lang w:val="pl-PL"/>
+            </w:rPr>
+          </w:pPr>
           <w:r>
             <w:rPr>
-              <w:rFonts w:eastAsia="Calibri" w:cs="Calibri"/>
-              <w:kern w:val="0"/>
-              <w:sz w:val="22"/>
-              <w:szCs w:val="22"/>
-              <w:lang w:val="pl-PL" w:eastAsia="pl-PL" w:bidi="ar-SA"/>
+              <w:rFonts w:eastAsia="Open Sans" w:cs="Open Sans" w:ascii="Open Sans" w:hAnsi="Open Sans"/>
+              <w:b w:val="false"/>
+              <w:bCs w:val="false"/>
+              <w:i w:val="false"/>
+              <w:iCs w:val="false"/>
+              <w:sz w:val="15"/>
+              <w:szCs w:val="15"/>
+              <w:lang w:val="pl-PL"/>
             </w:rPr>
-            <w:fldChar w:fldCharType="begin"/>
+            <w:t>Email: kontact@e-m-c-2.de</w:t>
           </w:r>
+        </w:p>
+        <w:p>
+          <w:pPr>
+            <w:pStyle w:val="Normal"/>
+            <w:widowControl w:val="false"/>
+            <w:spacing w:before="0" w:after="0"/>
+            <w:jc w:val="center"/>
+            <w:rPr>
+              <w:rFonts w:ascii="Open Sans" w:hAnsi="Open Sans" w:eastAsia="Open Sans" w:cs="Open Sans"/>
+              <w:b w:val="false"/>
+              <w:bCs w:val="false"/>
+              <w:i w:val="false"/>
+              <w:i w:val="false"/>
+              <w:iCs w:val="false"/>
+              <w:sz w:val="15"/>
+              <w:szCs w:val="15"/>
+            </w:rPr>
+          </w:pPr>
           <w:r>
             <w:rPr>
-              <w:sz w:val="22"/>
-              <w:kern w:val="0"/>
-              <w:szCs w:val="22"/>
-              <w:rFonts w:eastAsia="Calibri" w:cs="Calibri"/>
-              <w:lang w:val="pl-PL" w:eastAsia="pl-PL" w:bidi="ar-SA"/>
+              <w:rFonts w:eastAsia="Open Sans" w:cs="Open Sans" w:ascii="Open Sans" w:hAnsi="Open Sans"/>
+              <w:b w:val="false"/>
+              <w:bCs w:val="false"/>
+              <w:i w:val="false"/>
+              <w:iCs w:val="false"/>
+              <w:sz w:val="15"/>
+              <w:szCs w:val="15"/>
+              <w:lang w:val="pl-PL"/>
             </w:rPr>
-            <w:instrText xml:space="preserve"> PAGE </w:instrText>
+            <w:t>Web: emczwei.de</w:t>
           </w:r>
+        </w:p>
+      </w:tc>
+      <w:tc>
+        <w:tcPr>
+          <w:tcW w:w="3159" w:type="dxa"/>
+          <w:tcBorders>
+            <w:top w:val="single" w:sz="18" w:space="0" w:color="2E74B5"/>
+          </w:tcBorders>
+          <w:vAlign w:val="center"/>
+        </w:tcPr>
+        <w:p>
+          <w:pPr>
+            <w:pStyle w:val="Normal"/>
+            <w:widowControl w:val="false"/>
+            <w:spacing w:before="0" w:after="0"/>
+            <w:jc w:val="center"/>
+            <w:rPr>
+              <w:rFonts w:ascii="Open Sans" w:hAnsi="Open Sans" w:eastAsia="Open Sans" w:cs="Open Sans"/>
+              <w:b w:val="false"/>
+              <w:bCs w:val="false"/>
+              <w:i w:val="false"/>
+              <w:i w:val="false"/>
+              <w:iCs w:val="false"/>
+              <w:sz w:val="15"/>
+              <w:szCs w:val="15"/>
+            </w:rPr>
+          </w:pPr>
           <w:r>
             <w:rPr>
-              <w:sz w:val="22"/>
-              <w:kern w:val="0"/>
-              <w:szCs w:val="22"/>
-              <w:rFonts w:eastAsia="Calibri" w:cs="Calibri"/>
-              <w:lang w:val="pl-PL" w:eastAsia="pl-PL" w:bidi="ar-SA"/>
+              <w:rFonts w:eastAsia="Open Sans" w:cs="Open Sans" w:ascii="Open Sans" w:hAnsi="Open Sans"/>
+              <w:b w:val="false"/>
+              <w:bCs w:val="false"/>
+              <w:i w:val="false"/>
+              <w:iCs w:val="false"/>
+              <w:sz w:val="15"/>
+              <w:szCs w:val="15"/>
+              <w:lang w:val="pl-PL"/>
             </w:rPr>
-            <w:fldChar w:fldCharType="separate"/>
+            <w:t>Hof/Saale</w:t>
           </w:r>
+        </w:p>
+        <w:p>
+          <w:pPr>
+            <w:pStyle w:val="Normal"/>
+            <w:widowControl w:val="false"/>
+            <w:suppressLineNumbers w:val="0"/>
+            <w:bidi w:val="0"/>
+            <w:spacing w:lineRule="auto" w:line="259" w:beforeAutospacing="0" w:before="0" w:afterAutospacing="0" w:after="0"/>
+            <w:ind w:left="0" w:right="0"/>
+            <w:jc w:val="center"/>
+            <w:rPr/>
+          </w:pPr>
           <w:r>
             <w:rPr>
-              <w:sz w:val="22"/>
-              <w:kern w:val="0"/>
-              <w:szCs w:val="22"/>
-              <w:rFonts w:eastAsia="Calibri" w:cs="Calibri"/>
-              <w:lang w:val="pl-PL" w:eastAsia="pl-PL" w:bidi="ar-SA"/>
+              <w:rFonts w:eastAsia="Open Sans" w:cs="Open Sans" w:ascii="Open Sans" w:hAnsi="Open Sans"/>
+              <w:b w:val="false"/>
+              <w:bCs w:val="false"/>
+              <w:i w:val="false"/>
+              <w:iCs w:val="false"/>
+              <w:sz w:val="15"/>
+              <w:szCs w:val="15"/>
+              <w:lang w:val="pl-PL"/>
             </w:rPr>
-            <w:t>3</w:t>
+            <w:t>USt.-ID: DE296903997</w:t>
           </w:r>
+        </w:p>
+        <w:p>
+          <w:pPr>
+            <w:pStyle w:val="Normal"/>
+            <w:widowControl w:val="false"/>
+            <w:spacing w:before="0" w:after="0"/>
+            <w:jc w:val="center"/>
+            <w:rPr>
+              <w:rFonts w:ascii="Open Sans" w:hAnsi="Open Sans" w:eastAsia="Open Sans" w:cs="Open Sans"/>
+              <w:b w:val="false"/>
+              <w:bCs w:val="false"/>
+              <w:i w:val="false"/>
+              <w:i w:val="false"/>
+              <w:iCs w:val="false"/>
+              <w:sz w:val="15"/>
+              <w:szCs w:val="15"/>
+              <w:lang w:val="en-US"/>
+            </w:rPr>
+          </w:pPr>
           <w:r>
             <w:rPr>
-              <w:sz w:val="22"/>
-              <w:kern w:val="0"/>
-              <w:szCs w:val="22"/>
-              <w:rFonts w:eastAsia="Calibri" w:cs="Calibri"/>
-              <w:lang w:val="pl-PL" w:eastAsia="pl-PL" w:bidi="ar-SA"/>
+              <w:rFonts w:eastAsia="Open Sans" w:cs="Open Sans" w:ascii="Open Sans" w:hAnsi="Open Sans"/>
+              <w:b w:val="false"/>
+              <w:bCs w:val="false"/>
+              <w:i w:val="false"/>
+              <w:iCs w:val="false"/>
+              <w:sz w:val="15"/>
+              <w:szCs w:val="15"/>
+              <w:lang w:val="pl-PL"/>
             </w:rPr>
-            <w:fldChar w:fldCharType="end"/>
+            <w:t>Inhaber: Attila Landgrafe</w:t>
           </w:r>
+        </w:p>
+        <w:p>
+          <w:pPr>
+            <w:pStyle w:val="Normal"/>
+            <w:widowControl w:val="false"/>
+            <w:spacing w:before="0" w:after="0"/>
+            <w:jc w:val="center"/>
+            <w:rPr>
+              <w:rFonts w:ascii="Open Sans" w:hAnsi="Open Sans" w:eastAsia="Open Sans" w:cs="Open Sans"/>
+              <w:b w:val="false"/>
+              <w:bCs w:val="false"/>
+              <w:i w:val="false"/>
+              <w:i w:val="false"/>
+              <w:iCs w:val="false"/>
+              <w:sz w:val="15"/>
+              <w:szCs w:val="15"/>
+              <w:lang w:val="en-US"/>
+            </w:rPr>
+          </w:pPr>
           <w:r>
             <w:rPr>
-              <w:rFonts w:eastAsia="Calibri" w:cs="Calibri"/>
-              <w:kern w:val="0"/>
-              <w:sz w:val="16"/>
-              <w:szCs w:val="16"/>
-              <w:lang w:val="pl-PL" w:eastAsia="pl-PL" w:bidi="ar-SA"/>
+              <w:rFonts w:eastAsia="Open Sans" w:cs="Open Sans" w:ascii="Open Sans" w:hAnsi="Open Sans"/>
+              <w:b w:val="false"/>
+              <w:bCs w:val="false"/>
+              <w:i w:val="false"/>
+              <w:iCs w:val="false"/>
+              <w:sz w:val="15"/>
+              <w:szCs w:val="15"/>
+              <w:lang w:val="en-US"/>
             </w:rPr>
-            <w:t>/</w:t>
-          </w:r>
-          <w:r>
-            <w:rPr>
-              <w:rFonts w:eastAsia="Calibri" w:cs="Calibri"/>
-              <w:kern w:val="0"/>
-              <w:sz w:val="22"/>
-              <w:szCs w:val="22"/>
-              <w:lang w:val="pl-PL" w:eastAsia="pl-PL" w:bidi="ar-SA"/>
-            </w:rPr>
-            <w:fldChar w:fldCharType="begin"/>
-          </w:r>
-          <w:r>
-            <w:rPr>
-              <w:sz w:val="22"/>
-              <w:kern w:val="0"/>
-              <w:szCs w:val="22"/>
-              <w:rFonts w:eastAsia="Calibri" w:cs="Calibri"/>
-              <w:lang w:val="pl-PL" w:eastAsia="pl-PL" w:bidi="ar-SA"/>
-            </w:rPr>
-            <w:instrText xml:space="preserve"> NUMPAGES </w:instrText>
-          </w:r>
-          <w:r>
-            <w:rPr>
-              <w:sz w:val="22"/>
-              <w:kern w:val="0"/>
-              <w:szCs w:val="22"/>
-              <w:rFonts w:eastAsia="Calibri" w:cs="Calibri"/>
-              <w:lang w:val="pl-PL" w:eastAsia="pl-PL" w:bidi="ar-SA"/>
-            </w:rPr>
-            <w:fldChar w:fldCharType="separate"/>
-          </w:r>
-          <w:r>
-            <w:rPr>
-              <w:sz w:val="22"/>
-              <w:kern w:val="0"/>
-              <w:szCs w:val="22"/>
-              <w:rFonts w:eastAsia="Calibri" w:cs="Calibri"/>
-              <w:lang w:val="pl-PL" w:eastAsia="pl-PL" w:bidi="ar-SA"/>
-            </w:rPr>
-            <w:t>3</w:t>
-          </w:r>
-          <w:r>
-            <w:rPr>
-              <w:sz w:val="22"/>
-              <w:kern w:val="0"/>
-              <w:szCs w:val="22"/>
-              <w:rFonts w:eastAsia="Calibri" w:cs="Calibri"/>
-              <w:lang w:val="pl-PL" w:eastAsia="pl-PL" w:bidi="ar-SA"/>
-            </w:rPr>
-            <w:fldChar w:fldCharType="end"/>
           </w:r>
         </w:p>
       </w:tc>
     </w:tr>
   </w:tbl>
-  <w:p xmlns:wp14="http://schemas.microsoft.com/office/word/2010/wordml" wp14:textId="77777777">
+  <w:p>
     <w:pPr>
       <w:pStyle w:val="normal1"/>
-      <w:spacing w:before="240" w:after="0" w:line="14" w:lineRule="auto"/>
-      <w:jc w:val="center"/>
-      <w:rPr/>
+      <w:spacing w:lineRule="auto" w:line="14" w:before="240" w:after="240"/>
+      <w:jc w:val="right"/>
+      <w:rPr>
+        <w:sz w:val="16"/>
+        <w:szCs w:val="16"/>
+      </w:rPr>
     </w:pPr>
     <w:r>
-      <w:rPr/>
+      <w:rPr>
+        <w:sz w:val="16"/>
+        <w:szCs w:val="16"/>
+      </w:rPr>
+      <w:t xml:space="preserve">Seite </w:t>
+    </w:r>
+    <w:r>
+      <w:rPr>
+        <w:rFonts w:eastAsia="Open Sans" w:cs="Open Sans" w:ascii="Open Sans" w:hAnsi="Open Sans"/>
+        <w:b w:val="false"/>
+        <w:bCs w:val="false"/>
+        <w:i w:val="false"/>
+        <w:iCs w:val="false"/>
+        <w:sz w:val="15"/>
+        <w:szCs w:val="15"/>
+      </w:rPr>
+      <w:fldChar w:fldCharType="begin"/>
+    </w:r>
+    <w:r>
+      <w:rPr>
+        <w:sz w:val="15"/>
+        <w:i w:val="false"/>
+        <w:b w:val="false"/>
+        <w:szCs w:val="15"/>
+        <w:iCs w:val="false"/>
+        <w:bCs w:val="false"/>
+        <w:rFonts w:eastAsia="Open Sans" w:cs="Open Sans" w:ascii="Open Sans" w:hAnsi="Open Sans"/>
+      </w:rPr>
+      <w:instrText xml:space="preserve"> PAGE </w:instrText>
+    </w:r>
+    <w:r>
+      <w:rPr>
+        <w:sz w:val="15"/>
+        <w:i w:val="false"/>
+        <w:b w:val="false"/>
+        <w:szCs w:val="15"/>
+        <w:iCs w:val="false"/>
+        <w:bCs w:val="false"/>
+        <w:rFonts w:eastAsia="Open Sans" w:cs="Open Sans" w:ascii="Open Sans" w:hAnsi="Open Sans"/>
+      </w:rPr>
+      <w:fldChar w:fldCharType="separate"/>
+    </w:r>
+    <w:r>
+      <w:rPr>
+        <w:sz w:val="15"/>
+        <w:i w:val="false"/>
+        <w:b w:val="false"/>
+        <w:szCs w:val="15"/>
+        <w:iCs w:val="false"/>
+        <w:bCs w:val="false"/>
+        <w:rFonts w:eastAsia="Open Sans" w:cs="Open Sans" w:ascii="Open Sans" w:hAnsi="Open Sans"/>
+      </w:rPr>
+      <w:t>3</w:t>
+    </w:r>
+    <w:r>
+      <w:rPr>
+        <w:sz w:val="15"/>
+        <w:i w:val="false"/>
+        <w:b w:val="false"/>
+        <w:szCs w:val="15"/>
+        <w:iCs w:val="false"/>
+        <w:bCs w:val="false"/>
+        <w:rFonts w:eastAsia="Open Sans" w:cs="Open Sans" w:ascii="Open Sans" w:hAnsi="Open Sans"/>
+      </w:rPr>
+      <w:fldChar w:fldCharType="end"/>
+    </w:r>
+    <w:r>
+      <w:rPr>
+        <w:rFonts w:eastAsia="Open Sans" w:cs="Open Sans" w:ascii="Open Sans" w:hAnsi="Open Sans"/>
+        <w:b w:val="false"/>
+        <w:bCs w:val="false"/>
+        <w:i w:val="false"/>
+        <w:iCs w:val="false"/>
+        <w:sz w:val="15"/>
+        <w:szCs w:val="15"/>
+      </w:rPr>
+      <w:t xml:space="preserve"> / </w:t>
+    </w:r>
+    <w:r>
+      <w:rPr>
+        <w:rFonts w:eastAsia="Open Sans" w:cs="Open Sans" w:ascii="Open Sans" w:hAnsi="Open Sans"/>
+        <w:b w:val="false"/>
+        <w:bCs w:val="false"/>
+        <w:i w:val="false"/>
+        <w:iCs w:val="false"/>
+        <w:sz w:val="15"/>
+        <w:szCs w:val="15"/>
+      </w:rPr>
+      <w:fldChar w:fldCharType="begin"/>
+    </w:r>
+    <w:r>
+      <w:rPr>
+        <w:sz w:val="15"/>
+        <w:i w:val="false"/>
+        <w:b w:val="false"/>
+        <w:szCs w:val="15"/>
+        <w:iCs w:val="false"/>
+        <w:bCs w:val="false"/>
+        <w:rFonts w:eastAsia="Open Sans" w:cs="Open Sans" w:ascii="Open Sans" w:hAnsi="Open Sans"/>
+      </w:rPr>
+      <w:instrText xml:space="preserve"> NUMPAGES </w:instrText>
+    </w:r>
+    <w:r>
+      <w:rPr>
+        <w:sz w:val="15"/>
+        <w:i w:val="false"/>
+        <w:b w:val="false"/>
+        <w:szCs w:val="15"/>
+        <w:iCs w:val="false"/>
+        <w:bCs w:val="false"/>
+        <w:rFonts w:eastAsia="Open Sans" w:cs="Open Sans" w:ascii="Open Sans" w:hAnsi="Open Sans"/>
+      </w:rPr>
+      <w:fldChar w:fldCharType="separate"/>
+    </w:r>
+    <w:r>
+      <w:rPr>
+        <w:sz w:val="15"/>
+        <w:i w:val="false"/>
+        <w:b w:val="false"/>
+        <w:szCs w:val="15"/>
+        <w:iCs w:val="false"/>
+        <w:bCs w:val="false"/>
+        <w:rFonts w:eastAsia="Open Sans" w:cs="Open Sans" w:ascii="Open Sans" w:hAnsi="Open Sans"/>
+      </w:rPr>
+      <w:t>3</w:t>
+    </w:r>
+    <w:r>
+      <w:rPr>
+        <w:sz w:val="15"/>
+        <w:i w:val="false"/>
+        <w:b w:val="false"/>
+        <w:szCs w:val="15"/>
+        <w:iCs w:val="false"/>
+        <w:bCs w:val="false"/>
+        <w:rFonts w:eastAsia="Open Sans" w:cs="Open Sans" w:ascii="Open Sans" w:hAnsi="Open Sans"/>
+      </w:rPr>
+      <w:fldChar w:fldCharType="end"/>
+    </w:r>
+    <w:r>
+      <w:rPr>
+        <w:sz w:val="16"/>
+        <w:szCs w:val="16"/>
+      </w:rPr>
+      <w:t xml:space="preserve"> </w:t>
     </w:r>
   </w:p>
 </w:ftr>
@@ -3894,7 +4168,7 @@
 
 <file path=word/header1.xml><?xml version="1.0" encoding="utf-8"?>
 <w:hdr xmlns:o="urn:schemas-microsoft-com:office:office" xmlns:r="http://schemas.openxmlformats.org/officeDocument/2006/relationships" xmlns:v="urn:schemas-microsoft-com:vml" xmlns:w="http://schemas.openxmlformats.org/wordprocessingml/2006/main" xmlns:w10="urn:schemas-microsoft-com:office:word" xmlns:wp="http://schemas.openxmlformats.org/drawingml/2006/wordprocessingDrawing" xmlns:pic="http://schemas.openxmlformats.org/drawingml/2006/picture" xmlns:wps="http://schemas.microsoft.com/office/word/2010/wordprocessingShape" xmlns:wpg="http://schemas.microsoft.com/office/word/2010/wordprocessingGroup" xmlns:mc="http://schemas.openxmlformats.org/markup-compatibility/2006" xmlns:wp14="http://schemas.microsoft.com/office/word/2010/wordprocessingDrawing" xmlns:w14="http://schemas.microsoft.com/office/word/2010/wordml" xmlns:w15="http://schemas.microsoft.com/office/word/2012/wordml" mc:Ignorable="w14 wp14 w15">
-  <w:p xmlns:wp14="http://schemas.microsoft.com/office/word/2010/wordml" wp14:textId="77777777">
+  <w:p>
     <w:pPr>
       <w:pStyle w:val="Header"/>
       <w:rPr/>
@@ -3907,8 +4181,8 @@
 </file>
 
 <file path=word/header2.xml><?xml version="1.0" encoding="utf-8"?>
-<w:hdr xmlns:o="urn:schemas-microsoft-com:office:office" xmlns:r="http://schemas.openxmlformats.org/officeDocument/2006/relationships" xmlns:v="urn:schemas-microsoft-com:vml" xmlns:w="http://schemas.openxmlformats.org/wordprocessingml/2006/main" xmlns:w10="urn:schemas-microsoft-com:office:word" xmlns:wp="http://schemas.openxmlformats.org/drawingml/2006/wordprocessingDrawing" xmlns:pic="http://schemas.openxmlformats.org/drawingml/2006/picture" xmlns:wps="http://schemas.microsoft.com/office/word/2010/wordprocessingShape" xmlns:wpg="http://schemas.microsoft.com/office/word/2010/wordprocessingGroup" xmlns:mc="http://schemas.openxmlformats.org/markup-compatibility/2006" xmlns:wp14="http://schemas.microsoft.com/office/word/2010/wordprocessingDrawing" xmlns:w14="http://schemas.microsoft.com/office/word/2010/wordml" xmlns:w15="http://schemas.microsoft.com/office/word/2012/wordml" xmlns:a="http://schemas.openxmlformats.org/drawingml/2006/main" mc:Ignorable="w14 wp14 w15">
-  <w:p xmlns:wp14="http://schemas.microsoft.com/office/word/2010/wordml" wp14:textId="77777777">
+<w:hdr xmlns:o="urn:schemas-microsoft-com:office:office" xmlns:r="http://schemas.openxmlformats.org/officeDocument/2006/relationships" xmlns:v="urn:schemas-microsoft-com:vml" xmlns:w="http://schemas.openxmlformats.org/wordprocessingml/2006/main" xmlns:w10="urn:schemas-microsoft-com:office:word" xmlns:wp="http://schemas.openxmlformats.org/drawingml/2006/wordprocessingDrawing" xmlns:pic="http://schemas.openxmlformats.org/drawingml/2006/picture" xmlns:wps="http://schemas.microsoft.com/office/word/2010/wordprocessingShape" xmlns:wpg="http://schemas.microsoft.com/office/word/2010/wordprocessingGroup" xmlns:mc="http://schemas.openxmlformats.org/markup-compatibility/2006" xmlns:wp14="http://schemas.microsoft.com/office/word/2010/wordprocessingDrawing" xmlns:w14="http://schemas.microsoft.com/office/word/2010/wordml" xmlns:w15="http://schemas.microsoft.com/office/word/2012/wordml" mc:Ignorable="w14 wp14 w15">
+  <w:p>
     <w:pPr>
       <w:pStyle w:val="normal1"/>
       <w:rPr/>
@@ -3917,7 +4191,7 @@
       <w:rPr/>
     </w:r>
   </w:p>
-  <w:p xmlns:wp14="http://schemas.microsoft.com/office/word/2010/wordml" wp14:textId="77777777">
+  <w:p>
     <w:pPr>
       <w:pStyle w:val="normal1"/>
       <w:spacing w:before="120" w:after="0"/>
@@ -3927,7 +4201,7 @@
     <w:r>
       <w:rPr/>
       <w:drawing>
-        <wp:inline xmlns:wp14="http://schemas.microsoft.com/office/word/2010/wordprocessingDrawing" distT="0" distB="0" distL="0" distR="0" wp14:anchorId="27ED5134" wp14:editId="7777777">
+        <wp:inline distT="0" distB="0" distL="0" distR="0">
           <wp:extent cx="1585595" cy="920750"/>
           <wp:effectExtent l="0" t="0" r="0" b="0"/>
           <wp:docPr id="1" name="image1.jpg" descr=""/>
@@ -3970,8 +4244,8 @@
 </file>
 
 <file path=word/header3.xml><?xml version="1.0" encoding="utf-8"?>
-<w:hdr xmlns:o="urn:schemas-microsoft-com:office:office" xmlns:r="http://schemas.openxmlformats.org/officeDocument/2006/relationships" xmlns:v="urn:schemas-microsoft-com:vml" xmlns:w="http://schemas.openxmlformats.org/wordprocessingml/2006/main" xmlns:w10="urn:schemas-microsoft-com:office:word" xmlns:wp="http://schemas.openxmlformats.org/drawingml/2006/wordprocessingDrawing" xmlns:pic="http://schemas.openxmlformats.org/drawingml/2006/picture" xmlns:wps="http://schemas.microsoft.com/office/word/2010/wordprocessingShape" xmlns:wpg="http://schemas.microsoft.com/office/word/2010/wordprocessingGroup" xmlns:mc="http://schemas.openxmlformats.org/markup-compatibility/2006" xmlns:wp14="http://schemas.microsoft.com/office/word/2010/wordprocessingDrawing" xmlns:w14="http://schemas.microsoft.com/office/word/2010/wordml" xmlns:w15="http://schemas.microsoft.com/office/word/2012/wordml" xmlns:a="http://schemas.openxmlformats.org/drawingml/2006/main" mc:Ignorable="w14 wp14 w15">
-  <w:p xmlns:wp14="http://schemas.microsoft.com/office/word/2010/wordml" wp14:textId="77777777">
+<w:hdr xmlns:o="urn:schemas-microsoft-com:office:office" xmlns:r="http://schemas.openxmlformats.org/officeDocument/2006/relationships" xmlns:v="urn:schemas-microsoft-com:vml" xmlns:w="http://schemas.openxmlformats.org/wordprocessingml/2006/main" xmlns:w10="urn:schemas-microsoft-com:office:word" xmlns:wp="http://schemas.openxmlformats.org/drawingml/2006/wordprocessingDrawing" xmlns:pic="http://schemas.openxmlformats.org/drawingml/2006/picture" xmlns:wps="http://schemas.microsoft.com/office/word/2010/wordprocessingShape" xmlns:wpg="http://schemas.microsoft.com/office/word/2010/wordprocessingGroup" xmlns:mc="http://schemas.openxmlformats.org/markup-compatibility/2006" xmlns:wp14="http://schemas.microsoft.com/office/word/2010/wordprocessingDrawing" xmlns:w14="http://schemas.microsoft.com/office/word/2010/wordml" xmlns:w15="http://schemas.microsoft.com/office/word/2012/wordml" mc:Ignorable="w14 wp14 w15">
+  <w:p>
     <w:pPr>
       <w:pStyle w:val="normal1"/>
       <w:rPr/>
@@ -3980,7 +4254,7 @@
       <w:rPr/>
     </w:r>
   </w:p>
-  <w:p xmlns:wp14="http://schemas.microsoft.com/office/word/2010/wordml" wp14:textId="77777777">
+  <w:p>
     <w:pPr>
       <w:pStyle w:val="normal1"/>
       <w:spacing w:before="120" w:after="0"/>
@@ -3990,7 +4264,7 @@
     <w:r>
       <w:rPr/>
       <w:drawing>
-        <wp:inline xmlns:wp14="http://schemas.microsoft.com/office/word/2010/wordprocessingDrawing" distT="0" distB="0" distL="0" distR="0" wp14:anchorId="14C9C518" wp14:editId="7777777">
+        <wp:inline distT="0" distB="0" distL="0" distR="0">
           <wp:extent cx="1585595" cy="920750"/>
           <wp:effectExtent l="0" t="0" r="0" b="0"/>
           <wp:docPr id="2" name="image1.jpg" descr=""/>
@@ -4033,7 +4307,7 @@
 </file>
 
 <file path=word/styles.xml><?xml version="1.0" encoding="utf-8"?>
-<w:styles xmlns:wp14="http://schemas.microsoft.com/office/word/2010/wordprocessingDrawing" xmlns:w="http://schemas.openxmlformats.org/wordprocessingml/2006/main" xmlns:w14="http://schemas.microsoft.com/office/word/2010/wordml" xmlns:mc="http://schemas.openxmlformats.org/markup-compatibility/2006" mc:Ignorable="w14 wp14">
+<w:styles xmlns:w="http://schemas.openxmlformats.org/wordprocessingml/2006/main" xmlns:w14="http://schemas.microsoft.com/office/word/2010/wordml" xmlns:mc="http://schemas.openxmlformats.org/markup-compatibility/2006" mc:Ignorable="w14">
   <w:docDefaults>
     <w:rPrDefault>
       <w:rPr>
@@ -4569,7 +4843,7 @@
     <w:link w:val="Nagwek7Znak"/>
     <w:qFormat/>
     <w:pPr>
-      <w:spacing w:before="40" w:after="0" w:line="259" w:lineRule="auto"/>
+      <w:spacing w:lineRule="auto" w:line="259" w:before="40" w:after="0"/>
       <w:outlineLvl w:val="6"/>
     </w:pPr>
     <w:rPr>
@@ -4585,7 +4859,7 @@
     <w:link w:val="Nagwek8Znak"/>
     <w:qFormat/>
     <w:pPr>
-      <w:spacing w:before="40" w:after="0" w:line="259" w:lineRule="auto"/>
+      <w:spacing w:lineRule="auto" w:line="259" w:before="40" w:after="0"/>
       <w:outlineLvl w:val="7"/>
     </w:pPr>
     <w:rPr>
@@ -4601,7 +4875,7 @@
     <w:link w:val="Nagwek9Znak"/>
     <w:qFormat/>
     <w:pPr>
-      <w:spacing w:before="40" w:after="0" w:line="259" w:lineRule="auto"/>
+      <w:spacing w:lineRule="auto" w:line="259" w:before="40" w:after="0"/>
       <w:outlineLvl w:val="8"/>
     </w:pPr>
     <w:rPr>
@@ -4680,7 +4954,7 @@
     <w:name w:val="Body Text"/>
     <w:basedOn w:val="Normal"/>
     <w:pPr>
-      <w:spacing w:before="0" w:after="140" w:line="276" w:lineRule="auto"/>
+      <w:spacing w:lineRule="auto" w:line="276" w:before="0" w:after="140"/>
     </w:pPr>
     <w:rPr/>
   </w:style>
@@ -4797,7 +5071,7 @@
     <w:unhideWhenUsed/>
     <w:qFormat/>
   </w:style>
-  <w:style w:type="table" w:styleId="Standardowy" w:default="1">
+  <w:style w:type="table" w:default="1" w:styleId="Standardowy">
     <w:name w:val="Normal Table"/>
     <w:uiPriority w:val="99"/>
     <w:semiHidden/>
@@ -4811,7 +5085,7 @@
       </w:tblCellMar>
     </w:tblPr>
   </w:style>
-  <w:style w:type="table" w:styleId="NormalTable0" w:customStyle="1">
+  <w:style w:type="table" w:customStyle="1" w:styleId="NormalTable0">
     <w:name w:val="Normal Table0"/>
     <w:tblPr>
       <w:tblCellMar>
@@ -4822,16 +5096,15 @@
       </w:tblCellMar>
     </w:tblPr>
   </w:style>
-  <w:style xmlns:w="http://schemas.openxmlformats.org/wordprocessingml/2006/main" w:type="table" w:styleId="TableGrid">
-    <w:name xmlns:w="http://schemas.openxmlformats.org/wordprocessingml/2006/main" w:val="Table Grid"/>
-    <w:basedOn xmlns:w="http://schemas.openxmlformats.org/wordprocessingml/2006/main" w:val="Standardowy"/>
-    <w:uiPriority xmlns:w="http://schemas.openxmlformats.org/wordprocessingml/2006/main" w:val="59"/>
-    <w:rsid xmlns:w="http://schemas.openxmlformats.org/wordprocessingml/2006/main" w:val="00FB4123"/>
-    <w:pPr xmlns:w="http://schemas.openxmlformats.org/wordprocessingml/2006/main">
+  <w:style w:type="table" w:styleId="TableGrid">
+    <w:name w:val="Table Grid"/>
+    <w:basedOn w:val="Standardowy"/>
+    <w:uiPriority w:val="59"/>
+    <w:rsid w:val="00fb4123"/>
+    <w:pPr>
       <w:spacing w:after="0" w:line="240" w:lineRule="auto"/>
     </w:pPr>
-    <w:tblPr xmlns:w="http://schemas.openxmlformats.org/wordprocessingml/2006/main">
-      <w:tblInd w:w="0" w:type="dxa"/>
+    <w:tblPr>
       <w:tblBorders>
         <w:top w:val="single" w:color="000000" w:themeColor="text1" w:sz="4" w:space="0"/>
         <w:left w:val="single" w:color="000000" w:themeColor="text1" w:sz="4" w:space="0"/>

</xml_diff>

<commit_message>
feat(bu-pdf): Eigenanteil-Zeile nach Zuschuss für Kassenkunden
Unter der Gesamtsumme erscheint für Kassenkunden (payer=KK) eine
zusätzliche Totals-Zeile "Gesamtsumme nach Zuschuss § 40 SGB XI –
Ihr Eigenanteil", sobald ein Zuschuss greift.

Der angezeigte Betrag ist selfPayAmount; die Bedingung nutzt
subsidyAmount_max (Zuschuss abzüglich bereits genutztem
Wohnumfeld-Betrag), damit Gesamtsumme − Zuschuss = Eigenanteil
konsistent ist. isKK/isSZ wandern dafür über baseTotals.

Angebot-10.docx: Label-Spalte der Totals-Tabelle verbreitert, damit
der Satz einzeilig passt.

Co-Authored-By: Claude <noreply@anthropic.com>
</commit_message>
<xml_diff>
--- a/src/templates/Angebot-10.docx
+++ b/src/templates/Angebot-10.docx
@@ -63,9 +63,9 @@
         <w:tblLook w:val="04a0" w:noVBand="1" w:noHBand="0" w:lastColumn="0" w:firstColumn="1" w:lastRow="0" w:firstRow="1"/>
       </w:tblPr>
       <w:tblGrid>
-        <w:gridCol w:w="4804"/>
+        <w:gridCol w:w="4803"/>
         <w:gridCol w:w="2268"/>
-        <w:gridCol w:w="2963"/>
+        <w:gridCol w:w="2964"/>
       </w:tblGrid>
       <w:tr>
         <w:trPr>
@@ -73,7 +73,7 @@
         </w:trPr>
         <w:tc>
           <w:tcPr>
-            <w:tcW w:w="4804" w:type="dxa"/>
+            <w:tcW w:w="4803" w:type="dxa"/>
             <w:tcBorders>
               <w:top w:val="single" w:sz="8" w:space="0" w:color="FFFFFF"/>
               <w:left w:val="single" w:sz="8" w:space="0" w:color="FFFFFF"/>
@@ -264,7 +264,7 @@
         </w:tc>
         <w:tc>
           <w:tcPr>
-            <w:tcW w:w="2963" w:type="dxa"/>
+            <w:tcW w:w="2964" w:type="dxa"/>
             <w:tcBorders>
               <w:top w:val="single" w:sz="8" w:space="0" w:color="FFFFFF"/>
               <w:left w:val="single" w:sz="8" w:space="0" w:color="FFFFFF"/>
@@ -457,7 +457,7 @@
         </w:trPr>
         <w:tc>
           <w:tcPr>
-            <w:tcW w:w="4804" w:type="dxa"/>
+            <w:tcW w:w="4803" w:type="dxa"/>
             <w:tcBorders>
               <w:top w:val="single" w:sz="8" w:space="0" w:color="FFFFFF"/>
               <w:left w:val="single" w:sz="8" w:space="0" w:color="FFFFFF"/>
@@ -492,7 +492,7 @@
         </w:tc>
         <w:tc>
           <w:tcPr>
-            <w:tcW w:w="5231" w:type="dxa"/>
+            <w:tcW w:w="5232" w:type="dxa"/>
             <w:gridSpan w:val="2"/>
             <w:tcBorders>
               <w:top w:val="single" w:sz="8" w:space="0" w:color="FFFFFF"/>
@@ -706,9 +706,9 @@
       <w:tblGrid>
         <w:gridCol w:w="510"/>
         <w:gridCol w:w="885"/>
-        <w:gridCol w:w="5860"/>
+        <w:gridCol w:w="5859"/>
         <w:gridCol w:w="1440"/>
-        <w:gridCol w:w="1250"/>
+        <w:gridCol w:w="1251"/>
       </w:tblGrid>
       <w:tr>
         <w:trPr>
@@ -782,7 +782,7 @@
         </w:tc>
         <w:tc>
           <w:tcPr>
-            <w:tcW w:w="5860" w:type="dxa"/>
+            <w:tcW w:w="5859" w:type="dxa"/>
             <w:tcBorders/>
             <w:shd w:color="auto" w:fill="CCCCCC" w:val="clear"/>
           </w:tcPr>
@@ -841,7 +841,7 @@
         </w:tc>
         <w:tc>
           <w:tcPr>
-            <w:tcW w:w="1250" w:type="dxa"/>
+            <w:tcW w:w="1251" w:type="dxa"/>
             <w:tcBorders/>
             <w:shd w:color="auto" w:fill="CCCCCC" w:val="clear"/>
           </w:tcPr>
@@ -936,7 +936,7 @@
         </w:tc>
         <w:tc>
           <w:tcPr>
-            <w:tcW w:w="5860" w:type="dxa"/>
+            <w:tcW w:w="5859" w:type="dxa"/>
             <w:tcBorders/>
             <w:shd w:color="auto" w:fill="FFFFFF" w:val="clear"/>
           </w:tcPr>
@@ -1000,7 +1000,7 @@
         </w:tc>
         <w:tc>
           <w:tcPr>
-            <w:tcW w:w="1250" w:type="dxa"/>
+            <w:tcW w:w="1251" w:type="dxa"/>
             <w:tcBorders/>
             <w:shd w:color="auto" w:fill="FFFFFF" w:val="clear"/>
           </w:tcPr>
@@ -1118,7 +1118,7 @@
         </w:tc>
         <w:tc>
           <w:tcPr>
-            <w:tcW w:w="5860" w:type="dxa"/>
+            <w:tcW w:w="5859" w:type="dxa"/>
             <w:tcBorders/>
             <w:shd w:color="auto" w:fill="FFFFFF" w:val="clear"/>
             <w:tcMar>
@@ -1406,7 +1406,7 @@
         </w:tc>
         <w:tc>
           <w:tcPr>
-            <w:tcW w:w="1250" w:type="dxa"/>
+            <w:tcW w:w="1251" w:type="dxa"/>
             <w:tcBorders/>
             <w:shd w:color="auto" w:fill="FFFFFF" w:val="clear"/>
             <w:tcMar>
@@ -1480,9 +1480,9 @@
       <w:tblGrid>
         <w:gridCol w:w="510"/>
         <w:gridCol w:w="885"/>
-        <w:gridCol w:w="5860"/>
+        <w:gridCol w:w="5859"/>
         <w:gridCol w:w="1440"/>
-        <w:gridCol w:w="1250"/>
+        <w:gridCol w:w="1251"/>
       </w:tblGrid>
       <w:tr>
         <w:trPr>
@@ -1551,7 +1551,7 @@
         </w:tc>
         <w:tc>
           <w:tcPr>
-            <w:tcW w:w="5860" w:type="dxa"/>
+            <w:tcW w:w="5859" w:type="dxa"/>
             <w:tcBorders/>
             <w:shd w:color="auto" w:fill="FFFFFF" w:val="clear"/>
           </w:tcPr>
@@ -1622,7 +1622,7 @@
         </w:tc>
         <w:tc>
           <w:tcPr>
-            <w:tcW w:w="1250" w:type="dxa"/>
+            <w:tcW w:w="1251" w:type="dxa"/>
             <w:tcBorders/>
             <w:shd w:color="auto" w:fill="FFFFFF" w:val="clear"/>
             <w:tcMar>
@@ -1711,7 +1711,7 @@
         </w:tc>
         <w:tc>
           <w:tcPr>
-            <w:tcW w:w="5860" w:type="dxa"/>
+            <w:tcW w:w="5859" w:type="dxa"/>
             <w:tcBorders/>
             <w:shd w:color="auto" w:fill="FFFFFF" w:val="clear"/>
           </w:tcPr>
@@ -1902,7 +1902,7 @@
         </w:tc>
         <w:tc>
           <w:tcPr>
-            <w:tcW w:w="1250" w:type="dxa"/>
+            <w:tcW w:w="1251" w:type="dxa"/>
             <w:tcBorders/>
             <w:shd w:color="auto" w:fill="FFFFFF" w:val="clear"/>
             <w:vAlign w:val="center"/>
@@ -1999,7 +1999,7 @@
         </w:tc>
         <w:tc>
           <w:tcPr>
-            <w:tcW w:w="5860" w:type="dxa"/>
+            <w:tcW w:w="5859" w:type="dxa"/>
             <w:tcBorders/>
             <w:shd w:color="auto" w:fill="FFFFFF" w:val="clear"/>
           </w:tcPr>
@@ -2090,7 +2090,7 @@
         </w:tc>
         <w:tc>
           <w:tcPr>
-            <w:tcW w:w="1250" w:type="dxa"/>
+            <w:tcW w:w="1251" w:type="dxa"/>
             <w:tcBorders/>
             <w:shd w:color="auto" w:fill="FFFFFF" w:val="clear"/>
           </w:tcPr>
@@ -2159,9 +2159,8 @@
         <w:tblLook w:val="04a0" w:noVBand="1" w:noHBand="0" w:lastColumn="0" w:firstColumn="1" w:lastRow="0" w:firstRow="1"/>
       </w:tblPr>
       <w:tblGrid>
-        <w:gridCol w:w="2843"/>
-        <w:gridCol w:w="3249"/>
-        <w:gridCol w:w="3853"/>
+        <w:gridCol w:w="7183"/>
+        <w:gridCol w:w="2762"/>
       </w:tblGrid>
       <w:tr>
         <w:trPr>
@@ -2169,7 +2168,7 @@
         </w:trPr>
         <w:tc>
           <w:tcPr>
-            <w:tcW w:w="2843" w:type="dxa"/>
+            <w:tcW w:w="7183" w:type="dxa"/>
             <w:tcBorders/>
             <w:shd w:color="auto" w:fill="CCCCCC" w:val="clear"/>
           </w:tcPr>
@@ -2218,30 +2217,7 @@
         </w:tc>
         <w:tc>
           <w:tcPr>
-            <w:tcW w:w="3249" w:type="dxa"/>
-            <w:tcBorders/>
-            <w:shd w:color="auto" w:fill="CCCCCC" w:val="clear"/>
-          </w:tcPr>
-          <w:p>
-            <w:pPr>
-              <w:pStyle w:val="Normal"/>
-              <w:suppressAutoHyphens w:val="true"/>
-              <w:spacing w:before="24" w:after="24"/>
-              <w:jc w:val="center"/>
-              <w:rPr>
-                <w:color w:val="000000"/>
-              </w:rPr>
-            </w:pPr>
-            <w:r>
-              <w:rPr>
-                <w:color w:val="000000"/>
-              </w:rPr>
-            </w:r>
-          </w:p>
-        </w:tc>
-        <w:tc>
-          <w:tcPr>
-            <w:tcW w:w="3853" w:type="dxa"/>
+            <w:tcW w:w="2762" w:type="dxa"/>
             <w:tcBorders/>
             <w:shd w:color="auto" w:fill="CCCCCC" w:val="clear"/>
           </w:tcPr>
@@ -2302,7 +2278,7 @@
         </w:trPr>
         <w:tc>
           <w:tcPr>
-            <w:tcW w:w="2843" w:type="dxa"/>
+            <w:tcW w:w="7183" w:type="dxa"/>
             <w:tcBorders/>
             <w:shd w:color="auto" w:fill="FFFFFF" w:val="clear"/>
           </w:tcPr>
@@ -2350,32 +2326,7 @@
         </w:tc>
         <w:tc>
           <w:tcPr>
-            <w:tcW w:w="3249" w:type="dxa"/>
-            <w:tcBorders/>
-            <w:shd w:color="auto" w:fill="FFFFFF" w:val="clear"/>
-          </w:tcPr>
-          <w:p>
-            <w:pPr>
-              <w:pStyle w:val="Normal"/>
-              <w:suppressAutoHyphens w:val="true"/>
-              <w:spacing w:before="24" w:after="24"/>
-              <w:jc w:val="center"/>
-              <w:rPr>
-                <w:rFonts w:ascii="Open Sans" w:hAnsi="Open Sans" w:eastAsia="Open Sans" w:cs="Open Sans"/>
-                <w:color w:val="000000"/>
-              </w:rPr>
-            </w:pPr>
-            <w:r>
-              <w:rPr>
-                <w:rFonts w:eastAsia="Open Sans" w:cs="Open Sans" w:ascii="Open Sans" w:hAnsi="Open Sans"/>
-                <w:color w:val="000000"/>
-              </w:rPr>
-            </w:r>
-          </w:p>
-        </w:tc>
-        <w:tc>
-          <w:tcPr>
-            <w:tcW w:w="3853" w:type="dxa"/>
+            <w:tcW w:w="2762" w:type="dxa"/>
             <w:tcBorders/>
             <w:shd w:color="auto" w:fill="FFFFFF" w:val="clear"/>
           </w:tcPr>
@@ -3487,7 +3438,7 @@
         <w:bCs w:val="false"/>
         <w:rFonts w:eastAsia="Open Sans" w:cs="Open Sans" w:ascii="Open Sans" w:hAnsi="Open Sans"/>
       </w:rPr>
-      <w:t>1</w:t>
+      <w:t>3</w:t>
     </w:r>
     <w:r>
       <w:rPr>
@@ -4067,7 +4018,7 @@
         <w:bCs w:val="false"/>
         <w:rFonts w:eastAsia="Open Sans" w:cs="Open Sans" w:ascii="Open Sans" w:hAnsi="Open Sans"/>
       </w:rPr>
-      <w:t>1</w:t>
+      <w:t>3</w:t>
     </w:r>
     <w:r>
       <w:rPr>

</xml_diff>